<commit_message>
finished resample function,   todo :  implement cos theta for compute similarty
</commit_message>
<xml_diff>
--- a/Project_2/project_2/project2ParticleFilter_report.docx
+++ b/Project_2/project_2/project2ParticleFilter_report.docx
@@ -137,9 +137,9 @@
           <w:sz w:val="48"/>
           <w:szCs w:val="48"/>
         </w:rPr>
-        <w:t xml:space="preserve"> for </w:t>
-      </w:r>
-      <w:proofErr w:type="spellStart"/>
+        <w:t xml:space="preserve"> </w:t>
+      </w:r>
+      <w:proofErr w:type="gramStart"/>
       <w:r>
         <w:rPr>
           <w:b/>
@@ -148,8 +148,9 @@
           <w:sz w:val="48"/>
           <w:szCs w:val="48"/>
         </w:rPr>
-        <w:t>obj</w:t>
-      </w:r>
+        <w:t>For</w:t>
+      </w:r>
+      <w:proofErr w:type="gramEnd"/>
       <w:r>
         <w:rPr>
           <w:b/>
@@ -158,8 +159,39 @@
           <w:sz w:val="48"/>
           <w:szCs w:val="48"/>
         </w:rPr>
+        <w:t xml:space="preserve"> </w:t>
+      </w:r>
+      <w:proofErr w:type="spellStart"/>
+      <w:r>
+        <w:rPr>
+          <w:b/>
+          <w:bCs/>
+          <w:color w:val="000000"/>
+          <w:sz w:val="48"/>
+          <w:szCs w:val="48"/>
+        </w:rPr>
+        <w:t>Obj</w:t>
+      </w:r>
+      <w:r>
+        <w:rPr>
+          <w:b/>
+          <w:bCs/>
+          <w:color w:val="000000"/>
+          <w:sz w:val="48"/>
+          <w:szCs w:val="48"/>
+        </w:rPr>
         <w:softHyphen/>
-        <w:t>tracking</w:t>
+        <w:t>T</w:t>
+      </w:r>
+      <w:r>
+        <w:rPr>
+          <w:b/>
+          <w:bCs/>
+          <w:color w:val="000000"/>
+          <w:sz w:val="48"/>
+          <w:szCs w:val="48"/>
+        </w:rPr>
+        <w:t>racking</w:t>
       </w:r>
       <w:proofErr w:type="spellEnd"/>
     </w:p>
@@ -1189,13 +1221,7 @@
         </m:oMath>
       </m:oMathPara>
     </w:p>
-    <w:p>
-      <w:pPr>
-        <w:rPr>
-          <w:rFonts w:hint="eastAsia"/>
-        </w:rPr>
-      </w:pPr>
-    </w:p>
+    <w:p/>
     <w:p>
       <w:r>
         <w:rPr>
@@ -1379,11 +1405,8 @@
         <w:t>.</w:t>
       </w:r>
     </w:p>
-    <w:p>
-      <w:pPr>
-        <w:jc w:val="center"/>
-      </w:pPr>
-    </w:p>
+    <w:p/>
+    <w:p/>
     <w:p>
       <w:pPr>
         <w:jc w:val="center"/>
@@ -2300,13 +2323,7 @@
     </w:p>
     <w:p/>
     <w:p/>
-    <w:p>
-      <w:pPr>
-        <w:rPr>
-          <w:rFonts w:hint="eastAsia"/>
-        </w:rPr>
-      </w:pPr>
-    </w:p>
+    <w:p/>
     <w:p>
       <w:pPr>
         <w:pStyle w:val="2"/>
@@ -2630,18 +2647,6 @@
     <w:p>
       <w:pPr>
         <w:rPr>
-          <w:rFonts w:ascii="Consolas" w:hAnsi="Consolas" w:cs="Consolas" w:hint="eastAsia"/>
-          <w:color w:val="0066CC"/>
-          <w:kern w:val="0"/>
-          <w:sz w:val="20"/>
-          <w:szCs w:val="20"/>
-          <w:u w:val="single"/>
-        </w:rPr>
-      </w:pPr>
-    </w:p>
-    <w:p>
-      <w:pPr>
-        <w:rPr>
           <w:rFonts w:ascii="Arial" w:hAnsi="Arial" w:cs="Arial"/>
           <w:color w:val="4D4D4D"/>
           <w:shd w:val="clear" w:color="auto" w:fill="FFFFFF"/>
@@ -2649,170 +2654,63 @@
       </w:pPr>
       <w:r>
         <w:rPr>
-          <w:rFonts w:ascii="Consolas" w:hAnsi="Consolas" w:cs="Consolas" w:hint="eastAsia"/>
-          <w:color w:val="0066CC"/>
-          <w:kern w:val="0"/>
-          <w:sz w:val="20"/>
-          <w:szCs w:val="20"/>
-          <w:u w:val="single"/>
-        </w:rPr>
-        <w:t>解决方法</w:t>
-      </w:r>
-      <w:r>
-        <w:rPr>
-          <w:rFonts w:ascii="Consolas" w:hAnsi="Consolas" w:cs="Consolas" w:hint="eastAsia"/>
-          <w:color w:val="0066CC"/>
-          <w:kern w:val="0"/>
-          <w:sz w:val="20"/>
-          <w:szCs w:val="20"/>
-          <w:u w:val="single"/>
-        </w:rPr>
-        <w:t>:</w:t>
-      </w:r>
-      <w:r>
-        <w:rPr>
           <w:rFonts w:ascii="Arial" w:hAnsi="Arial" w:cs="Arial"/>
           <w:color w:val="4D4D4D"/>
           <w:shd w:val="clear" w:color="auto" w:fill="FFFFFF"/>
         </w:rPr>
+        <w:t>在</w:t>
+      </w:r>
+      <w:proofErr w:type="spellStart"/>
+      <w:r>
+        <w:rPr>
+          <w:rFonts w:ascii="Arial" w:hAnsi="Arial" w:cs="Arial"/>
+          <w:color w:val="4D4D4D"/>
+          <w:shd w:val="clear" w:color="auto" w:fill="FFFFFF"/>
+        </w:rPr>
+        <w:t>opencv</w:t>
+      </w:r>
+      <w:proofErr w:type="spellEnd"/>
+      <w:r>
+        <w:rPr>
+          <w:rFonts w:ascii="Arial" w:hAnsi="Arial" w:cs="Arial"/>
+          <w:color w:val="4D4D4D"/>
+          <w:shd w:val="clear" w:color="auto" w:fill="FFFFFF"/>
+        </w:rPr>
+        <w:t>中</w:t>
+      </w:r>
+      <w:r>
+        <w:rPr>
+          <w:rFonts w:ascii="Arial" w:hAnsi="Arial" w:cs="Arial"/>
+          <w:color w:val="4D4D4D"/>
+          <w:shd w:val="clear" w:color="auto" w:fill="FFFFFF"/>
+        </w:rPr>
         <w:t xml:space="preserve"> </w:t>
       </w:r>
       <w:r>
         <w:rPr>
           <w:rFonts w:ascii="Arial" w:hAnsi="Arial" w:cs="Arial"/>
-          <w:color w:val="333333"/>
-          <w:sz w:val="20"/>
-          <w:szCs w:val="20"/>
-          <w:shd w:val="clear" w:color="auto" w:fill="FFFFFF"/>
-        </w:rPr>
-        <w:t>使用重载方法</w:t>
-      </w:r>
+          <w:color w:val="4D4D4D"/>
+          <w:shd w:val="clear" w:color="auto" w:fill="FFFFFF"/>
+        </w:rPr>
+        <w:t>可以通过函数</w:t>
+      </w:r>
+      <w:proofErr w:type="spellStart"/>
       <w:r>
         <w:rPr>
           <w:rFonts w:ascii="Arial" w:hAnsi="Arial" w:cs="Arial"/>
-          <w:color w:val="333333"/>
-          <w:sz w:val="20"/>
-          <w:szCs w:val="20"/>
-          <w:shd w:val="clear" w:color="auto" w:fill="FFFFFF"/>
-        </w:rPr>
-        <w:t>__</w:t>
-      </w:r>
-      <w:proofErr w:type="spellStart"/>
+          <w:color w:val="4D4D4D"/>
+          <w:shd w:val="clear" w:color="auto" w:fill="FFFFFF"/>
+        </w:rPr>
+        <w:t>matchTemplate</w:t>
+      </w:r>
+      <w:proofErr w:type="spellEnd"/>
       <w:r>
         <w:rPr>
           <w:rFonts w:ascii="Arial" w:hAnsi="Arial" w:cs="Arial"/>
-          <w:color w:val="333333"/>
-          <w:sz w:val="20"/>
-          <w:szCs w:val="20"/>
-          <w:shd w:val="clear" w:color="auto" w:fill="FFFFFF"/>
-        </w:rPr>
-        <w:t>lt</w:t>
-      </w:r>
-      <w:proofErr w:type="spellEnd"/>
-      <w:r>
-        <w:rPr>
-          <w:rFonts w:ascii="Arial" w:hAnsi="Arial" w:cs="Arial"/>
-          <w:color w:val="333333"/>
-          <w:sz w:val="20"/>
-          <w:szCs w:val="20"/>
-          <w:shd w:val="clear" w:color="auto" w:fill="FFFFFF"/>
-        </w:rPr>
-        <w:t>__</w:t>
-      </w:r>
-      <w:r>
-        <w:rPr>
-          <w:rFonts w:ascii="Arial" w:hAnsi="Arial" w:cs="Arial"/>
-          <w:color w:val="333333"/>
-          <w:sz w:val="20"/>
-          <w:szCs w:val="20"/>
-          <w:shd w:val="clear" w:color="auto" w:fill="FFFFFF"/>
-        </w:rPr>
-        <w:t>，</w:t>
-      </w:r>
-      <w:r>
-        <w:rPr>
-          <w:rFonts w:ascii="Arial" w:hAnsi="Arial" w:cs="Arial"/>
-          <w:color w:val="333333"/>
-          <w:sz w:val="20"/>
-          <w:szCs w:val="20"/>
-          <w:shd w:val="clear" w:color="auto" w:fill="FFFFFF"/>
-        </w:rPr>
-        <w:t>__</w:t>
-      </w:r>
-      <w:proofErr w:type="spellStart"/>
-      <w:r>
-        <w:rPr>
-          <w:rFonts w:ascii="Arial" w:hAnsi="Arial" w:cs="Arial"/>
-          <w:color w:val="333333"/>
-          <w:sz w:val="20"/>
-          <w:szCs w:val="20"/>
-          <w:shd w:val="clear" w:color="auto" w:fill="FFFFFF"/>
-        </w:rPr>
-        <w:t>lt</w:t>
-      </w:r>
-      <w:proofErr w:type="spellEnd"/>
-      <w:r>
-        <w:rPr>
-          <w:rFonts w:ascii="Arial" w:hAnsi="Arial" w:cs="Arial"/>
-          <w:color w:val="333333"/>
-          <w:sz w:val="20"/>
-          <w:szCs w:val="20"/>
-          <w:shd w:val="clear" w:color="auto" w:fill="FFFFFF"/>
-        </w:rPr>
-        <w:t>__</w:t>
-      </w:r>
-      <w:r>
-        <w:rPr>
-          <w:rFonts w:ascii="Arial" w:hAnsi="Arial" w:cs="Arial"/>
-          <w:color w:val="333333"/>
-          <w:sz w:val="20"/>
-          <w:szCs w:val="20"/>
-          <w:shd w:val="clear" w:color="auto" w:fill="FFFFFF"/>
-        </w:rPr>
-        <w:t>是</w:t>
-      </w:r>
-      <w:r>
-        <w:rPr>
-          <w:rFonts w:ascii="Arial" w:hAnsi="Arial" w:cs="Arial"/>
-          <w:color w:val="333333"/>
-          <w:sz w:val="20"/>
-          <w:szCs w:val="20"/>
-          <w:shd w:val="clear" w:color="auto" w:fill="FFFFFF"/>
-        </w:rPr>
-        <w:t>python</w:t>
-      </w:r>
-      <w:r>
-        <w:rPr>
-          <w:rFonts w:ascii="Arial" w:hAnsi="Arial" w:cs="Arial"/>
-          <w:color w:val="333333"/>
-          <w:sz w:val="20"/>
-          <w:szCs w:val="20"/>
-          <w:shd w:val="clear" w:color="auto" w:fill="FFFFFF"/>
-        </w:rPr>
-        <w:t>中用于进行特定比较的方法。</w:t>
-      </w:r>
-    </w:p>
-    <w:p>
-      <w:pPr>
-        <w:rPr>
-          <w:rFonts w:ascii="Consolas" w:hAnsi="Consolas" w:cs="Consolas"/>
-          <w:color w:val="0066CC"/>
-          <w:kern w:val="0"/>
-          <w:sz w:val="20"/>
-          <w:szCs w:val="20"/>
-          <w:u w:val="single"/>
-        </w:rPr>
-      </w:pPr>
-      <w:r>
-        <w:rPr>
-          <w:rFonts w:ascii="Consolas" w:hAnsi="Consolas" w:cs="Consolas" w:hint="eastAsia"/>
-          <w:color w:val="0066CC"/>
-          <w:kern w:val="0"/>
-          <w:sz w:val="20"/>
-          <w:szCs w:val="20"/>
-          <w:u w:val="single"/>
-        </w:rPr>
-        <w:t>例如</w:t>
+          <w:color w:val="4D4D4D"/>
+          <w:shd w:val="clear" w:color="auto" w:fill="FFFFFF"/>
+        </w:rPr>
+        <w:t>实现模板匹配，同时有六种相关的匹配算法</w:t>
       </w:r>
     </w:p>
     <w:p>
@@ -2839,575 +2737,20 @@
         </w:tabs>
         <w:jc w:val="left"/>
         <w:rPr>
-          <w:rFonts w:ascii="Courier New" w:hAnsi="Courier New" w:cs="Courier New"/>
-          <w:color w:val="A9B7C6"/>
-          <w:kern w:val="0"/>
-          <w:sz w:val="20"/>
-          <w:szCs w:val="20"/>
-        </w:rPr>
-      </w:pPr>
-      <w:proofErr w:type="spellStart"/>
-      <w:r>
-        <w:rPr>
-          <w:rFonts w:ascii="Courier New" w:hAnsi="Courier New" w:cs="Courier New"/>
-          <w:color w:val="CC7832"/>
-          <w:kern w:val="0"/>
-          <w:sz w:val="20"/>
-          <w:szCs w:val="20"/>
-        </w:rPr>
-        <w:lastRenderedPageBreak/>
-        <w:t>def</w:t>
-      </w:r>
-      <w:proofErr w:type="spellEnd"/>
-      <w:r>
-        <w:rPr>
-          <w:rFonts w:ascii="Courier New" w:hAnsi="Courier New" w:cs="Courier New"/>
-          <w:color w:val="CC7832"/>
-          <w:kern w:val="0"/>
-          <w:sz w:val="20"/>
-          <w:szCs w:val="20"/>
-        </w:rPr>
-        <w:t xml:space="preserve"> </w:t>
-      </w:r>
-      <w:r>
-        <w:rPr>
-          <w:rFonts w:ascii="Courier New" w:hAnsi="Courier New" w:cs="Courier New"/>
-          <w:color w:val="B200B2"/>
-          <w:kern w:val="0"/>
-          <w:sz w:val="20"/>
-          <w:szCs w:val="20"/>
-        </w:rPr>
-        <w:t>__</w:t>
-      </w:r>
-      <w:proofErr w:type="spellStart"/>
-      <w:r>
-        <w:rPr>
-          <w:rFonts w:ascii="Courier New" w:hAnsi="Courier New" w:cs="Courier New"/>
-          <w:color w:val="B200B2"/>
-          <w:kern w:val="0"/>
-          <w:sz w:val="20"/>
-          <w:szCs w:val="20"/>
-        </w:rPr>
-        <w:t>lt</w:t>
-      </w:r>
-      <w:proofErr w:type="spellEnd"/>
-      <w:r>
-        <w:rPr>
-          <w:rFonts w:ascii="Courier New" w:hAnsi="Courier New" w:cs="Courier New"/>
-          <w:color w:val="B200B2"/>
-          <w:kern w:val="0"/>
-          <w:sz w:val="20"/>
-          <w:szCs w:val="20"/>
-        </w:rPr>
-        <w:t>__</w:t>
-      </w:r>
-      <w:r>
-        <w:rPr>
-          <w:rFonts w:ascii="Courier New" w:hAnsi="Courier New" w:cs="Courier New"/>
-          <w:color w:val="A9B7C6"/>
-          <w:kern w:val="0"/>
-          <w:sz w:val="20"/>
-          <w:szCs w:val="20"/>
-        </w:rPr>
-        <w:t>(</w:t>
-      </w:r>
-      <w:r>
-        <w:rPr>
-          <w:rFonts w:ascii="Courier New" w:hAnsi="Courier New" w:cs="Courier New"/>
-          <w:color w:val="94558D"/>
-          <w:kern w:val="0"/>
-          <w:sz w:val="20"/>
-          <w:szCs w:val="20"/>
-        </w:rPr>
-        <w:t>self</w:t>
-      </w:r>
-      <w:r>
-        <w:rPr>
-          <w:rFonts w:ascii="Courier New" w:hAnsi="Courier New" w:cs="Courier New"/>
-          <w:color w:val="CC7832"/>
-          <w:kern w:val="0"/>
-          <w:sz w:val="20"/>
-          <w:szCs w:val="20"/>
-        </w:rPr>
-        <w:t xml:space="preserve">, </w:t>
-      </w:r>
-      <w:r>
-        <w:rPr>
-          <w:rFonts w:ascii="Courier New" w:hAnsi="Courier New" w:cs="Courier New"/>
-          <w:color w:val="A9B7C6"/>
-          <w:kern w:val="0"/>
-          <w:sz w:val="20"/>
-          <w:szCs w:val="20"/>
-        </w:rPr>
-        <w:t>other):</w:t>
-      </w:r>
-      <w:r>
-        <w:rPr>
-          <w:rFonts w:ascii="Courier New" w:hAnsi="Courier New" w:cs="Courier New"/>
-          <w:color w:val="A9B7C6"/>
-          <w:kern w:val="0"/>
-          <w:sz w:val="20"/>
-          <w:szCs w:val="20"/>
-        </w:rPr>
-        <w:br/>
-        <w:t xml:space="preserve">    </w:t>
-      </w:r>
-      <w:r>
-        <w:rPr>
-          <w:rFonts w:ascii="Courier New" w:hAnsi="Courier New" w:cs="Courier New"/>
-          <w:color w:val="CC7832"/>
-          <w:kern w:val="0"/>
-          <w:sz w:val="20"/>
-          <w:szCs w:val="20"/>
-        </w:rPr>
-        <w:t xml:space="preserve">if </w:t>
-      </w:r>
-      <w:proofErr w:type="spellStart"/>
-      <w:r>
-        <w:rPr>
-          <w:rFonts w:ascii="Courier New" w:hAnsi="Courier New" w:cs="Courier New"/>
-          <w:color w:val="94558D"/>
-          <w:kern w:val="0"/>
-          <w:sz w:val="20"/>
-          <w:szCs w:val="20"/>
-        </w:rPr>
-        <w:t>self</w:t>
-      </w:r>
-      <w:r>
-        <w:rPr>
-          <w:rFonts w:ascii="Courier New" w:hAnsi="Courier New" w:cs="Courier New"/>
-          <w:color w:val="A9B7C6"/>
-          <w:kern w:val="0"/>
-          <w:sz w:val="20"/>
-          <w:szCs w:val="20"/>
-        </w:rPr>
-        <w:t>.a</w:t>
-      </w:r>
-      <w:proofErr w:type="spellEnd"/>
-      <w:r>
-        <w:rPr>
-          <w:rFonts w:ascii="Courier New" w:hAnsi="Courier New" w:cs="Courier New"/>
-          <w:color w:val="A9B7C6"/>
-          <w:kern w:val="0"/>
-          <w:sz w:val="20"/>
-          <w:szCs w:val="20"/>
-        </w:rPr>
-        <w:t xml:space="preserve"> == </w:t>
-      </w:r>
-      <w:proofErr w:type="spellStart"/>
-      <w:r>
-        <w:rPr>
-          <w:rFonts w:ascii="Courier New" w:hAnsi="Courier New" w:cs="Courier New"/>
-          <w:color w:val="A9B7C6"/>
-          <w:kern w:val="0"/>
-          <w:sz w:val="20"/>
-          <w:szCs w:val="20"/>
-        </w:rPr>
-        <w:t>other.a</w:t>
-      </w:r>
-      <w:proofErr w:type="spellEnd"/>
-      <w:r>
-        <w:rPr>
-          <w:rFonts w:ascii="Courier New" w:hAnsi="Courier New" w:cs="Courier New"/>
-          <w:color w:val="A9B7C6"/>
-          <w:kern w:val="0"/>
-          <w:sz w:val="20"/>
-          <w:szCs w:val="20"/>
-        </w:rPr>
-        <w:t>:</w:t>
-      </w:r>
-      <w:r>
-        <w:rPr>
-          <w:rFonts w:ascii="Courier New" w:hAnsi="Courier New" w:cs="Courier New"/>
-          <w:color w:val="A9B7C6"/>
-          <w:kern w:val="0"/>
-          <w:sz w:val="20"/>
-          <w:szCs w:val="20"/>
-        </w:rPr>
-        <w:br/>
-        <w:t xml:space="preserve">        </w:t>
-      </w:r>
-      <w:r>
-        <w:rPr>
-          <w:rFonts w:ascii="Courier New" w:hAnsi="Courier New" w:cs="Courier New"/>
-          <w:color w:val="CC7832"/>
-          <w:kern w:val="0"/>
-          <w:sz w:val="20"/>
-          <w:szCs w:val="20"/>
-        </w:rPr>
-        <w:t xml:space="preserve">return </w:t>
-      </w:r>
-      <w:proofErr w:type="spellStart"/>
-      <w:r>
-        <w:rPr>
-          <w:rFonts w:ascii="Courier New" w:hAnsi="Courier New" w:cs="Courier New"/>
-          <w:color w:val="94558D"/>
-          <w:kern w:val="0"/>
-          <w:sz w:val="20"/>
-          <w:szCs w:val="20"/>
-        </w:rPr>
-        <w:t>self</w:t>
-      </w:r>
-      <w:r>
-        <w:rPr>
-          <w:rFonts w:ascii="Courier New" w:hAnsi="Courier New" w:cs="Courier New"/>
-          <w:color w:val="A9B7C6"/>
-          <w:kern w:val="0"/>
-          <w:sz w:val="20"/>
-          <w:szCs w:val="20"/>
-        </w:rPr>
-        <w:t>.b</w:t>
-      </w:r>
-      <w:proofErr w:type="spellEnd"/>
-      <w:r>
-        <w:rPr>
-          <w:rFonts w:ascii="Courier New" w:hAnsi="Courier New" w:cs="Courier New"/>
-          <w:color w:val="A9B7C6"/>
-          <w:kern w:val="0"/>
-          <w:sz w:val="20"/>
-          <w:szCs w:val="20"/>
-        </w:rPr>
-        <w:t xml:space="preserve"> &lt; </w:t>
-      </w:r>
-      <w:proofErr w:type="spellStart"/>
-      <w:r>
-        <w:rPr>
-          <w:rFonts w:ascii="Courier New" w:hAnsi="Courier New" w:cs="Courier New"/>
-          <w:color w:val="A9B7C6"/>
-          <w:kern w:val="0"/>
-          <w:sz w:val="20"/>
-          <w:szCs w:val="20"/>
-        </w:rPr>
-        <w:t>other.b</w:t>
-      </w:r>
-      <w:proofErr w:type="spellEnd"/>
-      <w:r>
-        <w:rPr>
-          <w:rFonts w:ascii="Courier New" w:hAnsi="Courier New" w:cs="Courier New"/>
-          <w:color w:val="A9B7C6"/>
-          <w:kern w:val="0"/>
-          <w:sz w:val="20"/>
-          <w:szCs w:val="20"/>
-        </w:rPr>
-        <w:t xml:space="preserve"> </w:t>
-      </w:r>
-      <w:r>
-        <w:rPr>
-          <w:rFonts w:ascii="Courier New" w:hAnsi="Courier New" w:cs="Courier New"/>
-          <w:color w:val="808080"/>
-          <w:kern w:val="0"/>
-          <w:sz w:val="20"/>
-          <w:szCs w:val="20"/>
-        </w:rPr>
-        <w:t>#1</w:t>
-      </w:r>
-      <w:r>
-        <w:rPr>
-          <w:rFonts w:ascii="宋体" w:hAnsi="宋体" w:cs="Courier New" w:hint="eastAsia"/>
-          <w:color w:val="808080"/>
-          <w:kern w:val="0"/>
-          <w:sz w:val="20"/>
-          <w:szCs w:val="20"/>
-        </w:rPr>
-        <w:t>小</w:t>
-      </w:r>
-      <w:r>
-        <w:rPr>
-          <w:rFonts w:ascii="宋体" w:hAnsi="宋体" w:cs="Courier New" w:hint="eastAsia"/>
-          <w:color w:val="808080"/>
-          <w:kern w:val="0"/>
-          <w:sz w:val="20"/>
-          <w:szCs w:val="20"/>
-        </w:rPr>
-        <w:br/>
-        <w:t xml:space="preserve">    </w:t>
-      </w:r>
-      <w:r>
-        <w:rPr>
-          <w:rFonts w:ascii="Courier New" w:hAnsi="Courier New" w:cs="Courier New"/>
-          <w:color w:val="CC7832"/>
-          <w:kern w:val="0"/>
-          <w:sz w:val="20"/>
-          <w:szCs w:val="20"/>
-        </w:rPr>
-        <w:t>else</w:t>
-      </w:r>
-      <w:r>
-        <w:rPr>
-          <w:rFonts w:ascii="Courier New" w:hAnsi="Courier New" w:cs="Courier New"/>
-          <w:color w:val="A9B7C6"/>
-          <w:kern w:val="0"/>
-          <w:sz w:val="20"/>
-          <w:szCs w:val="20"/>
-        </w:rPr>
-        <w:t>:</w:t>
-      </w:r>
-      <w:r>
-        <w:rPr>
-          <w:rFonts w:ascii="Courier New" w:hAnsi="Courier New" w:cs="Courier New"/>
-          <w:color w:val="A9B7C6"/>
-          <w:kern w:val="0"/>
-          <w:sz w:val="20"/>
-          <w:szCs w:val="20"/>
-        </w:rPr>
-        <w:br/>
-        <w:t xml:space="preserve">        </w:t>
-      </w:r>
-      <w:r>
-        <w:rPr>
-          <w:rFonts w:ascii="Courier New" w:hAnsi="Courier New" w:cs="Courier New"/>
-          <w:color w:val="CC7832"/>
-          <w:kern w:val="0"/>
-          <w:sz w:val="20"/>
-          <w:szCs w:val="20"/>
-        </w:rPr>
-        <w:t xml:space="preserve">return </w:t>
-      </w:r>
-      <w:proofErr w:type="spellStart"/>
-      <w:r>
-        <w:rPr>
-          <w:rFonts w:ascii="Courier New" w:hAnsi="Courier New" w:cs="Courier New"/>
-          <w:color w:val="94558D"/>
-          <w:kern w:val="0"/>
-          <w:sz w:val="20"/>
-          <w:szCs w:val="20"/>
-        </w:rPr>
-        <w:t>self</w:t>
-      </w:r>
-      <w:r>
-        <w:rPr>
-          <w:rFonts w:ascii="Courier New" w:hAnsi="Courier New" w:cs="Courier New"/>
-          <w:color w:val="A9B7C6"/>
-          <w:kern w:val="0"/>
-          <w:sz w:val="20"/>
-          <w:szCs w:val="20"/>
-        </w:rPr>
-        <w:t>.a</w:t>
-      </w:r>
-      <w:proofErr w:type="spellEnd"/>
-      <w:r>
-        <w:rPr>
-          <w:rFonts w:ascii="Courier New" w:hAnsi="Courier New" w:cs="Courier New"/>
-          <w:color w:val="A9B7C6"/>
-          <w:kern w:val="0"/>
-          <w:sz w:val="20"/>
-          <w:szCs w:val="20"/>
-        </w:rPr>
-        <w:t xml:space="preserve"> &lt; </w:t>
-      </w:r>
-      <w:proofErr w:type="spellStart"/>
-      <w:r>
-        <w:rPr>
-          <w:rFonts w:ascii="Courier New" w:hAnsi="Courier New" w:cs="Courier New"/>
-          <w:color w:val="A9B7C6"/>
-          <w:kern w:val="0"/>
-          <w:sz w:val="20"/>
-          <w:szCs w:val="20"/>
-        </w:rPr>
-        <w:t>other.a</w:t>
-      </w:r>
-      <w:proofErr w:type="spellEnd"/>
-      <w:r>
-        <w:rPr>
-          <w:rFonts w:ascii="Courier New" w:hAnsi="Courier New" w:cs="Courier New"/>
-          <w:color w:val="A9B7C6"/>
-          <w:kern w:val="0"/>
-          <w:sz w:val="20"/>
-          <w:szCs w:val="20"/>
-        </w:rPr>
-        <w:t xml:space="preserve"> </w:t>
-      </w:r>
-      <w:r>
-        <w:rPr>
-          <w:rFonts w:ascii="Courier New" w:hAnsi="Courier New" w:cs="Courier New"/>
-          <w:color w:val="808080"/>
-          <w:kern w:val="0"/>
-          <w:sz w:val="20"/>
-          <w:szCs w:val="20"/>
-        </w:rPr>
-        <w:t>#</w:t>
-      </w:r>
-      <w:r>
-        <w:rPr>
-          <w:rFonts w:ascii="宋体" w:hAnsi="宋体" w:cs="Courier New" w:hint="eastAsia"/>
-          <w:color w:val="808080"/>
-          <w:kern w:val="0"/>
-          <w:sz w:val="20"/>
-          <w:szCs w:val="20"/>
-        </w:rPr>
-        <w:t>小</w:t>
-      </w:r>
-    </w:p>
-    <w:p>
-      <w:pPr>
-        <w:rPr>
-          <w:rFonts w:ascii="Consolas" w:hAnsi="Consolas" w:cs="Consolas"/>
-          <w:color w:val="0066CC"/>
-          <w:kern w:val="0"/>
-          <w:sz w:val="20"/>
-          <w:szCs w:val="20"/>
-          <w:u w:val="single"/>
-        </w:rPr>
-      </w:pPr>
-    </w:p>
-    <w:p>
-      <w:pPr>
-        <w:rPr>
-          <w:rFonts w:ascii="Consolas" w:hAnsi="Consolas" w:cs="Consolas"/>
-          <w:color w:val="0066CC"/>
-          <w:kern w:val="0"/>
-          <w:sz w:val="20"/>
-          <w:szCs w:val="20"/>
-          <w:u w:val="single"/>
-        </w:rPr>
-      </w:pPr>
-      <w:r>
-        <w:rPr>
-          <w:rFonts w:ascii="Consolas" w:hAnsi="Consolas" w:cs="Consolas" w:hint="eastAsia"/>
-          <w:color w:val="0066CC"/>
-          <w:kern w:val="0"/>
-          <w:sz w:val="20"/>
-          <w:szCs w:val="20"/>
-          <w:u w:val="single"/>
-        </w:rPr>
-        <w:t>问题</w:t>
-      </w:r>
-      <w:r>
-        <w:rPr>
-          <w:rFonts w:ascii="Consolas" w:hAnsi="Consolas" w:cs="Consolas" w:hint="eastAsia"/>
-          <w:color w:val="0066CC"/>
-          <w:kern w:val="0"/>
-          <w:sz w:val="20"/>
-          <w:szCs w:val="20"/>
-          <w:u w:val="single"/>
-        </w:rPr>
-        <w:t>3</w:t>
-      </w:r>
-      <w:r>
-        <w:rPr>
-          <w:rFonts w:ascii="Consolas" w:hAnsi="Consolas" w:cs="Consolas"/>
-          <w:color w:val="0066CC"/>
-          <w:kern w:val="0"/>
-          <w:sz w:val="20"/>
-          <w:szCs w:val="20"/>
-          <w:u w:val="single"/>
-        </w:rPr>
-        <w:t xml:space="preserve"> </w:t>
-      </w:r>
-      <w:r>
-        <w:rPr>
-          <w:rFonts w:ascii="Consolas" w:hAnsi="Consolas" w:cs="Consolas" w:hint="eastAsia"/>
-          <w:color w:val="0066CC"/>
-          <w:kern w:val="0"/>
-          <w:sz w:val="20"/>
-          <w:szCs w:val="20"/>
-          <w:u w:val="single"/>
-        </w:rPr>
-        <w:t>怎么</w:t>
-      </w:r>
-      <w:proofErr w:type="gramStart"/>
-      <w:r>
-        <w:rPr>
-          <w:rFonts w:ascii="Consolas" w:hAnsi="Consolas" w:cs="Consolas" w:hint="eastAsia"/>
-          <w:color w:val="0066CC"/>
-          <w:kern w:val="0"/>
-          <w:sz w:val="20"/>
-          <w:szCs w:val="20"/>
-          <w:u w:val="single"/>
-        </w:rPr>
-        <w:t>实现极</w:t>
-      </w:r>
-      <w:proofErr w:type="gramEnd"/>
-      <w:r>
-        <w:rPr>
-          <w:rFonts w:ascii="Consolas" w:hAnsi="Consolas" w:cs="Consolas" w:hint="eastAsia"/>
-          <w:color w:val="0066CC"/>
-          <w:kern w:val="0"/>
-          <w:sz w:val="20"/>
-          <w:szCs w:val="20"/>
-          <w:u w:val="single"/>
-        </w:rPr>
-        <w:t>大似然估计实现权重</w:t>
-      </w:r>
-      <w:r>
-        <w:rPr>
-          <w:rFonts w:ascii="Consolas" w:hAnsi="Consolas" w:cs="Consolas" w:hint="eastAsia"/>
-          <w:color w:val="0066CC"/>
-          <w:kern w:val="0"/>
-          <w:sz w:val="20"/>
-          <w:szCs w:val="20"/>
-          <w:u w:val="single"/>
-        </w:rPr>
-        <w:t>?</w:t>
-      </w:r>
-    </w:p>
-    <w:p>
-      <w:pPr>
-        <w:rPr>
-          <w:rFonts w:ascii="Arial" w:hAnsi="Arial" w:cs="Arial"/>
-          <w:color w:val="4D4D4D"/>
-          <w:shd w:val="clear" w:color="auto" w:fill="FFFFFF"/>
-        </w:rPr>
-      </w:pPr>
-      <w:r>
-        <w:rPr>
-          <w:rFonts w:ascii="Arial" w:hAnsi="Arial" w:cs="Arial"/>
-          <w:color w:val="4D4D4D"/>
-          <w:shd w:val="clear" w:color="auto" w:fill="FFFFFF"/>
-        </w:rPr>
-        <w:t>在</w:t>
-      </w:r>
-      <w:proofErr w:type="spellStart"/>
-      <w:r>
-        <w:rPr>
-          <w:rFonts w:ascii="Arial" w:hAnsi="Arial" w:cs="Arial"/>
-          <w:color w:val="4D4D4D"/>
-          <w:shd w:val="clear" w:color="auto" w:fill="FFFFFF"/>
-        </w:rPr>
-        <w:t>opencv</w:t>
-      </w:r>
-      <w:proofErr w:type="spellEnd"/>
-      <w:r>
-        <w:rPr>
-          <w:rFonts w:ascii="Arial" w:hAnsi="Arial" w:cs="Arial"/>
-          <w:color w:val="4D4D4D"/>
-          <w:shd w:val="clear" w:color="auto" w:fill="FFFFFF"/>
-        </w:rPr>
-        <w:t>中</w:t>
-      </w:r>
-      <w:r>
-        <w:rPr>
-          <w:rFonts w:ascii="Arial" w:hAnsi="Arial" w:cs="Arial"/>
-          <w:color w:val="4D4D4D"/>
-          <w:shd w:val="clear" w:color="auto" w:fill="FFFFFF"/>
-        </w:rPr>
-        <w:t xml:space="preserve"> </w:t>
-      </w:r>
-      <w:r>
-        <w:rPr>
-          <w:rFonts w:ascii="Arial" w:hAnsi="Arial" w:cs="Arial"/>
-          <w:color w:val="4D4D4D"/>
-          <w:shd w:val="clear" w:color="auto" w:fill="FFFFFF"/>
-        </w:rPr>
-        <w:t>可以通过函数</w:t>
-      </w:r>
-      <w:proofErr w:type="spellStart"/>
-      <w:r>
-        <w:rPr>
-          <w:rFonts w:ascii="Arial" w:hAnsi="Arial" w:cs="Arial"/>
-          <w:color w:val="4D4D4D"/>
-          <w:shd w:val="clear" w:color="auto" w:fill="FFFFFF"/>
-        </w:rPr>
-        <w:t>matchTemplate</w:t>
-      </w:r>
-      <w:proofErr w:type="spellEnd"/>
-      <w:r>
-        <w:rPr>
-          <w:rFonts w:ascii="Arial" w:hAnsi="Arial" w:cs="Arial"/>
-          <w:color w:val="4D4D4D"/>
-          <w:shd w:val="clear" w:color="auto" w:fill="FFFFFF"/>
-        </w:rPr>
-        <w:t>实现模板匹配，同时有六种相关的匹配算法</w:t>
+          <w:rFonts w:ascii="微软雅黑" w:eastAsia="微软雅黑" w:hAnsi="微软雅黑" w:cs="Courier New"/>
+          <w:kern w:val="0"/>
+          <w:sz w:val="18"/>
+          <w:szCs w:val="20"/>
+        </w:rPr>
+      </w:pPr>
+      <w:r>
+        <w:rPr>
+          <w:rFonts w:ascii="微软雅黑" w:eastAsia="微软雅黑" w:hAnsi="微软雅黑" w:cs="Courier New"/>
+          <w:kern w:val="0"/>
+          <w:sz w:val="18"/>
+          <w:szCs w:val="20"/>
+        </w:rPr>
+        <w:t>cv2.matchTemplate(target,template,cv2.TM_SQDIFF_NORMED)</w:t>
       </w:r>
     </w:p>
     <w:p>
@@ -3442,111 +2785,12 @@
       </w:pPr>
       <w:r>
         <w:rPr>
-          <w:rFonts w:ascii="微软雅黑" w:eastAsia="微软雅黑" w:hAnsi="微软雅黑" w:cs="Courier New"/>
+          <w:rFonts w:ascii="微软雅黑" w:eastAsia="微软雅黑" w:hAnsi="微软雅黑" w:cs="Courier New" w:hint="eastAsia"/>
           <w:kern w:val="0"/>
           <w:sz w:val="18"/>
           <w:szCs w:val="20"/>
         </w:rPr>
-        <w:t>cv2</w:t>
-      </w:r>
-      <w:r>
-        <w:rPr>
-          <w:rFonts w:ascii="微软雅黑" w:eastAsia="微软雅黑" w:hAnsi="微软雅黑" w:cs="Courier New"/>
-          <w:kern w:val="0"/>
-          <w:sz w:val="18"/>
-          <w:szCs w:val="20"/>
-        </w:rPr>
-        <w:t>.</w:t>
-      </w:r>
-      <w:r>
-        <w:rPr>
-          <w:rFonts w:ascii="微软雅黑" w:eastAsia="微软雅黑" w:hAnsi="微软雅黑" w:cs="Courier New"/>
-          <w:kern w:val="0"/>
-          <w:sz w:val="18"/>
-          <w:szCs w:val="20"/>
-        </w:rPr>
-        <w:t>matchTemplate</w:t>
-      </w:r>
-      <w:r>
-        <w:rPr>
-          <w:rFonts w:ascii="微软雅黑" w:eastAsia="微软雅黑" w:hAnsi="微软雅黑" w:cs="Courier New"/>
-          <w:kern w:val="0"/>
-          <w:sz w:val="18"/>
-          <w:szCs w:val="20"/>
-        </w:rPr>
-        <w:t>(</w:t>
-      </w:r>
-      <w:r>
-        <w:rPr>
-          <w:rFonts w:ascii="微软雅黑" w:eastAsia="微软雅黑" w:hAnsi="微软雅黑" w:cs="Courier New"/>
-          <w:kern w:val="0"/>
-          <w:sz w:val="18"/>
-          <w:szCs w:val="20"/>
-        </w:rPr>
-        <w:t>target</w:t>
-      </w:r>
-      <w:r>
-        <w:rPr>
-          <w:rFonts w:ascii="微软雅黑" w:eastAsia="微软雅黑" w:hAnsi="微软雅黑" w:cs="Courier New"/>
-          <w:kern w:val="0"/>
-          <w:sz w:val="18"/>
-          <w:szCs w:val="20"/>
-        </w:rPr>
-        <w:t>,</w:t>
-      </w:r>
-      <w:r>
-        <w:rPr>
-          <w:rFonts w:ascii="微软雅黑" w:eastAsia="微软雅黑" w:hAnsi="微软雅黑" w:cs="Courier New"/>
-          <w:kern w:val="0"/>
-          <w:sz w:val="18"/>
-          <w:szCs w:val="20"/>
-        </w:rPr>
-        <w:t>template</w:t>
-      </w:r>
-      <w:r>
-        <w:rPr>
-          <w:rFonts w:ascii="微软雅黑" w:eastAsia="微软雅黑" w:hAnsi="微软雅黑" w:cs="Courier New"/>
-          <w:kern w:val="0"/>
-          <w:sz w:val="18"/>
-          <w:szCs w:val="20"/>
-        </w:rPr>
-        <w:t>,</w:t>
-      </w:r>
-      <w:r>
-        <w:rPr>
-          <w:rFonts w:ascii="微软雅黑" w:eastAsia="微软雅黑" w:hAnsi="微软雅黑" w:cs="Courier New"/>
-          <w:kern w:val="0"/>
-          <w:sz w:val="18"/>
-          <w:szCs w:val="20"/>
-        </w:rPr>
-        <w:t>cv2</w:t>
-      </w:r>
-      <w:r>
-        <w:rPr>
-          <w:rFonts w:ascii="微软雅黑" w:eastAsia="微软雅黑" w:hAnsi="微软雅黑" w:cs="Courier New"/>
-          <w:kern w:val="0"/>
-          <w:sz w:val="18"/>
-          <w:szCs w:val="20"/>
-        </w:rPr>
-        <w:t>.</w:t>
-      </w:r>
-      <w:r>
-        <w:rPr>
-          <w:rFonts w:ascii="微软雅黑" w:eastAsia="微软雅黑" w:hAnsi="微软雅黑" w:cs="Courier New"/>
-          <w:kern w:val="0"/>
-          <w:sz w:val="18"/>
-          <w:szCs w:val="20"/>
-        </w:rPr>
-        <w:t>TM_SQDIFF_NORMED</w:t>
-      </w:r>
-      <w:r>
-        <w:rPr>
-          <w:rFonts w:ascii="微软雅黑" w:eastAsia="微软雅黑" w:hAnsi="微软雅黑" w:cs="Courier New"/>
-          <w:kern w:val="0"/>
-          <w:sz w:val="18"/>
-          <w:szCs w:val="20"/>
-        </w:rPr>
-        <w:t>)</w:t>
+        <w:t>#执行模板匹配，采用的匹配方式cv2.TM_SQDIFF_NORMED</w:t>
       </w:r>
     </w:p>
     <w:p>
@@ -3573,7 +2817,7 @@
         </w:tabs>
         <w:jc w:val="left"/>
         <w:rPr>
-          <w:rFonts w:ascii="微软雅黑" w:eastAsia="微软雅黑" w:hAnsi="微软雅黑" w:cs="Courier New" w:hint="eastAsia"/>
+          <w:rFonts w:ascii="微软雅黑" w:eastAsia="微软雅黑" w:hAnsi="微软雅黑" w:cs="Courier New"/>
           <w:kern w:val="0"/>
           <w:sz w:val="18"/>
           <w:szCs w:val="20"/>
@@ -3581,12 +2825,12 @@
       </w:pPr>
       <w:r>
         <w:rPr>
-          <w:rFonts w:ascii="微软雅黑" w:eastAsia="微软雅黑" w:hAnsi="微软雅黑" w:cs="Courier New" w:hint="eastAsia"/>
+          <w:rFonts w:ascii="微软雅黑" w:eastAsia="微软雅黑" w:hAnsi="微软雅黑" w:cs="Courier New"/>
           <w:kern w:val="0"/>
           <w:sz w:val="18"/>
           <w:szCs w:val="20"/>
         </w:rPr>
-        <w:t>#执行模板匹配，采用的匹配方式cv2.TM_SQDIFF_NORMED</w:t>
+        <w:t>result = cv2.matchTemplate(target,template,cv2.TM_SQDIFF_NORMED)</w:t>
       </w:r>
     </w:p>
     <w:p>
@@ -3621,12 +2865,13 @@
       </w:pPr>
       <w:r>
         <w:rPr>
-          <w:rFonts w:ascii="微软雅黑" w:eastAsia="微软雅黑" w:hAnsi="微软雅黑" w:cs="Courier New"/>
+          <w:rFonts w:ascii="微软雅黑" w:eastAsia="微软雅黑" w:hAnsi="微软雅黑" w:cs="Courier New" w:hint="eastAsia"/>
           <w:kern w:val="0"/>
           <w:sz w:val="18"/>
           <w:szCs w:val="20"/>
         </w:rPr>
-        <w:t>result = cv2.matchTemplate(target,template,cv2.TM_SQDIFF_NORMED)</w:t>
+        <w:lastRenderedPageBreak/>
+        <w:t>#归一化处理</w:t>
       </w:r>
     </w:p>
     <w:p>
@@ -3653,7 +2898,7 @@
         </w:tabs>
         <w:jc w:val="left"/>
         <w:rPr>
-          <w:rFonts w:ascii="微软雅黑" w:eastAsia="微软雅黑" w:hAnsi="微软雅黑" w:cs="Courier New" w:hint="eastAsia"/>
+          <w:rFonts w:ascii="微软雅黑" w:eastAsia="微软雅黑" w:hAnsi="微软雅黑" w:cs="Courier New"/>
           <w:kern w:val="0"/>
           <w:sz w:val="18"/>
           <w:szCs w:val="20"/>
@@ -3661,12 +2906,32 @@
       </w:pPr>
       <w:r>
         <w:rPr>
-          <w:rFonts w:ascii="微软雅黑" w:eastAsia="微软雅黑" w:hAnsi="微软雅黑" w:cs="Courier New" w:hint="eastAsia"/>
+          <w:rFonts w:ascii="微软雅黑" w:eastAsia="微软雅黑" w:hAnsi="微软雅黑" w:cs="Courier New"/>
           <w:kern w:val="0"/>
           <w:sz w:val="18"/>
           <w:szCs w:val="20"/>
         </w:rPr>
-        <w:t>#归一化处理</w:t>
+        <w:t>cv2.normalize</w:t>
+      </w:r>
+      <w:proofErr w:type="gramStart"/>
+      <w:r>
+        <w:rPr>
+          <w:rFonts w:ascii="微软雅黑" w:eastAsia="微软雅黑" w:hAnsi="微软雅黑" w:cs="Courier New"/>
+          <w:kern w:val="0"/>
+          <w:sz w:val="18"/>
+          <w:szCs w:val="20"/>
+        </w:rPr>
+        <w:t>( result</w:t>
+      </w:r>
+      <w:proofErr w:type="gramEnd"/>
+      <w:r>
+        <w:rPr>
+          <w:rFonts w:ascii="微软雅黑" w:eastAsia="微软雅黑" w:hAnsi="微软雅黑" w:cs="Courier New"/>
+          <w:kern w:val="0"/>
+          <w:sz w:val="18"/>
+          <w:szCs w:val="20"/>
+        </w:rPr>
+        <w:t>, result, 0, 1, cv2.NORM_MINMAX, -1 )</w:t>
       </w:r>
     </w:p>
     <w:p>
@@ -3701,32 +2966,32 @@
       </w:pPr>
       <w:r>
         <w:rPr>
-          <w:rFonts w:ascii="微软雅黑" w:eastAsia="微软雅黑" w:hAnsi="微软雅黑" w:cs="Courier New"/>
+          <w:rFonts w:ascii="微软雅黑" w:eastAsia="微软雅黑" w:hAnsi="微软雅黑" w:cs="Courier New" w:hint="eastAsia"/>
           <w:kern w:val="0"/>
           <w:sz w:val="18"/>
           <w:szCs w:val="20"/>
         </w:rPr>
-        <w:t>cv2.normalize</w:t>
+        <w:t>#寻找矩阵（一维数组</w:t>
       </w:r>
       <w:proofErr w:type="gramStart"/>
       <w:r>
         <w:rPr>
-          <w:rFonts w:ascii="微软雅黑" w:eastAsia="微软雅黑" w:hAnsi="微软雅黑" w:cs="Courier New"/>
+          <w:rFonts w:ascii="微软雅黑" w:eastAsia="微软雅黑" w:hAnsi="微软雅黑" w:cs="Courier New" w:hint="eastAsia"/>
           <w:kern w:val="0"/>
           <w:sz w:val="18"/>
           <w:szCs w:val="20"/>
         </w:rPr>
-        <w:t>( result</w:t>
+        <w:t>当做</w:t>
       </w:r>
       <w:proofErr w:type="gramEnd"/>
       <w:r>
         <w:rPr>
-          <w:rFonts w:ascii="微软雅黑" w:eastAsia="微软雅黑" w:hAnsi="微软雅黑" w:cs="Courier New"/>
+          <w:rFonts w:ascii="微软雅黑" w:eastAsia="微软雅黑" w:hAnsi="微软雅黑" w:cs="Courier New" w:hint="eastAsia"/>
           <w:kern w:val="0"/>
           <w:sz w:val="18"/>
           <w:szCs w:val="20"/>
         </w:rPr>
-        <w:t>, result, 0, 1, cv2.NORM_MINMAX, -1 )</w:t>
+        <w:t>向量，用Mat定义）中的最大值和最小值的匹配结果及其位置</w:t>
       </w:r>
     </w:p>
     <w:p>
@@ -3753,40 +3018,91 @@
         </w:tabs>
         <w:jc w:val="left"/>
         <w:rPr>
-          <w:rFonts w:ascii="微软雅黑" w:eastAsia="微软雅黑" w:hAnsi="微软雅黑" w:cs="Courier New" w:hint="eastAsia"/>
+          <w:rFonts w:ascii="微软雅黑" w:eastAsia="微软雅黑" w:hAnsi="微软雅黑" w:cs="Courier New"/>
           <w:kern w:val="0"/>
           <w:sz w:val="18"/>
           <w:szCs w:val="20"/>
         </w:rPr>
       </w:pPr>
-      <w:r>
-        <w:rPr>
-          <w:rFonts w:ascii="微软雅黑" w:eastAsia="微软雅黑" w:hAnsi="微软雅黑" w:cs="Courier New" w:hint="eastAsia"/>
+      <w:proofErr w:type="spellStart"/>
+      <w:r>
+        <w:rPr>
+          <w:rFonts w:ascii="微软雅黑" w:eastAsia="微软雅黑" w:hAnsi="微软雅黑" w:cs="Courier New"/>
           <w:kern w:val="0"/>
           <w:sz w:val="18"/>
           <w:szCs w:val="20"/>
         </w:rPr>
-        <w:t>#寻找矩阵（一维数组</w:t>
-      </w:r>
-      <w:proofErr w:type="gramStart"/>
-      <w:r>
-        <w:rPr>
-          <w:rFonts w:ascii="微软雅黑" w:eastAsia="微软雅黑" w:hAnsi="微软雅黑" w:cs="Courier New" w:hint="eastAsia"/>
+        <w:t>min_val</w:t>
+      </w:r>
+      <w:proofErr w:type="spellEnd"/>
+      <w:r>
+        <w:rPr>
+          <w:rFonts w:ascii="微软雅黑" w:eastAsia="微软雅黑" w:hAnsi="微软雅黑" w:cs="Courier New"/>
           <w:kern w:val="0"/>
           <w:sz w:val="18"/>
           <w:szCs w:val="20"/>
         </w:rPr>
-        <w:t>当做</w:t>
-      </w:r>
-      <w:proofErr w:type="gramEnd"/>
-      <w:r>
-        <w:rPr>
-          <w:rFonts w:ascii="微软雅黑" w:eastAsia="微软雅黑" w:hAnsi="微软雅黑" w:cs="Courier New" w:hint="eastAsia"/>
+        <w:t xml:space="preserve">, </w:t>
+      </w:r>
+      <w:proofErr w:type="spellStart"/>
+      <w:r>
+        <w:rPr>
+          <w:rFonts w:ascii="微软雅黑" w:eastAsia="微软雅黑" w:hAnsi="微软雅黑" w:cs="Courier New"/>
           <w:kern w:val="0"/>
           <w:sz w:val="18"/>
           <w:szCs w:val="20"/>
         </w:rPr>
-        <w:t>向量，用Mat定义）中的最大值和最小值的匹配结果及其位置</w:t>
+        <w:t>max_val</w:t>
+      </w:r>
+      <w:proofErr w:type="spellEnd"/>
+      <w:r>
+        <w:rPr>
+          <w:rFonts w:ascii="微软雅黑" w:eastAsia="微软雅黑" w:hAnsi="微软雅黑" w:cs="Courier New"/>
+          <w:kern w:val="0"/>
+          <w:sz w:val="18"/>
+          <w:szCs w:val="20"/>
+        </w:rPr>
+        <w:t xml:space="preserve">, </w:t>
+      </w:r>
+      <w:proofErr w:type="spellStart"/>
+      <w:r>
+        <w:rPr>
+          <w:rFonts w:ascii="微软雅黑" w:eastAsia="微软雅黑" w:hAnsi="微软雅黑" w:cs="Courier New"/>
+          <w:kern w:val="0"/>
+          <w:sz w:val="18"/>
+          <w:szCs w:val="20"/>
+        </w:rPr>
+        <w:t>min_loc</w:t>
+      </w:r>
+      <w:proofErr w:type="spellEnd"/>
+      <w:r>
+        <w:rPr>
+          <w:rFonts w:ascii="微软雅黑" w:eastAsia="微软雅黑" w:hAnsi="微软雅黑" w:cs="Courier New"/>
+          <w:kern w:val="0"/>
+          <w:sz w:val="18"/>
+          <w:szCs w:val="20"/>
+        </w:rPr>
+        <w:t xml:space="preserve">, </w:t>
+      </w:r>
+      <w:proofErr w:type="spellStart"/>
+      <w:r>
+        <w:rPr>
+          <w:rFonts w:ascii="微软雅黑" w:eastAsia="微软雅黑" w:hAnsi="微软雅黑" w:cs="Courier New"/>
+          <w:kern w:val="0"/>
+          <w:sz w:val="18"/>
+          <w:szCs w:val="20"/>
+        </w:rPr>
+        <w:t>max_loc</w:t>
+      </w:r>
+      <w:proofErr w:type="spellEnd"/>
+      <w:r>
+        <w:rPr>
+          <w:rFonts w:ascii="微软雅黑" w:eastAsia="微软雅黑" w:hAnsi="微软雅黑" w:cs="Courier New"/>
+          <w:kern w:val="0"/>
+          <w:sz w:val="18"/>
+          <w:szCs w:val="20"/>
+        </w:rPr>
+        <w:t xml:space="preserve"> = cv2.minMaxLoc(result)</w:t>
       </w:r>
     </w:p>
     <w:p>
@@ -3819,85 +3135,34 @@
           <w:szCs w:val="20"/>
         </w:rPr>
       </w:pPr>
-      <w:proofErr w:type="spellStart"/>
-      <w:r>
-        <w:rPr>
-          <w:rFonts w:ascii="微软雅黑" w:eastAsia="微软雅黑" w:hAnsi="微软雅黑" w:cs="Courier New"/>
+      <w:r>
+        <w:rPr>
+          <w:rFonts w:ascii="微软雅黑" w:eastAsia="微软雅黑" w:hAnsi="微软雅黑" w:cs="Courier New" w:hint="eastAsia"/>
           <w:kern w:val="0"/>
           <w:sz w:val="18"/>
           <w:szCs w:val="20"/>
         </w:rPr>
-        <w:t>min_val</w:t>
-      </w:r>
-      <w:proofErr w:type="spellEnd"/>
-      <w:r>
-        <w:rPr>
-          <w:rFonts w:ascii="微软雅黑" w:eastAsia="微软雅黑" w:hAnsi="微软雅黑" w:cs="Courier New"/>
+        <w:t>#</w:t>
+      </w:r>
+      <w:proofErr w:type="gramStart"/>
+      <w:r>
+        <w:rPr>
+          <w:rFonts w:ascii="微软雅黑" w:eastAsia="微软雅黑" w:hAnsi="微软雅黑" w:cs="Courier New" w:hint="eastAsia"/>
           <w:kern w:val="0"/>
           <w:sz w:val="18"/>
           <w:szCs w:val="20"/>
         </w:rPr>
-        <w:t xml:space="preserve">, </w:t>
-      </w:r>
-      <w:proofErr w:type="spellStart"/>
-      <w:r>
-        <w:rPr>
-          <w:rFonts w:ascii="微软雅黑" w:eastAsia="微软雅黑" w:hAnsi="微软雅黑" w:cs="Courier New"/>
+        <w:t>匹配值</w:t>
+      </w:r>
+      <w:proofErr w:type="gramEnd"/>
+      <w:r>
+        <w:rPr>
+          <w:rFonts w:ascii="微软雅黑" w:eastAsia="微软雅黑" w:hAnsi="微软雅黑" w:cs="Courier New" w:hint="eastAsia"/>
           <w:kern w:val="0"/>
           <w:sz w:val="18"/>
           <w:szCs w:val="20"/>
         </w:rPr>
-        <w:t>max_val</w:t>
-      </w:r>
-      <w:proofErr w:type="spellEnd"/>
-      <w:r>
-        <w:rPr>
-          <w:rFonts w:ascii="微软雅黑" w:eastAsia="微软雅黑" w:hAnsi="微软雅黑" w:cs="Courier New"/>
-          <w:kern w:val="0"/>
-          <w:sz w:val="18"/>
-          <w:szCs w:val="20"/>
-        </w:rPr>
-        <w:t xml:space="preserve">, </w:t>
-      </w:r>
-      <w:proofErr w:type="spellStart"/>
-      <w:r>
-        <w:rPr>
-          <w:rFonts w:ascii="微软雅黑" w:eastAsia="微软雅黑" w:hAnsi="微软雅黑" w:cs="Courier New"/>
-          <w:kern w:val="0"/>
-          <w:sz w:val="18"/>
-          <w:szCs w:val="20"/>
-        </w:rPr>
-        <w:t>min_loc</w:t>
-      </w:r>
-      <w:proofErr w:type="spellEnd"/>
-      <w:r>
-        <w:rPr>
-          <w:rFonts w:ascii="微软雅黑" w:eastAsia="微软雅黑" w:hAnsi="微软雅黑" w:cs="Courier New"/>
-          <w:kern w:val="0"/>
-          <w:sz w:val="18"/>
-          <w:szCs w:val="20"/>
-        </w:rPr>
-        <w:t xml:space="preserve">, </w:t>
-      </w:r>
-      <w:proofErr w:type="spellStart"/>
-      <w:r>
-        <w:rPr>
-          <w:rFonts w:ascii="微软雅黑" w:eastAsia="微软雅黑" w:hAnsi="微软雅黑" w:cs="Courier New"/>
-          <w:kern w:val="0"/>
-          <w:sz w:val="18"/>
-          <w:szCs w:val="20"/>
-        </w:rPr>
-        <w:t>max_loc</w:t>
-      </w:r>
-      <w:proofErr w:type="spellEnd"/>
-      <w:r>
-        <w:rPr>
-          <w:rFonts w:ascii="微软雅黑" w:eastAsia="微软雅黑" w:hAnsi="微软雅黑" w:cs="Courier New"/>
-          <w:kern w:val="0"/>
-          <w:sz w:val="18"/>
-          <w:szCs w:val="20"/>
-        </w:rPr>
-        <w:t xml:space="preserve"> = cv2.minMaxLoc(result)</w:t>
+        <w:t>转换为字符串</w:t>
       </w:r>
     </w:p>
     <w:p>
@@ -3924,12 +3189,22 @@
         </w:tabs>
         <w:jc w:val="left"/>
         <w:rPr>
+          <w:rFonts w:ascii="微软雅黑" w:eastAsia="微软雅黑" w:hAnsi="微软雅黑" w:cs="Courier New"/>
+          <w:kern w:val="0"/>
+          <w:sz w:val="18"/>
+          <w:szCs w:val="20"/>
+        </w:rPr>
+      </w:pPr>
+      <w:r>
+        <w:rPr>
           <w:rFonts w:ascii="微软雅黑" w:eastAsia="微软雅黑" w:hAnsi="微软雅黑" w:cs="Courier New" w:hint="eastAsia"/>
           <w:kern w:val="0"/>
           <w:sz w:val="18"/>
           <w:szCs w:val="20"/>
         </w:rPr>
-      </w:pPr>
+        <w:t>#对于cv2.TM_SQDIFF及cv2.TM_SQDIFF_NORMED方法</w:t>
+      </w:r>
+      <w:proofErr w:type="spellStart"/>
       <w:r>
         <w:rPr>
           <w:rFonts w:ascii="微软雅黑" w:eastAsia="微软雅黑" w:hAnsi="微软雅黑" w:cs="Courier New" w:hint="eastAsia"/>
@@ -3937,9 +3212,9 @@
           <w:sz w:val="18"/>
           <w:szCs w:val="20"/>
         </w:rPr>
-        <w:t>#</w:t>
-      </w:r>
-      <w:proofErr w:type="gramStart"/>
+        <w:t>min_val</w:t>
+      </w:r>
+      <w:proofErr w:type="spellEnd"/>
       <w:r>
         <w:rPr>
           <w:rFonts w:ascii="微软雅黑" w:eastAsia="微软雅黑" w:hAnsi="微软雅黑" w:cs="Courier New" w:hint="eastAsia"/>
@@ -3947,9 +3222,9 @@
           <w:sz w:val="18"/>
           <w:szCs w:val="20"/>
         </w:rPr>
-        <w:t>匹配值</w:t>
-      </w:r>
-      <w:proofErr w:type="gramEnd"/>
+        <w:t>越趋近与0匹配度越好，匹配位置取</w:t>
+      </w:r>
+      <w:proofErr w:type="spellStart"/>
       <w:r>
         <w:rPr>
           <w:rFonts w:ascii="微软雅黑" w:eastAsia="微软雅黑" w:hAnsi="微软雅黑" w:cs="Courier New" w:hint="eastAsia"/>
@@ -3957,10 +3232,9 @@
           <w:sz w:val="18"/>
           <w:szCs w:val="20"/>
         </w:rPr>
-        <w:t>转换为字符串</w:t>
-      </w:r>
-      <w:bookmarkStart w:id="5" w:name="_GoBack"/>
-      <w:bookmarkEnd w:id="5"/>
+        <w:t>min_loc</w:t>
+      </w:r>
+      <w:proofErr w:type="spellEnd"/>
     </w:p>
     <w:p>
       <w:pPr>
@@ -3986,12 +3260,22 @@
         </w:tabs>
         <w:jc w:val="left"/>
         <w:rPr>
+          <w:rFonts w:ascii="微软雅黑" w:eastAsia="微软雅黑" w:hAnsi="微软雅黑" w:cs="Courier New"/>
+          <w:kern w:val="0"/>
+          <w:sz w:val="18"/>
+          <w:szCs w:val="20"/>
+        </w:rPr>
+      </w:pPr>
+      <w:r>
+        <w:rPr>
           <w:rFonts w:ascii="微软雅黑" w:eastAsia="微软雅黑" w:hAnsi="微软雅黑" w:cs="Courier New" w:hint="eastAsia"/>
           <w:kern w:val="0"/>
           <w:sz w:val="18"/>
           <w:szCs w:val="20"/>
         </w:rPr>
-      </w:pPr>
+        <w:t>#对于其他方法</w:t>
+      </w:r>
+      <w:proofErr w:type="spellStart"/>
       <w:r>
         <w:rPr>
           <w:rFonts w:ascii="微软雅黑" w:eastAsia="微软雅黑" w:hAnsi="微软雅黑" w:cs="Courier New" w:hint="eastAsia"/>
@@ -3999,7 +3283,17 @@
           <w:sz w:val="18"/>
           <w:szCs w:val="20"/>
         </w:rPr>
-        <w:t>#对于cv2.TM_SQDIFF及cv2.TM_SQDIFF_NORMED方法</w:t>
+        <w:t>max_val</w:t>
+      </w:r>
+      <w:proofErr w:type="spellEnd"/>
+      <w:r>
+        <w:rPr>
+          <w:rFonts w:ascii="微软雅黑" w:eastAsia="微软雅黑" w:hAnsi="微软雅黑" w:cs="Courier New" w:hint="eastAsia"/>
+          <w:kern w:val="0"/>
+          <w:sz w:val="18"/>
+          <w:szCs w:val="20"/>
+        </w:rPr>
+        <w:t>越趋近于1匹配度越好，匹配位置取</w:t>
       </w:r>
       <w:proofErr w:type="spellStart"/>
       <w:r>
@@ -4009,29 +3303,1024 @@
           <w:sz w:val="18"/>
           <w:szCs w:val="20"/>
         </w:rPr>
-        <w:t>min_val</w:t>
+        <w:t>max_loc</w:t>
       </w:r>
       <w:proofErr w:type="spellEnd"/>
-      <w:r>
-        <w:rPr>
-          <w:rFonts w:ascii="微软雅黑" w:eastAsia="微软雅黑" w:hAnsi="微软雅黑" w:cs="Courier New" w:hint="eastAsia"/>
-          <w:kern w:val="0"/>
-          <w:sz w:val="18"/>
-          <w:szCs w:val="20"/>
-        </w:rPr>
-        <w:t>越趋近与0匹配度越好，匹配位置取</w:t>
+    </w:p>
+    <w:p>
+      <w:pPr>
+        <w:rPr>
+          <w:rFonts w:ascii="Consolas" w:hAnsi="Consolas" w:cs="Consolas"/>
+          <w:color w:val="0066CC"/>
+          <w:kern w:val="0"/>
+          <w:sz w:val="20"/>
+          <w:szCs w:val="20"/>
+          <w:u w:val="single"/>
+        </w:rPr>
+      </w:pPr>
+    </w:p>
+    <w:p>
+      <w:pPr>
+        <w:rPr>
+          <w:rFonts w:ascii="Consolas" w:hAnsi="Consolas" w:cs="Consolas"/>
+          <w:color w:val="0066CC"/>
+          <w:kern w:val="0"/>
+          <w:sz w:val="20"/>
+          <w:szCs w:val="20"/>
+          <w:u w:val="single"/>
+        </w:rPr>
+      </w:pPr>
+      <w:r>
+        <w:rPr>
+          <w:rFonts w:ascii="Consolas" w:hAnsi="Consolas" w:cs="Consolas" w:hint="eastAsia"/>
+          <w:color w:val="0066CC"/>
+          <w:kern w:val="0"/>
+          <w:sz w:val="20"/>
+          <w:szCs w:val="20"/>
+          <w:u w:val="single"/>
+        </w:rPr>
+        <w:t>问题</w:t>
+      </w:r>
+      <w:r>
+        <w:rPr>
+          <w:rFonts w:ascii="Consolas" w:hAnsi="Consolas" w:cs="Consolas" w:hint="eastAsia"/>
+          <w:color w:val="0066CC"/>
+          <w:kern w:val="0"/>
+          <w:sz w:val="20"/>
+          <w:szCs w:val="20"/>
+          <w:u w:val="single"/>
+        </w:rPr>
+        <w:t>3</w:t>
+      </w:r>
+      <w:r>
+        <w:rPr>
+          <w:rFonts w:ascii="Consolas" w:hAnsi="Consolas" w:cs="Consolas"/>
+          <w:color w:val="0066CC"/>
+          <w:kern w:val="0"/>
+          <w:sz w:val="20"/>
+          <w:szCs w:val="20"/>
+          <w:u w:val="single"/>
+        </w:rPr>
+        <w:t xml:space="preserve"> </w:t>
+      </w:r>
+      <w:r>
+        <w:rPr>
+          <w:rFonts w:ascii="Consolas" w:hAnsi="Consolas" w:cs="Consolas" w:hint="eastAsia"/>
+          <w:color w:val="0066CC"/>
+          <w:kern w:val="0"/>
+          <w:sz w:val="20"/>
+          <w:szCs w:val="20"/>
+          <w:u w:val="single"/>
+        </w:rPr>
+        <w:t>怎么</w:t>
+      </w:r>
+      <w:proofErr w:type="gramStart"/>
+      <w:r>
+        <w:rPr>
+          <w:rFonts w:ascii="Consolas" w:hAnsi="Consolas" w:cs="Consolas" w:hint="eastAsia"/>
+          <w:color w:val="0066CC"/>
+          <w:kern w:val="0"/>
+          <w:sz w:val="20"/>
+          <w:szCs w:val="20"/>
+          <w:u w:val="single"/>
+        </w:rPr>
+        <w:t>实现极</w:t>
+      </w:r>
+      <w:proofErr w:type="gramEnd"/>
+      <w:r>
+        <w:rPr>
+          <w:rFonts w:ascii="Consolas" w:hAnsi="Consolas" w:cs="Consolas" w:hint="eastAsia"/>
+          <w:color w:val="0066CC"/>
+          <w:kern w:val="0"/>
+          <w:sz w:val="20"/>
+          <w:szCs w:val="20"/>
+          <w:u w:val="single"/>
+        </w:rPr>
+        <w:t>大似然估计实现权重</w:t>
+      </w:r>
+      <w:r>
+        <w:rPr>
+          <w:rFonts w:ascii="Consolas" w:hAnsi="Consolas" w:cs="Consolas" w:hint="eastAsia"/>
+          <w:color w:val="0066CC"/>
+          <w:kern w:val="0"/>
+          <w:sz w:val="20"/>
+          <w:szCs w:val="20"/>
+          <w:u w:val="single"/>
+        </w:rPr>
+        <w:t>?</w:t>
+      </w:r>
+    </w:p>
+    <w:p>
+      <w:pPr>
+        <w:rPr>
+          <w:rFonts w:ascii="Arial" w:hAnsi="Arial" w:cs="Arial"/>
+          <w:color w:val="333333"/>
+          <w:sz w:val="20"/>
+          <w:szCs w:val="20"/>
+          <w:shd w:val="clear" w:color="auto" w:fill="FFFFFF"/>
+        </w:rPr>
+      </w:pPr>
+      <w:r>
+        <w:rPr>
+          <w:rFonts w:ascii="Arial" w:hAnsi="Arial" w:cs="Arial"/>
+          <w:color w:val="333333"/>
+          <w:sz w:val="20"/>
+          <w:szCs w:val="20"/>
+          <w:shd w:val="clear" w:color="auto" w:fill="FFFFFF"/>
+        </w:rPr>
+        <w:t>相似度计算</w:t>
+      </w:r>
+      <w:r>
+        <w:rPr>
+          <w:rFonts w:ascii="Arial" w:hAnsi="Arial" w:cs="Arial"/>
+          <w:color w:val="333333"/>
+          <w:sz w:val="20"/>
+          <w:szCs w:val="20"/>
+          <w:shd w:val="clear" w:color="auto" w:fill="FFFFFF"/>
+        </w:rPr>
+        <w:t xml:space="preserve">, </w:t>
+      </w:r>
+      <w:r>
+        <w:rPr>
+          <w:rFonts w:ascii="Arial" w:hAnsi="Arial" w:cs="Arial"/>
+          <w:color w:val="333333"/>
+          <w:sz w:val="20"/>
+          <w:szCs w:val="20"/>
+          <w:shd w:val="clear" w:color="auto" w:fill="FFFFFF"/>
+        </w:rPr>
+        <w:t>方法</w:t>
+      </w:r>
+      <w:proofErr w:type="gramStart"/>
+      <w:r>
+        <w:rPr>
+          <w:rFonts w:ascii="Arial" w:hAnsi="Arial" w:cs="Arial"/>
+          <w:color w:val="333333"/>
+          <w:sz w:val="20"/>
+          <w:szCs w:val="20"/>
+          <w:shd w:val="clear" w:color="auto" w:fill="FFFFFF"/>
+        </w:rPr>
+        <w:t>一</w:t>
+      </w:r>
+      <w:proofErr w:type="gramEnd"/>
+      <w:r>
+        <w:rPr>
+          <w:rFonts w:ascii="Arial" w:hAnsi="Arial" w:cs="Arial"/>
+          <w:color w:val="333333"/>
+          <w:sz w:val="20"/>
+          <w:szCs w:val="20"/>
+          <w:shd w:val="clear" w:color="auto" w:fill="FFFFFF"/>
+        </w:rPr>
+        <w:t xml:space="preserve">, </w:t>
+      </w:r>
+      <w:r>
+        <w:rPr>
+          <w:rFonts w:ascii="Arial" w:hAnsi="Arial" w:cs="Arial"/>
+          <w:color w:val="333333"/>
+          <w:sz w:val="20"/>
+          <w:szCs w:val="20"/>
+          <w:shd w:val="clear" w:color="auto" w:fill="FFFFFF"/>
+        </w:rPr>
+        <w:t>欧氏距离是最常用的距离计算公式，衡量的是多维空间中各个点之间的绝对距离，当数据很稠密并且连续时，这是一种很好的计算方式。</w:t>
+      </w:r>
+    </w:p>
+    <w:p>
+      <w:pPr>
+        <w:rPr>
+          <w:rFonts w:ascii="Arial" w:hAnsi="Arial" w:cs="Arial"/>
+          <w:color w:val="333333"/>
+          <w:sz w:val="20"/>
+          <w:szCs w:val="20"/>
+          <w:shd w:val="clear" w:color="auto" w:fill="FFFFFF"/>
+        </w:rPr>
+      </w:pPr>
+      <w:r>
+        <w:rPr>
+          <w:rFonts w:ascii="Arial" w:hAnsi="Arial" w:cs="Arial" w:hint="eastAsia"/>
+          <w:color w:val="333333"/>
+          <w:sz w:val="20"/>
+          <w:szCs w:val="20"/>
+          <w:shd w:val="clear" w:color="auto" w:fill="FFFFFF"/>
+        </w:rPr>
+        <w:t>方法二</w:t>
+      </w:r>
+      <w:r>
+        <w:rPr>
+          <w:rFonts w:ascii="Arial" w:hAnsi="Arial" w:cs="Arial" w:hint="eastAsia"/>
+          <w:color w:val="333333"/>
+          <w:sz w:val="20"/>
+          <w:szCs w:val="20"/>
+          <w:shd w:val="clear" w:color="auto" w:fill="FFFFFF"/>
+        </w:rPr>
+        <w:t>:</w:t>
+      </w:r>
+      <w:r>
+        <w:rPr>
+          <w:rFonts w:ascii="Arial" w:hAnsi="Arial" w:cs="Arial"/>
+          <w:color w:val="333333"/>
+          <w:sz w:val="20"/>
+          <w:szCs w:val="20"/>
+          <w:shd w:val="clear" w:color="auto" w:fill="FFFFFF"/>
+        </w:rPr>
+        <w:t xml:space="preserve"> </w:t>
+      </w:r>
+      <w:r>
+        <w:rPr>
+          <w:rFonts w:ascii="Arial" w:hAnsi="Arial" w:cs="Arial" w:hint="eastAsia"/>
+          <w:color w:val="333333"/>
+          <w:sz w:val="20"/>
+          <w:szCs w:val="20"/>
+          <w:shd w:val="clear" w:color="auto" w:fill="FFFFFF"/>
+        </w:rPr>
+        <w:t>明可夫斯基距离（</w:t>
       </w:r>
       <w:proofErr w:type="spellStart"/>
       <w:r>
         <w:rPr>
-          <w:rFonts w:ascii="微软雅黑" w:eastAsia="微软雅黑" w:hAnsi="微软雅黑" w:cs="Courier New" w:hint="eastAsia"/>
-          <w:kern w:val="0"/>
-          <w:sz w:val="18"/>
-          <w:szCs w:val="20"/>
-        </w:rPr>
-        <w:t>min_loc</w:t>
+          <w:rFonts w:ascii="Arial" w:hAnsi="Arial" w:cs="Arial" w:hint="eastAsia"/>
+          <w:color w:val="333333"/>
+          <w:sz w:val="20"/>
+          <w:szCs w:val="20"/>
+          <w:shd w:val="clear" w:color="auto" w:fill="FFFFFF"/>
+        </w:rPr>
+        <w:t>Minkowski</w:t>
       </w:r>
       <w:proofErr w:type="spellEnd"/>
+      <w:r>
+        <w:rPr>
+          <w:rFonts w:ascii="Arial" w:hAnsi="Arial" w:cs="Arial" w:hint="eastAsia"/>
+          <w:color w:val="333333"/>
+          <w:sz w:val="20"/>
+          <w:szCs w:val="20"/>
+          <w:shd w:val="clear" w:color="auto" w:fill="FFFFFF"/>
+        </w:rPr>
+        <w:t xml:space="preserve"> distance</w:t>
+      </w:r>
+      <w:r>
+        <w:rPr>
+          <w:rFonts w:ascii="Arial" w:hAnsi="Arial" w:cs="Arial" w:hint="eastAsia"/>
+          <w:color w:val="333333"/>
+          <w:sz w:val="20"/>
+          <w:szCs w:val="20"/>
+          <w:shd w:val="clear" w:color="auto" w:fill="FFFFFF"/>
+        </w:rPr>
+        <w:t>）</w:t>
+      </w:r>
+    </w:p>
+    <w:p>
+      <w:pPr>
+        <w:rPr>
+          <w:rFonts w:ascii="Arial" w:hAnsi="Arial" w:cs="Arial"/>
+          <w:color w:val="333333"/>
+          <w:sz w:val="20"/>
+          <w:szCs w:val="20"/>
+          <w:shd w:val="clear" w:color="auto" w:fill="FFFFFF"/>
+        </w:rPr>
+      </w:pPr>
+      <w:proofErr w:type="gramStart"/>
+      <w:r>
+        <w:rPr>
+          <w:rFonts w:ascii="Arial" w:hAnsi="Arial" w:cs="Arial"/>
+          <w:color w:val="333333"/>
+          <w:sz w:val="20"/>
+          <w:szCs w:val="20"/>
+          <w:shd w:val="clear" w:color="auto" w:fill="FFFFFF"/>
+        </w:rPr>
+        <w:t>明氏距离</w:t>
+      </w:r>
+      <w:proofErr w:type="gramEnd"/>
+      <w:r>
+        <w:rPr>
+          <w:rFonts w:ascii="Arial" w:hAnsi="Arial" w:cs="Arial"/>
+          <w:color w:val="333333"/>
+          <w:sz w:val="20"/>
+          <w:szCs w:val="20"/>
+          <w:shd w:val="clear" w:color="auto" w:fill="FFFFFF"/>
+        </w:rPr>
+        <w:t>是欧氏距离的推广，是对多个距离度量公式的概括性的表述</w:t>
+      </w:r>
+      <w:r>
+        <w:rPr>
+          <w:rFonts w:ascii="Arial" w:hAnsi="Arial" w:cs="Arial" w:hint="eastAsia"/>
+          <w:color w:val="333333"/>
+          <w:sz w:val="20"/>
+          <w:szCs w:val="20"/>
+          <w:shd w:val="clear" w:color="auto" w:fill="FFFFFF"/>
+        </w:rPr>
+        <w:t>.</w:t>
+      </w:r>
+    </w:p>
+    <w:p>
+      <w:pPr>
+        <w:rPr>
+          <w:rFonts w:ascii="Arial" w:hAnsi="Arial" w:cs="Arial"/>
+          <w:color w:val="333333"/>
+          <w:sz w:val="20"/>
+          <w:szCs w:val="20"/>
+          <w:shd w:val="clear" w:color="auto" w:fill="FFFFFF"/>
+        </w:rPr>
+      </w:pPr>
+      <w:r>
+        <w:rPr>
+          <w:rFonts w:ascii="Arial" w:hAnsi="Arial" w:cs="Arial" w:hint="eastAsia"/>
+          <w:color w:val="333333"/>
+          <w:sz w:val="20"/>
+          <w:szCs w:val="20"/>
+          <w:shd w:val="clear" w:color="auto" w:fill="FFFFFF"/>
+        </w:rPr>
+        <w:t>方法三</w:t>
+      </w:r>
+      <w:r>
+        <w:rPr>
+          <w:rFonts w:ascii="Arial" w:hAnsi="Arial" w:cs="Arial" w:hint="eastAsia"/>
+          <w:color w:val="333333"/>
+          <w:sz w:val="20"/>
+          <w:szCs w:val="20"/>
+          <w:shd w:val="clear" w:color="auto" w:fill="FFFFFF"/>
+        </w:rPr>
+        <w:t>:</w:t>
+      </w:r>
+      <w:r>
+        <w:rPr>
+          <w:rFonts w:ascii="Arial" w:hAnsi="Arial" w:cs="Arial"/>
+          <w:color w:val="333333"/>
+          <w:sz w:val="20"/>
+          <w:szCs w:val="20"/>
+          <w:shd w:val="clear" w:color="auto" w:fill="FFFFFF"/>
+        </w:rPr>
+        <w:t xml:space="preserve"> </w:t>
+      </w:r>
+      <w:r>
+        <w:rPr>
+          <w:rFonts w:ascii="Arial" w:hAnsi="Arial" w:cs="Arial" w:hint="eastAsia"/>
+          <w:color w:val="333333"/>
+          <w:sz w:val="20"/>
+          <w:szCs w:val="20"/>
+          <w:shd w:val="clear" w:color="auto" w:fill="FFFFFF"/>
+        </w:rPr>
+        <w:t>余弦</w:t>
+      </w:r>
+      <w:r>
+        <w:rPr>
+          <w:rFonts w:ascii="Arial" w:hAnsi="Arial" w:cs="Arial" w:hint="eastAsia"/>
+          <w:color w:val="333333"/>
+          <w:sz w:val="20"/>
+          <w:szCs w:val="20"/>
+          <w:shd w:val="clear" w:color="auto" w:fill="FFFFFF"/>
+        </w:rPr>
+        <w:t xml:space="preserve"> </w:t>
+      </w:r>
+      <w:r>
+        <w:rPr>
+          <w:rFonts w:ascii="Arial" w:hAnsi="Arial" w:cs="Arial" w:hint="eastAsia"/>
+          <w:color w:val="333333"/>
+          <w:sz w:val="20"/>
+          <w:szCs w:val="20"/>
+          <w:shd w:val="clear" w:color="auto" w:fill="FFFFFF"/>
+        </w:rPr>
+        <w:t>相似度</w:t>
+      </w:r>
+      <w:bookmarkStart w:id="5" w:name="_GoBack"/>
+      <w:bookmarkEnd w:id="5"/>
+    </w:p>
+    <w:p>
+      <w:pPr>
+        <w:rPr>
+          <w:rFonts w:ascii="Arial" w:hAnsi="Arial" w:cs="Arial" w:hint="eastAsia"/>
+          <w:color w:val="333333"/>
+          <w:sz w:val="20"/>
+          <w:szCs w:val="20"/>
+          <w:shd w:val="clear" w:color="auto" w:fill="FFFFFF"/>
+        </w:rPr>
+      </w:pPr>
+      <w:r>
+        <w:rPr>
+          <w:rFonts w:ascii="Arial" w:hAnsi="Arial" w:cs="Arial"/>
+          <w:color w:val="333333"/>
+          <w:sz w:val="21"/>
+          <w:szCs w:val="21"/>
+          <w:shd w:val="clear" w:color="auto" w:fill="FFFFFF"/>
+        </w:rPr>
+        <w:t>给定两个属性向量，</w:t>
+      </w:r>
+      <w:r>
+        <w:rPr>
+          <w:rFonts w:ascii="Arial" w:hAnsi="Arial" w:cs="Arial"/>
+          <w:i/>
+          <w:iCs/>
+          <w:color w:val="333333"/>
+          <w:sz w:val="21"/>
+          <w:szCs w:val="21"/>
+          <w:shd w:val="clear" w:color="auto" w:fill="FFFFFF"/>
+        </w:rPr>
+        <w:t>A</w:t>
+      </w:r>
+      <w:r>
+        <w:rPr>
+          <w:rFonts w:ascii="Arial" w:hAnsi="Arial" w:cs="Arial"/>
+          <w:color w:val="333333"/>
+          <w:sz w:val="21"/>
+          <w:szCs w:val="21"/>
+          <w:shd w:val="clear" w:color="auto" w:fill="FFFFFF"/>
+        </w:rPr>
+        <w:t>和</w:t>
+      </w:r>
+      <w:r>
+        <w:rPr>
+          <w:rFonts w:ascii="Arial" w:hAnsi="Arial" w:cs="Arial"/>
+          <w:i/>
+          <w:iCs/>
+          <w:color w:val="333333"/>
+          <w:sz w:val="21"/>
+          <w:szCs w:val="21"/>
+          <w:shd w:val="clear" w:color="auto" w:fill="FFFFFF"/>
+        </w:rPr>
+        <w:t>B</w:t>
+      </w:r>
+      <w:r>
+        <w:rPr>
+          <w:rFonts w:ascii="Arial" w:hAnsi="Arial" w:cs="Arial"/>
+          <w:color w:val="333333"/>
+          <w:sz w:val="21"/>
+          <w:szCs w:val="21"/>
+          <w:shd w:val="clear" w:color="auto" w:fill="FFFFFF"/>
+        </w:rPr>
+        <w:t>，其余弦相似性</w:t>
+      </w:r>
+      <w:r>
+        <w:rPr>
+          <w:rFonts w:ascii="Arial" w:hAnsi="Arial" w:cs="Arial"/>
+          <w:i/>
+          <w:iCs/>
+          <w:color w:val="333333"/>
+          <w:sz w:val="21"/>
+          <w:szCs w:val="21"/>
+          <w:shd w:val="clear" w:color="auto" w:fill="FFFFFF"/>
+        </w:rPr>
+        <w:t>θ</w:t>
+      </w:r>
+      <w:proofErr w:type="gramStart"/>
+      <w:r>
+        <w:rPr>
+          <w:rFonts w:ascii="Arial" w:hAnsi="Arial" w:cs="Arial"/>
+          <w:color w:val="333333"/>
+          <w:sz w:val="21"/>
+          <w:szCs w:val="21"/>
+          <w:shd w:val="clear" w:color="auto" w:fill="FFFFFF"/>
+        </w:rPr>
+        <w:t>由点积和</w:t>
+      </w:r>
+      <w:proofErr w:type="gramEnd"/>
+      <w:r>
+        <w:rPr>
+          <w:rFonts w:ascii="Arial" w:hAnsi="Arial" w:cs="Arial"/>
+          <w:color w:val="333333"/>
+          <w:sz w:val="21"/>
+          <w:szCs w:val="21"/>
+          <w:shd w:val="clear" w:color="auto" w:fill="FFFFFF"/>
+        </w:rPr>
+        <w:t>向量长度给出，如下所示：</w:t>
+      </w:r>
+    </w:p>
+    <w:p>
+      <w:pPr>
+        <w:rPr>
+          <w:rStyle w:val="token"/>
+          <w:rFonts w:ascii="Consolas" w:hAnsi="Consolas" w:hint="eastAsia"/>
+          <w:color w:val="999999"/>
+          <w:sz w:val="21"/>
+          <w:szCs w:val="21"/>
+        </w:rPr>
+      </w:pPr>
+    </w:p>
+    <w:p>
+      <w:pPr>
+        <w:rPr>
+          <w:rFonts w:ascii="Consolas" w:hAnsi="Consolas" w:cs="Consolas"/>
+          <w:color w:val="0066CC"/>
+          <w:kern w:val="0"/>
+          <w:sz w:val="20"/>
+          <w:szCs w:val="20"/>
+          <w:u w:val="single"/>
+        </w:rPr>
+      </w:pPr>
+    </w:p>
+    <w:p>
+      <w:pPr>
+        <w:rPr>
+          <w:rFonts w:ascii="Consolas" w:hAnsi="Consolas" w:cs="Consolas"/>
+          <w:color w:val="0066CC"/>
+          <w:kern w:val="0"/>
+          <w:sz w:val="20"/>
+          <w:szCs w:val="20"/>
+          <w:u w:val="single"/>
+        </w:rPr>
+      </w:pPr>
+      <w:r>
+        <w:rPr>
+          <w:rFonts w:ascii="Consolas" w:hAnsi="Consolas" w:cs="Consolas" w:hint="eastAsia"/>
+          <w:color w:val="0066CC"/>
+          <w:kern w:val="0"/>
+          <w:sz w:val="20"/>
+          <w:szCs w:val="20"/>
+          <w:u w:val="single"/>
+        </w:rPr>
+        <w:t>问题</w:t>
+      </w:r>
+      <w:r>
+        <w:rPr>
+          <w:rFonts w:ascii="Consolas" w:hAnsi="Consolas" w:cs="Consolas" w:hint="eastAsia"/>
+          <w:color w:val="0066CC"/>
+          <w:kern w:val="0"/>
+          <w:sz w:val="20"/>
+          <w:szCs w:val="20"/>
+          <w:u w:val="single"/>
+        </w:rPr>
+        <w:t>4</w:t>
+      </w:r>
+      <w:r>
+        <w:rPr>
+          <w:rFonts w:ascii="Consolas" w:hAnsi="Consolas" w:cs="Consolas" w:hint="eastAsia"/>
+          <w:color w:val="0066CC"/>
+          <w:kern w:val="0"/>
+          <w:sz w:val="20"/>
+          <w:szCs w:val="20"/>
+          <w:u w:val="single"/>
+        </w:rPr>
+        <w:t>怎么</w:t>
+      </w:r>
+      <w:r>
+        <w:rPr>
+          <w:rFonts w:ascii="Consolas" w:hAnsi="Consolas" w:cs="Consolas" w:hint="eastAsia"/>
+          <w:color w:val="0066CC"/>
+          <w:kern w:val="0"/>
+          <w:sz w:val="20"/>
+          <w:szCs w:val="20"/>
+          <w:u w:val="single"/>
+        </w:rPr>
+        <w:t>根据每个粒子的权重，对其重新采样，增加高权重的粒子，减少或剔除低权重粒子</w:t>
+      </w:r>
+      <w:r>
+        <w:rPr>
+          <w:rFonts w:ascii="Consolas" w:hAnsi="Consolas" w:cs="Consolas" w:hint="eastAsia"/>
+          <w:color w:val="0066CC"/>
+          <w:kern w:val="0"/>
+          <w:sz w:val="20"/>
+          <w:szCs w:val="20"/>
+          <w:u w:val="single"/>
+        </w:rPr>
+        <w:t>?</w:t>
+      </w:r>
+    </w:p>
+    <w:p>
+      <w:pPr>
+        <w:rPr>
+          <w:rFonts w:ascii="Consolas" w:hAnsi="Consolas" w:cs="Consolas"/>
+          <w:kern w:val="0"/>
+          <w:sz w:val="20"/>
+          <w:szCs w:val="20"/>
+        </w:rPr>
+      </w:pPr>
+      <w:r>
+        <w:rPr>
+          <w:rFonts w:ascii="Consolas" w:hAnsi="Consolas" w:cs="Consolas" w:hint="eastAsia"/>
+          <w:kern w:val="0"/>
+          <w:sz w:val="20"/>
+          <w:szCs w:val="20"/>
+        </w:rPr>
+        <w:t>思考</w:t>
+      </w:r>
+      <w:r>
+        <w:rPr>
+          <w:rFonts w:ascii="Consolas" w:hAnsi="Consolas" w:cs="Consolas" w:hint="eastAsia"/>
+          <w:kern w:val="0"/>
+          <w:sz w:val="20"/>
+          <w:szCs w:val="20"/>
+        </w:rPr>
+        <w:t>:</w:t>
+      </w:r>
+      <w:r>
+        <w:rPr>
+          <w:rFonts w:ascii="Consolas" w:hAnsi="Consolas" w:cs="Consolas"/>
+          <w:kern w:val="0"/>
+          <w:sz w:val="20"/>
+          <w:szCs w:val="20"/>
+        </w:rPr>
+        <w:t xml:space="preserve">  </w:t>
+      </w:r>
+      <w:r>
+        <w:rPr>
+          <w:rFonts w:ascii="Consolas" w:hAnsi="Consolas" w:cs="Consolas" w:hint="eastAsia"/>
+          <w:kern w:val="0"/>
+          <w:sz w:val="20"/>
+          <w:szCs w:val="20"/>
+        </w:rPr>
+        <w:t>减少的话就排序然后最低权重删除</w:t>
+      </w:r>
+      <w:r>
+        <w:rPr>
+          <w:rFonts w:ascii="Consolas" w:hAnsi="Consolas" w:cs="Consolas" w:hint="eastAsia"/>
+          <w:kern w:val="0"/>
+          <w:sz w:val="20"/>
+          <w:szCs w:val="20"/>
+        </w:rPr>
+        <w:t>,</w:t>
+      </w:r>
+      <w:r>
+        <w:rPr>
+          <w:rFonts w:ascii="Consolas" w:hAnsi="Consolas" w:cs="Consolas"/>
+          <w:kern w:val="0"/>
+          <w:sz w:val="20"/>
+          <w:szCs w:val="20"/>
+        </w:rPr>
+        <w:t xml:space="preserve"> </w:t>
+      </w:r>
+      <w:r>
+        <w:rPr>
+          <w:rFonts w:ascii="Consolas" w:hAnsi="Consolas" w:cs="Consolas" w:hint="eastAsia"/>
+          <w:kern w:val="0"/>
+          <w:sz w:val="20"/>
+          <w:szCs w:val="20"/>
+        </w:rPr>
+        <w:t>那么怎么增加呢</w:t>
+      </w:r>
+      <w:r>
+        <w:rPr>
+          <w:rFonts w:ascii="Consolas" w:hAnsi="Consolas" w:cs="Consolas" w:hint="eastAsia"/>
+          <w:kern w:val="0"/>
+          <w:sz w:val="20"/>
+          <w:szCs w:val="20"/>
+        </w:rPr>
+        <w:t>?</w:t>
+      </w:r>
+    </w:p>
+    <w:p>
+      <w:pPr>
+        <w:rPr>
+          <w:rFonts w:ascii="Consolas" w:hAnsi="Consolas" w:cs="Consolas"/>
+          <w:kern w:val="0"/>
+          <w:sz w:val="20"/>
+          <w:szCs w:val="20"/>
+        </w:rPr>
+      </w:pPr>
+      <w:r>
+        <w:rPr>
+          <w:rFonts w:ascii="Consolas" w:hAnsi="Consolas" w:cs="Consolas" w:hint="eastAsia"/>
+          <w:kern w:val="0"/>
+          <w:sz w:val="20"/>
+          <w:szCs w:val="20"/>
+        </w:rPr>
+        <w:t>就复制一个</w:t>
+      </w:r>
+      <w:r>
+        <w:rPr>
+          <w:rFonts w:ascii="Consolas" w:hAnsi="Consolas" w:cs="Consolas" w:hint="eastAsia"/>
+          <w:kern w:val="0"/>
+          <w:sz w:val="20"/>
+          <w:szCs w:val="20"/>
+        </w:rPr>
+        <w:t>最高权重的粒子</w:t>
+      </w:r>
+      <w:r>
+        <w:rPr>
+          <w:rFonts w:ascii="Consolas" w:hAnsi="Consolas" w:cs="Consolas" w:hint="eastAsia"/>
+          <w:kern w:val="0"/>
+          <w:sz w:val="20"/>
+          <w:szCs w:val="20"/>
+        </w:rPr>
+        <w:t>.</w:t>
+      </w:r>
+      <w:r>
+        <w:rPr>
+          <w:rFonts w:ascii="Tahoma" w:hAnsi="Tahoma" w:cs="Tahoma"/>
+          <w:color w:val="444444"/>
+          <w:sz w:val="21"/>
+          <w:szCs w:val="21"/>
+          <w:shd w:val="clear" w:color="auto" w:fill="FFFFFF"/>
+        </w:rPr>
+        <w:t xml:space="preserve"> </w:t>
+      </w:r>
+      <w:r>
+        <w:rPr>
+          <w:rFonts w:ascii="Tahoma" w:hAnsi="Tahoma" w:cs="Tahoma"/>
+          <w:color w:val="444444"/>
+          <w:sz w:val="21"/>
+          <w:szCs w:val="21"/>
+          <w:shd w:val="clear" w:color="auto" w:fill="FFFFFF"/>
+        </w:rPr>
+        <w:t>这样看</w:t>
+      </w:r>
+      <w:r>
+        <w:rPr>
+          <w:rFonts w:ascii="Tahoma" w:hAnsi="Tahoma" w:cs="Tahoma"/>
+          <w:color w:val="444444"/>
+          <w:sz w:val="21"/>
+          <w:szCs w:val="21"/>
+          <w:shd w:val="clear" w:color="auto" w:fill="FFFFFF"/>
+        </w:rPr>
+        <w:t xml:space="preserve"> </w:t>
+      </w:r>
+      <w:r>
+        <w:rPr>
+          <w:rFonts w:ascii="Tahoma" w:hAnsi="Tahoma" w:cs="Tahoma"/>
+          <w:color w:val="444444"/>
+          <w:sz w:val="21"/>
+          <w:szCs w:val="21"/>
+          <w:shd w:val="clear" w:color="auto" w:fill="FFFFFF"/>
+        </w:rPr>
+        <w:t>如果一个粒子的权值很大</w:t>
+      </w:r>
+      <w:r>
+        <w:rPr>
+          <w:rFonts w:ascii="Tahoma" w:hAnsi="Tahoma" w:cs="Tahoma"/>
+          <w:color w:val="444444"/>
+          <w:sz w:val="21"/>
+          <w:szCs w:val="21"/>
+          <w:shd w:val="clear" w:color="auto" w:fill="FFFFFF"/>
+        </w:rPr>
+        <w:t xml:space="preserve"> </w:t>
+      </w:r>
+      <w:r>
+        <w:rPr>
+          <w:rFonts w:ascii="Tahoma" w:hAnsi="Tahoma" w:cs="Tahoma"/>
+          <w:color w:val="444444"/>
+          <w:sz w:val="21"/>
+          <w:szCs w:val="21"/>
+          <w:shd w:val="clear" w:color="auto" w:fill="FFFFFF"/>
+        </w:rPr>
+        <w:t>当权重求和加到</w:t>
+      </w:r>
+      <w:r>
+        <w:rPr>
+          <w:rFonts w:ascii="Tahoma" w:hAnsi="Tahoma" w:cs="Tahoma"/>
+          <w:color w:val="444444"/>
+          <w:sz w:val="21"/>
+          <w:szCs w:val="21"/>
+          <w:shd w:val="clear" w:color="auto" w:fill="FFFFFF"/>
+        </w:rPr>
+        <w:t>q(</w:t>
+      </w:r>
+      <w:proofErr w:type="spellStart"/>
+      <w:r>
+        <w:rPr>
+          <w:rFonts w:ascii="Tahoma" w:hAnsi="Tahoma" w:cs="Tahoma"/>
+          <w:color w:val="444444"/>
+          <w:sz w:val="21"/>
+          <w:szCs w:val="21"/>
+          <w:shd w:val="clear" w:color="auto" w:fill="FFFFFF"/>
+        </w:rPr>
+        <w:t>i</w:t>
+      </w:r>
+      <w:proofErr w:type="spellEnd"/>
+      <w:r>
+        <w:rPr>
+          <w:rFonts w:ascii="Tahoma" w:hAnsi="Tahoma" w:cs="Tahoma"/>
+          <w:color w:val="444444"/>
+          <w:sz w:val="21"/>
+          <w:szCs w:val="21"/>
+          <w:shd w:val="clear" w:color="auto" w:fill="FFFFFF"/>
+        </w:rPr>
+        <w:t>)</w:t>
+      </w:r>
+      <w:r>
+        <w:rPr>
+          <w:rFonts w:ascii="Tahoma" w:hAnsi="Tahoma" w:cs="Tahoma"/>
+          <w:color w:val="444444"/>
+          <w:sz w:val="21"/>
+          <w:szCs w:val="21"/>
+          <w:shd w:val="clear" w:color="auto" w:fill="FFFFFF"/>
+        </w:rPr>
+        <w:t>这个粒子的时候</w:t>
+      </w:r>
+      <w:r>
+        <w:rPr>
+          <w:rFonts w:ascii="Tahoma" w:hAnsi="Tahoma" w:cs="Tahoma"/>
+          <w:color w:val="444444"/>
+          <w:sz w:val="21"/>
+          <w:szCs w:val="21"/>
+          <w:shd w:val="clear" w:color="auto" w:fill="FFFFFF"/>
+        </w:rPr>
+        <w:t xml:space="preserve"> </w:t>
+      </w:r>
+      <w:r>
+        <w:rPr>
+          <w:rFonts w:ascii="Tahoma" w:hAnsi="Tahoma" w:cs="Tahoma"/>
+          <w:color w:val="444444"/>
+          <w:sz w:val="21"/>
+          <w:szCs w:val="21"/>
+          <w:shd w:val="clear" w:color="auto" w:fill="FFFFFF"/>
+        </w:rPr>
+        <w:t>将在很长时间内大于</w:t>
+      </w:r>
+      <w:r>
+        <w:rPr>
+          <w:rFonts w:ascii="Tahoma" w:hAnsi="Tahoma" w:cs="Tahoma"/>
+          <w:color w:val="444444"/>
+          <w:sz w:val="21"/>
+          <w:szCs w:val="21"/>
+          <w:shd w:val="clear" w:color="auto" w:fill="FFFFFF"/>
+        </w:rPr>
+        <w:t>0-1</w:t>
+      </w:r>
+      <w:r>
+        <w:rPr>
+          <w:rFonts w:ascii="Tahoma" w:hAnsi="Tahoma" w:cs="Tahoma"/>
+          <w:color w:val="444444"/>
+          <w:sz w:val="21"/>
+          <w:szCs w:val="21"/>
+          <w:shd w:val="clear" w:color="auto" w:fill="FFFFFF"/>
+        </w:rPr>
+        <w:t>随机数</w:t>
+      </w:r>
+      <w:r>
+        <w:rPr>
+          <w:rFonts w:ascii="Tahoma" w:hAnsi="Tahoma" w:cs="Tahoma"/>
+          <w:color w:val="444444"/>
+          <w:sz w:val="21"/>
+          <w:szCs w:val="21"/>
+          <w:shd w:val="clear" w:color="auto" w:fill="FFFFFF"/>
+        </w:rPr>
+        <w:t xml:space="preserve"> rand(0</w:t>
+      </w:r>
+      <w:r>
+        <w:rPr>
+          <w:rFonts w:ascii="Tahoma" w:hAnsi="Tahoma" w:cs="Tahoma"/>
+          <w:color w:val="444444"/>
+          <w:sz w:val="21"/>
+          <w:szCs w:val="21"/>
+          <w:shd w:val="clear" w:color="auto" w:fill="FFFFFF"/>
+        </w:rPr>
+        <w:t>，</w:t>
+      </w:r>
+      <w:r>
+        <w:rPr>
+          <w:rFonts w:ascii="Tahoma" w:hAnsi="Tahoma" w:cs="Tahoma"/>
+          <w:color w:val="444444"/>
+          <w:sz w:val="21"/>
+          <w:szCs w:val="21"/>
+          <w:shd w:val="clear" w:color="auto" w:fill="FFFFFF"/>
+        </w:rPr>
+        <w:t xml:space="preserve">1) </w:t>
+      </w:r>
+      <w:r>
+        <w:rPr>
+          <w:rFonts w:ascii="Tahoma" w:hAnsi="Tahoma" w:cs="Tahoma"/>
+          <w:color w:val="444444"/>
+          <w:sz w:val="21"/>
+          <w:szCs w:val="21"/>
+          <w:shd w:val="clear" w:color="auto" w:fill="FFFFFF"/>
+        </w:rPr>
+        <w:t>，当粒子数目较大的时候</w:t>
+      </w:r>
+      <w:r>
+        <w:rPr>
+          <w:rFonts w:ascii="Tahoma" w:hAnsi="Tahoma" w:cs="Tahoma"/>
+          <w:color w:val="444444"/>
+          <w:sz w:val="21"/>
+          <w:szCs w:val="21"/>
+          <w:shd w:val="clear" w:color="auto" w:fill="FFFFFF"/>
+        </w:rPr>
+        <w:t xml:space="preserve"> </w:t>
+      </w:r>
+      <w:r>
+        <w:rPr>
+          <w:rFonts w:ascii="Tahoma" w:hAnsi="Tahoma" w:cs="Tahoma"/>
+          <w:color w:val="444444"/>
+          <w:sz w:val="21"/>
+          <w:szCs w:val="21"/>
+          <w:shd w:val="clear" w:color="auto" w:fill="FFFFFF"/>
+        </w:rPr>
+        <w:t>大权值的粒子就被复制很多次了</w:t>
+      </w:r>
+    </w:p>
+    <w:p>
+      <w:pPr>
+        <w:rPr>
+          <w:rFonts w:ascii="Consolas" w:hAnsi="Consolas" w:cs="Consolas"/>
+          <w:kern w:val="0"/>
+          <w:sz w:val="20"/>
+          <w:szCs w:val="20"/>
+        </w:rPr>
+      </w:pPr>
+    </w:p>
+    <w:p>
+      <w:pPr>
+        <w:rPr>
+          <w:rFonts w:ascii="Consolas" w:hAnsi="Consolas" w:cs="Consolas"/>
+          <w:kern w:val="0"/>
+          <w:sz w:val="20"/>
+          <w:szCs w:val="20"/>
+        </w:rPr>
+      </w:pPr>
+    </w:p>
+    <w:p>
+      <w:pPr>
+        <w:rPr>
+          <w:rFonts w:ascii="Consolas" w:hAnsi="Consolas" w:cs="Consolas"/>
+          <w:color w:val="0066CC"/>
+          <w:kern w:val="0"/>
+          <w:sz w:val="20"/>
+          <w:szCs w:val="20"/>
+          <w:u w:val="single"/>
+        </w:rPr>
+      </w:pPr>
+      <w:r>
+        <w:rPr>
+          <w:rFonts w:ascii="Consolas" w:hAnsi="Consolas" w:cs="Consolas" w:hint="eastAsia"/>
+          <w:color w:val="0066CC"/>
+          <w:kern w:val="0"/>
+          <w:sz w:val="20"/>
+          <w:szCs w:val="20"/>
+          <w:u w:val="single"/>
+        </w:rPr>
+        <w:t>问题</w:t>
+      </w:r>
+      <w:r>
+        <w:rPr>
+          <w:rFonts w:ascii="Consolas" w:hAnsi="Consolas" w:cs="Consolas" w:hint="eastAsia"/>
+          <w:color w:val="0066CC"/>
+          <w:kern w:val="0"/>
+          <w:sz w:val="20"/>
+          <w:szCs w:val="20"/>
+          <w:u w:val="single"/>
+        </w:rPr>
+        <w:t>5</w:t>
+      </w:r>
+      <w:r>
+        <w:rPr>
+          <w:rFonts w:ascii="Consolas" w:hAnsi="Consolas" w:cs="Consolas" w:hint="eastAsia"/>
+          <w:color w:val="0066CC"/>
+          <w:kern w:val="0"/>
+          <w:sz w:val="20"/>
+          <w:szCs w:val="20"/>
+          <w:u w:val="single"/>
+        </w:rPr>
+        <w:t>怎么计算每个的</w:t>
+      </w:r>
+      <w:r>
+        <w:rPr>
+          <w:rFonts w:ascii="Consolas" w:hAnsi="Consolas" w:cs="Consolas" w:hint="eastAsia"/>
+          <w:color w:val="0066CC"/>
+          <w:kern w:val="0"/>
+          <w:sz w:val="20"/>
+          <w:szCs w:val="20"/>
+          <w:u w:val="single"/>
+        </w:rPr>
+        <w:t>Manhattan</w:t>
+      </w:r>
+      <w:r>
+        <w:rPr>
+          <w:rFonts w:ascii="Consolas" w:hAnsi="Consolas" w:cs="Consolas" w:hint="eastAsia"/>
+          <w:color w:val="0066CC"/>
+          <w:kern w:val="0"/>
+          <w:sz w:val="20"/>
+          <w:szCs w:val="20"/>
+          <w:u w:val="single"/>
+        </w:rPr>
+        <w:t>距离？</w:t>
+      </w:r>
+    </w:p>
+    <w:p>
+      <w:pPr>
+        <w:rPr>
+          <w:rFonts w:ascii="Helvetica" w:hAnsi="Helvetica" w:cs="Helvetica"/>
+          <w:color w:val="333333"/>
+          <w:sz w:val="20"/>
+          <w:szCs w:val="20"/>
+          <w:shd w:val="clear" w:color="auto" w:fill="FFFFFF"/>
+        </w:rPr>
+      </w:pPr>
+      <w:r>
+        <w:rPr>
+          <w:rFonts w:ascii="Consolas" w:hAnsi="Consolas" w:cs="Consolas" w:hint="eastAsia"/>
+          <w:color w:val="0066CC"/>
+          <w:kern w:val="0"/>
+          <w:sz w:val="20"/>
+          <w:szCs w:val="20"/>
+          <w:u w:val="single"/>
+        </w:rPr>
+        <w:t>解决方法</w:t>
+      </w:r>
+      <w:r>
+        <w:rPr>
+          <w:rFonts w:ascii="Consolas" w:hAnsi="Consolas" w:cs="Consolas" w:hint="eastAsia"/>
+          <w:color w:val="0066CC"/>
+          <w:kern w:val="0"/>
+          <w:sz w:val="20"/>
+          <w:szCs w:val="20"/>
+          <w:u w:val="single"/>
+        </w:rPr>
+        <w:t>:</w:t>
+      </w:r>
+      <w:r>
+        <w:rPr>
+          <w:rFonts w:ascii="Helvetica" w:hAnsi="Helvetica" w:cs="Helvetica"/>
+          <w:color w:val="333333"/>
+          <w:sz w:val="20"/>
+          <w:szCs w:val="20"/>
+          <w:shd w:val="clear" w:color="auto" w:fill="FFFFFF"/>
+        </w:rPr>
+        <w:t xml:space="preserve"> </w:t>
+      </w:r>
     </w:p>
     <w:p>
       <w:pPr>
@@ -4057,403 +4346,6 @@
         </w:tabs>
         <w:jc w:val="left"/>
         <w:rPr>
-          <w:rFonts w:ascii="微软雅黑" w:eastAsia="微软雅黑" w:hAnsi="微软雅黑" w:cs="Courier New"/>
-          <w:kern w:val="0"/>
-          <w:sz w:val="18"/>
-          <w:szCs w:val="20"/>
-        </w:rPr>
-      </w:pPr>
-      <w:r>
-        <w:rPr>
-          <w:rFonts w:ascii="微软雅黑" w:eastAsia="微软雅黑" w:hAnsi="微软雅黑" w:cs="Courier New" w:hint="eastAsia"/>
-          <w:kern w:val="0"/>
-          <w:sz w:val="18"/>
-          <w:szCs w:val="20"/>
-        </w:rPr>
-        <w:t>#对于其他方法</w:t>
-      </w:r>
-      <w:proofErr w:type="spellStart"/>
-      <w:r>
-        <w:rPr>
-          <w:rFonts w:ascii="微软雅黑" w:eastAsia="微软雅黑" w:hAnsi="微软雅黑" w:cs="Courier New" w:hint="eastAsia"/>
-          <w:kern w:val="0"/>
-          <w:sz w:val="18"/>
-          <w:szCs w:val="20"/>
-        </w:rPr>
-        <w:t>max_val</w:t>
-      </w:r>
-      <w:proofErr w:type="spellEnd"/>
-      <w:r>
-        <w:rPr>
-          <w:rFonts w:ascii="微软雅黑" w:eastAsia="微软雅黑" w:hAnsi="微软雅黑" w:cs="Courier New" w:hint="eastAsia"/>
-          <w:kern w:val="0"/>
-          <w:sz w:val="18"/>
-          <w:szCs w:val="20"/>
-        </w:rPr>
-        <w:t>越趋近于1匹配度越好，匹配位置取</w:t>
-      </w:r>
-      <w:proofErr w:type="spellStart"/>
-      <w:r>
-        <w:rPr>
-          <w:rFonts w:ascii="微软雅黑" w:eastAsia="微软雅黑" w:hAnsi="微软雅黑" w:cs="Courier New" w:hint="eastAsia"/>
-          <w:kern w:val="0"/>
-          <w:sz w:val="18"/>
-          <w:szCs w:val="20"/>
-        </w:rPr>
-        <w:t>max_loc</w:t>
-      </w:r>
-      <w:proofErr w:type="spellEnd"/>
-    </w:p>
-    <w:p>
-      <w:pPr>
-        <w:rPr>
-          <w:rStyle w:val="token"/>
-          <w:rFonts w:ascii="Consolas" w:hAnsi="Consolas"/>
-          <w:color w:val="999999"/>
-          <w:sz w:val="21"/>
-          <w:szCs w:val="21"/>
-        </w:rPr>
-      </w:pPr>
-    </w:p>
-    <w:p>
-      <w:pPr>
-        <w:rPr>
-          <w:rFonts w:ascii="Consolas" w:hAnsi="Consolas" w:cs="Consolas" w:hint="eastAsia"/>
-          <w:color w:val="0066CC"/>
-          <w:kern w:val="0"/>
-          <w:sz w:val="20"/>
-          <w:szCs w:val="20"/>
-          <w:u w:val="single"/>
-        </w:rPr>
-      </w:pPr>
-    </w:p>
-    <w:p>
-      <w:pPr>
-        <w:rPr>
-          <w:rFonts w:ascii="Consolas" w:hAnsi="Consolas" w:cs="Consolas"/>
-          <w:color w:val="0066CC"/>
-          <w:kern w:val="0"/>
-          <w:sz w:val="20"/>
-          <w:szCs w:val="20"/>
-          <w:u w:val="single"/>
-        </w:rPr>
-      </w:pPr>
-      <w:r>
-        <w:rPr>
-          <w:rFonts w:ascii="Consolas" w:hAnsi="Consolas" w:cs="Consolas" w:hint="eastAsia"/>
-          <w:color w:val="0066CC"/>
-          <w:kern w:val="0"/>
-          <w:sz w:val="20"/>
-          <w:szCs w:val="20"/>
-          <w:u w:val="single"/>
-        </w:rPr>
-        <w:t>问题</w:t>
-      </w:r>
-      <w:r>
-        <w:rPr>
-          <w:rFonts w:ascii="Consolas" w:hAnsi="Consolas" w:cs="Consolas" w:hint="eastAsia"/>
-          <w:color w:val="0066CC"/>
-          <w:kern w:val="0"/>
-          <w:sz w:val="20"/>
-          <w:szCs w:val="20"/>
-          <w:u w:val="single"/>
-        </w:rPr>
-        <w:t>4</w:t>
-      </w:r>
-      <w:r>
-        <w:rPr>
-          <w:rFonts w:ascii="Consolas" w:hAnsi="Consolas" w:cs="Consolas" w:hint="eastAsia"/>
-          <w:color w:val="0066CC"/>
-          <w:kern w:val="0"/>
-          <w:sz w:val="20"/>
-          <w:szCs w:val="20"/>
-          <w:u w:val="single"/>
-        </w:rPr>
-        <w:t>怎么探索每个</w:t>
-      </w:r>
-      <w:r>
-        <w:rPr>
-          <w:rFonts w:ascii="Consolas" w:hAnsi="Consolas" w:cs="Consolas" w:hint="eastAsia"/>
-          <w:color w:val="0066CC"/>
-          <w:kern w:val="0"/>
-          <w:sz w:val="20"/>
-          <w:szCs w:val="20"/>
-          <w:u w:val="single"/>
-        </w:rPr>
-        <w:t>state</w:t>
-      </w:r>
-      <w:r>
-        <w:rPr>
-          <w:rFonts w:ascii="Consolas" w:hAnsi="Consolas" w:cs="Consolas" w:hint="eastAsia"/>
-          <w:color w:val="0066CC"/>
-          <w:kern w:val="0"/>
-          <w:sz w:val="20"/>
-          <w:szCs w:val="20"/>
-          <w:u w:val="single"/>
-        </w:rPr>
-        <w:t>？</w:t>
-      </w:r>
-    </w:p>
-    <w:p>
-      <w:pPr>
-        <w:widowControl/>
-        <w:shd w:val="clear" w:color="auto" w:fill="2B2B2B"/>
-        <w:tabs>
-          <w:tab w:val="left" w:pos="916"/>
-          <w:tab w:val="left" w:pos="1832"/>
-          <w:tab w:val="left" w:pos="2748"/>
-          <w:tab w:val="left" w:pos="3664"/>
-          <w:tab w:val="left" w:pos="4580"/>
-          <w:tab w:val="left" w:pos="5496"/>
-          <w:tab w:val="left" w:pos="6412"/>
-          <w:tab w:val="left" w:pos="7328"/>
-          <w:tab w:val="left" w:pos="8244"/>
-          <w:tab w:val="left" w:pos="9160"/>
-          <w:tab w:val="left" w:pos="10076"/>
-          <w:tab w:val="left" w:pos="10992"/>
-          <w:tab w:val="left" w:pos="11908"/>
-          <w:tab w:val="left" w:pos="12824"/>
-          <w:tab w:val="left" w:pos="13740"/>
-          <w:tab w:val="left" w:pos="14656"/>
-        </w:tabs>
-        <w:jc w:val="left"/>
-        <w:rPr>
-          <w:rFonts w:ascii="Courier New" w:hAnsi="Courier New" w:cs="Courier New"/>
-          <w:color w:val="A9B7C6"/>
-          <w:kern w:val="0"/>
-          <w:sz w:val="21"/>
-          <w:szCs w:val="30"/>
-        </w:rPr>
-      </w:pPr>
-      <w:r>
-        <w:rPr>
-          <w:rFonts w:ascii="Courier New" w:hAnsi="Courier New" w:cs="Courier New"/>
-          <w:color w:val="A9B7C6"/>
-          <w:kern w:val="0"/>
-          <w:sz w:val="21"/>
-          <w:szCs w:val="30"/>
-        </w:rPr>
-        <w:t>s</w:t>
-      </w:r>
-      <w:proofErr w:type="gramStart"/>
-      <w:r>
-        <w:rPr>
-          <w:rFonts w:ascii="Courier New" w:hAnsi="Courier New" w:cs="Courier New"/>
-          <w:color w:val="A9B7C6"/>
-          <w:kern w:val="0"/>
-          <w:sz w:val="21"/>
-          <w:szCs w:val="30"/>
-        </w:rPr>
-        <w:t>1.state</w:t>
-      </w:r>
-      <w:proofErr w:type="gramEnd"/>
-      <w:r>
-        <w:rPr>
-          <w:rFonts w:ascii="Courier New" w:hAnsi="Courier New" w:cs="Courier New"/>
-          <w:color w:val="A9B7C6"/>
-          <w:kern w:val="0"/>
-          <w:sz w:val="21"/>
-          <w:szCs w:val="30"/>
-        </w:rPr>
-        <w:t xml:space="preserve"> =</w:t>
-      </w:r>
-    </w:p>
-    <w:p>
-      <w:pPr>
-        <w:rPr>
-          <w:rFonts w:ascii="Consolas" w:hAnsi="Consolas" w:cs="Consolas"/>
-          <w:color w:val="FF0000"/>
-          <w:kern w:val="0"/>
-          <w:sz w:val="20"/>
-          <w:szCs w:val="20"/>
-        </w:rPr>
-      </w:pPr>
-      <w:r>
-        <w:rPr>
-          <w:rFonts w:ascii="Consolas" w:hAnsi="Consolas" w:cs="Consolas" w:hint="eastAsia"/>
-          <w:color w:val="FF0000"/>
-          <w:kern w:val="0"/>
-          <w:sz w:val="20"/>
-          <w:szCs w:val="20"/>
-        </w:rPr>
-        <w:t>这样可能会出错。一开始</w:t>
-      </w:r>
-      <w:r>
-        <w:rPr>
-          <w:rFonts w:ascii="Consolas" w:hAnsi="Consolas" w:cs="Consolas" w:hint="eastAsia"/>
-          <w:color w:val="FF0000"/>
-          <w:kern w:val="0"/>
-          <w:sz w:val="20"/>
-          <w:szCs w:val="20"/>
-        </w:rPr>
-        <w:t>new</w:t>
-      </w:r>
-      <w:r>
-        <w:rPr>
-          <w:rFonts w:ascii="Consolas" w:hAnsi="Consolas" w:cs="Consolas" w:hint="eastAsia"/>
-          <w:color w:val="FF0000"/>
-          <w:kern w:val="0"/>
-          <w:sz w:val="20"/>
-          <w:szCs w:val="20"/>
-        </w:rPr>
-        <w:t>一个对象</w:t>
-      </w:r>
-      <w:r>
-        <w:rPr>
-          <w:rFonts w:ascii="Consolas" w:hAnsi="Consolas" w:cs="Consolas" w:hint="eastAsia"/>
-          <w:color w:val="FF0000"/>
-          <w:kern w:val="0"/>
-          <w:sz w:val="20"/>
-          <w:szCs w:val="20"/>
-        </w:rPr>
-        <w:t>然后赋值可以不可以。</w:t>
-      </w:r>
-    </w:p>
-    <w:p>
-      <w:pPr>
-        <w:rPr>
-          <w:rFonts w:ascii="Consolas" w:hAnsi="Consolas" w:cs="Consolas"/>
-          <w:color w:val="FF0000"/>
-          <w:kern w:val="0"/>
-          <w:sz w:val="20"/>
-          <w:szCs w:val="20"/>
-        </w:rPr>
-      </w:pPr>
-    </w:p>
-    <w:p>
-      <w:pPr>
-        <w:rPr>
-          <w:rFonts w:ascii="Consolas" w:hAnsi="Consolas" w:cs="Consolas"/>
-          <w:color w:val="0066CC"/>
-          <w:kern w:val="0"/>
-          <w:sz w:val="20"/>
-          <w:szCs w:val="20"/>
-          <w:u w:val="single"/>
-        </w:rPr>
-      </w:pPr>
-      <w:r>
-        <w:rPr>
-          <w:rFonts w:ascii="Consolas" w:hAnsi="Consolas" w:cs="Consolas" w:hint="eastAsia"/>
-          <w:color w:val="0066CC"/>
-          <w:kern w:val="0"/>
-          <w:sz w:val="20"/>
-          <w:szCs w:val="20"/>
-          <w:u w:val="single"/>
-        </w:rPr>
-        <w:t>问题</w:t>
-      </w:r>
-      <w:r>
-        <w:rPr>
-          <w:rFonts w:ascii="Consolas" w:hAnsi="Consolas" w:cs="Consolas" w:hint="eastAsia"/>
-          <w:color w:val="0066CC"/>
-          <w:kern w:val="0"/>
-          <w:sz w:val="20"/>
-          <w:szCs w:val="20"/>
-          <w:u w:val="single"/>
-        </w:rPr>
-        <w:t>5</w:t>
-      </w:r>
-      <w:r>
-        <w:rPr>
-          <w:rFonts w:ascii="Consolas" w:hAnsi="Consolas" w:cs="Consolas" w:hint="eastAsia"/>
-          <w:color w:val="0066CC"/>
-          <w:kern w:val="0"/>
-          <w:sz w:val="20"/>
-          <w:szCs w:val="20"/>
-          <w:u w:val="single"/>
-        </w:rPr>
-        <w:t>怎么计算每个的</w:t>
-      </w:r>
-      <w:r>
-        <w:rPr>
-          <w:rFonts w:ascii="Consolas" w:hAnsi="Consolas" w:cs="Consolas" w:hint="eastAsia"/>
-          <w:color w:val="0066CC"/>
-          <w:kern w:val="0"/>
-          <w:sz w:val="20"/>
-          <w:szCs w:val="20"/>
-          <w:u w:val="single"/>
-        </w:rPr>
-        <w:t>Manhattan</w:t>
-      </w:r>
-      <w:r>
-        <w:rPr>
-          <w:rFonts w:ascii="Consolas" w:hAnsi="Consolas" w:cs="Consolas" w:hint="eastAsia"/>
-          <w:color w:val="0066CC"/>
-          <w:kern w:val="0"/>
-          <w:sz w:val="20"/>
-          <w:szCs w:val="20"/>
-          <w:u w:val="single"/>
-        </w:rPr>
-        <w:t>距离？</w:t>
-      </w:r>
-    </w:p>
-    <w:p>
-      <w:pPr>
-        <w:rPr>
-          <w:rFonts w:ascii="Helvetica" w:hAnsi="Helvetica" w:cs="Helvetica"/>
-          <w:color w:val="333333"/>
-          <w:sz w:val="20"/>
-          <w:szCs w:val="20"/>
-          <w:shd w:val="clear" w:color="auto" w:fill="FFFFFF"/>
-        </w:rPr>
-      </w:pPr>
-      <w:r>
-        <w:rPr>
-          <w:rFonts w:ascii="Consolas" w:hAnsi="Consolas" w:cs="Consolas" w:hint="eastAsia"/>
-          <w:color w:val="0066CC"/>
-          <w:kern w:val="0"/>
-          <w:sz w:val="20"/>
-          <w:szCs w:val="20"/>
-          <w:u w:val="single"/>
-        </w:rPr>
-        <w:t>解决方法</w:t>
-      </w:r>
-      <w:r>
-        <w:rPr>
-          <w:rFonts w:ascii="Consolas" w:hAnsi="Consolas" w:cs="Consolas" w:hint="eastAsia"/>
-          <w:color w:val="0066CC"/>
-          <w:kern w:val="0"/>
-          <w:sz w:val="20"/>
-          <w:szCs w:val="20"/>
-          <w:u w:val="single"/>
-        </w:rPr>
-        <w:t>:</w:t>
-      </w:r>
-      <w:r>
-        <w:rPr>
-          <w:rFonts w:ascii="Helvetica" w:hAnsi="Helvetica" w:cs="Helvetica"/>
-          <w:color w:val="333333"/>
-          <w:sz w:val="20"/>
-          <w:szCs w:val="20"/>
-          <w:shd w:val="clear" w:color="auto" w:fill="FFFFFF"/>
-        </w:rPr>
-        <w:t xml:space="preserve"> </w:t>
-      </w:r>
-    </w:p>
-    <w:p>
-      <w:pPr>
-        <w:widowControl/>
-        <w:shd w:val="clear" w:color="auto" w:fill="2B2B2B"/>
-        <w:tabs>
-          <w:tab w:val="left" w:pos="916"/>
-          <w:tab w:val="left" w:pos="1832"/>
-          <w:tab w:val="left" w:pos="2748"/>
-          <w:tab w:val="left" w:pos="3664"/>
-          <w:tab w:val="left" w:pos="4580"/>
-          <w:tab w:val="left" w:pos="5496"/>
-          <w:tab w:val="left" w:pos="6412"/>
-          <w:tab w:val="left" w:pos="7328"/>
-          <w:tab w:val="left" w:pos="8244"/>
-          <w:tab w:val="left" w:pos="9160"/>
-          <w:tab w:val="left" w:pos="10076"/>
-          <w:tab w:val="left" w:pos="10992"/>
-          <w:tab w:val="left" w:pos="11908"/>
-          <w:tab w:val="left" w:pos="12824"/>
-          <w:tab w:val="left" w:pos="13740"/>
-          <w:tab w:val="left" w:pos="14656"/>
-        </w:tabs>
-        <w:jc w:val="left"/>
-        <w:rPr>
           <w:rFonts w:ascii="Courier New" w:hAnsi="Courier New" w:cs="Courier New"/>
           <w:color w:val="A9B7C6"/>
           <w:kern w:val="0"/>
@@ -5797,8 +5689,82 @@
           <w:szCs w:val="20"/>
           <w:shd w:val="clear" w:color="auto" w:fill="FFFFFF"/>
         </w:rPr>
+        <w:t>ValueError</w:t>
+      </w:r>
+      <w:proofErr w:type="spellEnd"/>
+      <w:r>
+        <w:rPr>
+          <w:rFonts w:ascii="Arial" w:hAnsi="Arial" w:cs="Arial"/>
+          <w:color w:val="333333"/>
+          <w:sz w:val="20"/>
+          <w:szCs w:val="20"/>
+          <w:shd w:val="clear" w:color="auto" w:fill="FFFFFF"/>
+        </w:rPr>
+        <w:t>: operands could not be broadcast together with shapes (2,4) (1,2)</w:t>
+      </w:r>
+    </w:p>
+    <w:p>
+      <w:pPr>
+        <w:rPr>
+          <w:rFonts w:ascii="Arial" w:hAnsi="Arial" w:cs="Arial"/>
+          <w:color w:val="333333"/>
+          <w:sz w:val="20"/>
+          <w:szCs w:val="20"/>
+          <w:shd w:val="clear" w:color="auto" w:fill="FFFFFF"/>
+        </w:rPr>
+      </w:pPr>
+      <w:r>
+        <w:rPr>
+          <w:rFonts w:ascii="Arial" w:hAnsi="Arial" w:cs="Arial" w:hint="eastAsia"/>
+          <w:color w:val="333333"/>
+          <w:sz w:val="20"/>
+          <w:szCs w:val="20"/>
+          <w:highlight w:val="yellow"/>
+          <w:shd w:val="clear" w:color="auto" w:fill="FFFFFF"/>
+        </w:rPr>
         <w:lastRenderedPageBreak/>
-        <w:t>ValueError</w:t>
+        <w:t>原因</w:t>
+      </w:r>
+      <w:r>
+        <w:rPr>
+          <w:rFonts w:ascii="Arial" w:hAnsi="Arial" w:cs="Arial" w:hint="eastAsia"/>
+          <w:color w:val="333333"/>
+          <w:sz w:val="20"/>
+          <w:szCs w:val="20"/>
+          <w:shd w:val="clear" w:color="auto" w:fill="FFFFFF"/>
+        </w:rPr>
+        <w:t>:</w:t>
+      </w:r>
+      <w:r>
+        <w:rPr>
+          <w:rFonts w:ascii="Arial" w:hAnsi="Arial" w:cs="Arial"/>
+          <w:color w:val="333333"/>
+          <w:sz w:val="20"/>
+          <w:szCs w:val="20"/>
+          <w:shd w:val="clear" w:color="auto" w:fill="FFFFFF"/>
+        </w:rPr>
+        <w:t xml:space="preserve"> </w:t>
+      </w:r>
+      <w:r>
+        <w:rPr>
+          <w:rFonts w:ascii="Arial" w:hAnsi="Arial" w:cs="Arial"/>
+          <w:color w:val="333333"/>
+          <w:sz w:val="20"/>
+          <w:szCs w:val="20"/>
+          <w:shd w:val="clear" w:color="auto" w:fill="FFFFFF"/>
+        </w:rPr>
+        <w:t>这个加法是不是不能用于</w:t>
+      </w:r>
+      <w:proofErr w:type="spellStart"/>
+      <w:r>
+        <w:rPr>
+          <w:rFonts w:ascii="Arial" w:hAnsi="Arial" w:cs="Arial"/>
+          <w:color w:val="333333"/>
+          <w:sz w:val="20"/>
+          <w:szCs w:val="20"/>
+          <w:shd w:val="clear" w:color="auto" w:fill="FFFFFF"/>
+        </w:rPr>
+        <w:t>numpy</w:t>
       </w:r>
       <w:proofErr w:type="spellEnd"/>
       <w:r>
@@ -5809,11 +5775,9 @@
           <w:szCs w:val="20"/>
           <w:shd w:val="clear" w:color="auto" w:fill="FFFFFF"/>
         </w:rPr>
-        <w:t>: operands could not be broadcast together with shapes (2,4) (1,2)</w:t>
-      </w:r>
-    </w:p>
-    <w:p>
-      <w:pPr>
+        <w:t>的</w:t>
+      </w:r>
+      <w:r>
         <w:rPr>
           <w:rFonts w:ascii="Arial" w:hAnsi="Arial" w:cs="Arial"/>
           <w:color w:val="333333"/>
@@ -5821,6 +5785,70 @@
           <w:szCs w:val="20"/>
           <w:shd w:val="clear" w:color="auto" w:fill="FFFFFF"/>
         </w:rPr>
+        <w:t xml:space="preserve">array, </w:t>
+      </w:r>
+      <w:proofErr w:type="spellStart"/>
+      <w:r>
+        <w:rPr>
+          <w:rFonts w:ascii="Arial" w:hAnsi="Arial" w:cs="Arial"/>
+          <w:color w:val="333333"/>
+          <w:sz w:val="20"/>
+          <w:szCs w:val="20"/>
+          <w:shd w:val="clear" w:color="auto" w:fill="FFFFFF"/>
+        </w:rPr>
+        <w:t>numpy.zeros</w:t>
+      </w:r>
+      <w:proofErr w:type="spellEnd"/>
+      <w:r>
+        <w:rPr>
+          <w:rFonts w:ascii="Arial" w:hAnsi="Arial" w:cs="Arial"/>
+          <w:color w:val="333333"/>
+          <w:sz w:val="20"/>
+          <w:szCs w:val="20"/>
+          <w:shd w:val="clear" w:color="auto" w:fill="FFFFFF"/>
+        </w:rPr>
+        <w:t xml:space="preserve">, </w:t>
+      </w:r>
+      <w:r>
+        <w:rPr>
+          <w:rFonts w:ascii="Arial" w:hAnsi="Arial" w:cs="Arial"/>
+          <w:color w:val="333333"/>
+          <w:sz w:val="20"/>
+          <w:szCs w:val="20"/>
+          <w:shd w:val="clear" w:color="auto" w:fill="FFFFFF"/>
+        </w:rPr>
+        <w:t>和</w:t>
+      </w:r>
+      <w:r>
+        <w:rPr>
+          <w:rFonts w:ascii="Arial" w:hAnsi="Arial" w:cs="Arial"/>
+          <w:color w:val="333333"/>
+          <w:sz w:val="20"/>
+          <w:szCs w:val="20"/>
+          <w:shd w:val="clear" w:color="auto" w:fill="FFFFFF"/>
+        </w:rPr>
+        <w:t>list</w:t>
+      </w:r>
+      <w:r>
+        <w:rPr>
+          <w:rFonts w:ascii="Arial" w:hAnsi="Arial" w:cs="Arial"/>
+          <w:color w:val="333333"/>
+          <w:sz w:val="20"/>
+          <w:szCs w:val="20"/>
+          <w:shd w:val="clear" w:color="auto" w:fill="FFFFFF"/>
+        </w:rPr>
+        <w:t>不一样</w:t>
+      </w:r>
+    </w:p>
+    <w:p>
+      <w:pPr>
+        <w:rPr>
+          <w:rFonts w:ascii="Arial" w:hAnsi="Arial" w:cs="Arial"/>
+          <w:color w:val="333333"/>
+          <w:sz w:val="20"/>
+          <w:szCs w:val="20"/>
+          <w:shd w:val="clear" w:color="auto" w:fill="FFFFFF"/>
+        </w:rPr>
       </w:pPr>
       <w:r>
         <w:rPr>
@@ -5828,10 +5856,81 @@
           <w:color w:val="333333"/>
           <w:sz w:val="20"/>
           <w:szCs w:val="20"/>
+          <w:shd w:val="clear" w:color="auto" w:fill="FFFFFF"/>
+        </w:rPr>
+        <w:t>4</w:t>
+      </w:r>
+      <w:r>
+        <w:rPr>
+          <w:rFonts w:ascii="Arial" w:hAnsi="Arial" w:cs="Arial"/>
+          <w:color w:val="333333"/>
+          <w:sz w:val="20"/>
+          <w:szCs w:val="20"/>
+          <w:shd w:val="clear" w:color="auto" w:fill="FFFFFF"/>
+        </w:rPr>
+        <w:t>:4</w:t>
+      </w:r>
+      <w:r>
+        <w:rPr>
+          <w:rFonts w:ascii="Arial" w:hAnsi="Arial" w:cs="Arial" w:hint="eastAsia"/>
+          <w:color w:val="333333"/>
+          <w:sz w:val="20"/>
+          <w:szCs w:val="20"/>
+          <w:shd w:val="clear" w:color="auto" w:fill="FFFFFF"/>
+        </w:rPr>
+        <w:t>有问题</w:t>
+      </w:r>
+      <w:r>
+        <w:rPr>
+          <w:rFonts w:ascii="Arial" w:hAnsi="Arial" w:cs="Arial" w:hint="eastAsia"/>
+          <w:color w:val="333333"/>
+          <w:sz w:val="20"/>
+          <w:szCs w:val="20"/>
+          <w:shd w:val="clear" w:color="auto" w:fill="FFFFFF"/>
+        </w:rPr>
+        <w:t>,</w:t>
+      </w:r>
+      <w:r>
+        <w:rPr>
+          <w:rFonts w:ascii="Arial" w:hAnsi="Arial" w:cs="Arial"/>
+          <w:color w:val="333333"/>
+          <w:sz w:val="20"/>
+          <w:szCs w:val="20"/>
+          <w:shd w:val="clear" w:color="auto" w:fill="FFFFFF"/>
+        </w:rPr>
+        <w:t xml:space="preserve"> 3:3</w:t>
+      </w:r>
+      <w:r>
+        <w:rPr>
+          <w:rFonts w:ascii="Arial" w:hAnsi="Arial" w:cs="Arial" w:hint="eastAsia"/>
+          <w:color w:val="333333"/>
+          <w:sz w:val="20"/>
+          <w:szCs w:val="20"/>
+          <w:shd w:val="clear" w:color="auto" w:fill="FFFFFF"/>
+        </w:rPr>
+        <w:t>没问题</w:t>
+      </w:r>
+    </w:p>
+    <w:p>
+      <w:pPr>
+        <w:rPr>
+          <w:rFonts w:ascii="Arial" w:hAnsi="Arial" w:cs="Arial"/>
+          <w:color w:val="333333"/>
+          <w:sz w:val="20"/>
+          <w:szCs w:val="20"/>
+          <w:shd w:val="clear" w:color="auto" w:fill="FFFFFF"/>
+        </w:rPr>
+      </w:pPr>
+      <w:r>
+        <w:rPr>
+          <w:rFonts w:ascii="Arial" w:hAnsi="Arial" w:cs="Arial" w:hint="eastAsia"/>
+          <w:color w:val="333333"/>
+          <w:sz w:val="20"/>
+          <w:szCs w:val="20"/>
           <w:highlight w:val="yellow"/>
           <w:shd w:val="clear" w:color="auto" w:fill="FFFFFF"/>
         </w:rPr>
-        <w:t>原因</w:t>
+        <w:t>解决方法</w:t>
       </w:r>
       <w:r>
         <w:rPr>
@@ -5841,9 +5940,43 @@
           <w:szCs w:val="20"/>
           <w:shd w:val="clear" w:color="auto" w:fill="FFFFFF"/>
         </w:rPr>
-        <w:t>:</w:t>
-      </w:r>
-      <w:r>
+        <w:t xml:space="preserve">: </w:t>
+      </w:r>
+      <w:r>
+        <w:rPr>
+          <w:rFonts w:ascii="Arial" w:hAnsi="Arial" w:cs="Arial" w:hint="eastAsia"/>
+          <w:color w:val="333333"/>
+          <w:sz w:val="20"/>
+          <w:szCs w:val="20"/>
+          <w:shd w:val="clear" w:color="auto" w:fill="FFFFFF"/>
+        </w:rPr>
+        <w:t>调用它的</w:t>
+      </w:r>
+      <w:proofErr w:type="spellStart"/>
+      <w:r>
+        <w:rPr>
+          <w:rFonts w:ascii="Arial" w:hAnsi="Arial" w:cs="Arial" w:hint="eastAsia"/>
+          <w:color w:val="333333"/>
+          <w:sz w:val="20"/>
+          <w:szCs w:val="20"/>
+          <w:shd w:val="clear" w:color="auto" w:fill="FFFFFF"/>
+        </w:rPr>
+        <w:t>oncemove</w:t>
+      </w:r>
+      <w:proofErr w:type="spellEnd"/>
+      <w:r>
+        <w:rPr>
+          <w:rFonts w:ascii="Arial" w:hAnsi="Arial" w:cs="Arial" w:hint="eastAsia"/>
+          <w:color w:val="333333"/>
+          <w:sz w:val="20"/>
+          <w:szCs w:val="20"/>
+          <w:shd w:val="clear" w:color="auto" w:fill="FFFFFF"/>
+        </w:rPr>
+        <w:t>函数</w:t>
+      </w:r>
+    </w:p>
+    <w:p>
+      <w:pPr>
         <w:rPr>
           <w:rFonts w:ascii="Arial" w:hAnsi="Arial" w:cs="Arial"/>
           <w:color w:val="333333"/>
@@ -5851,738 +5984,10 @@
           <w:szCs w:val="20"/>
           <w:shd w:val="clear" w:color="auto" w:fill="FFFFFF"/>
         </w:rPr>
-        <w:t xml:space="preserve"> </w:t>
-      </w:r>
-      <w:r>
-        <w:rPr>
-          <w:rFonts w:ascii="Arial" w:hAnsi="Arial" w:cs="Arial"/>
-          <w:color w:val="333333"/>
-          <w:sz w:val="20"/>
-          <w:szCs w:val="20"/>
-          <w:shd w:val="clear" w:color="auto" w:fill="FFFFFF"/>
-        </w:rPr>
-        <w:t>这个加法是不是不能用于</w:t>
-      </w:r>
-      <w:proofErr w:type="spellStart"/>
-      <w:r>
-        <w:rPr>
-          <w:rFonts w:ascii="Arial" w:hAnsi="Arial" w:cs="Arial"/>
-          <w:color w:val="333333"/>
-          <w:sz w:val="20"/>
-          <w:szCs w:val="20"/>
-          <w:shd w:val="clear" w:color="auto" w:fill="FFFFFF"/>
-        </w:rPr>
-        <w:t>numpy</w:t>
-      </w:r>
-      <w:proofErr w:type="spellEnd"/>
-      <w:r>
-        <w:rPr>
-          <w:rFonts w:ascii="Arial" w:hAnsi="Arial" w:cs="Arial"/>
-          <w:color w:val="333333"/>
-          <w:sz w:val="20"/>
-          <w:szCs w:val="20"/>
-          <w:shd w:val="clear" w:color="auto" w:fill="FFFFFF"/>
-        </w:rPr>
-        <w:t>的</w:t>
-      </w:r>
-      <w:r>
-        <w:rPr>
-          <w:rFonts w:ascii="Arial" w:hAnsi="Arial" w:cs="Arial"/>
-          <w:color w:val="333333"/>
-          <w:sz w:val="20"/>
-          <w:szCs w:val="20"/>
-          <w:shd w:val="clear" w:color="auto" w:fill="FFFFFF"/>
-        </w:rPr>
-        <w:t xml:space="preserve">array, </w:t>
-      </w:r>
-      <w:proofErr w:type="spellStart"/>
-      <w:r>
-        <w:rPr>
-          <w:rFonts w:ascii="Arial" w:hAnsi="Arial" w:cs="Arial"/>
-          <w:color w:val="333333"/>
-          <w:sz w:val="20"/>
-          <w:szCs w:val="20"/>
-          <w:shd w:val="clear" w:color="auto" w:fill="FFFFFF"/>
-        </w:rPr>
-        <w:t>numpy.zeros</w:t>
-      </w:r>
-      <w:proofErr w:type="spellEnd"/>
-      <w:r>
-        <w:rPr>
-          <w:rFonts w:ascii="Arial" w:hAnsi="Arial" w:cs="Arial"/>
-          <w:color w:val="333333"/>
-          <w:sz w:val="20"/>
-          <w:szCs w:val="20"/>
-          <w:shd w:val="clear" w:color="auto" w:fill="FFFFFF"/>
-        </w:rPr>
-        <w:t xml:space="preserve">, </w:t>
-      </w:r>
-      <w:r>
-        <w:rPr>
-          <w:rFonts w:ascii="Arial" w:hAnsi="Arial" w:cs="Arial"/>
-          <w:color w:val="333333"/>
-          <w:sz w:val="20"/>
-          <w:szCs w:val="20"/>
-          <w:shd w:val="clear" w:color="auto" w:fill="FFFFFF"/>
-        </w:rPr>
-        <w:t>和</w:t>
-      </w:r>
-      <w:r>
-        <w:rPr>
-          <w:rFonts w:ascii="Arial" w:hAnsi="Arial" w:cs="Arial"/>
-          <w:color w:val="333333"/>
-          <w:sz w:val="20"/>
-          <w:szCs w:val="20"/>
-          <w:shd w:val="clear" w:color="auto" w:fill="FFFFFF"/>
-        </w:rPr>
-        <w:t>list</w:t>
-      </w:r>
-      <w:r>
-        <w:rPr>
-          <w:rFonts w:ascii="Arial" w:hAnsi="Arial" w:cs="Arial"/>
-          <w:color w:val="333333"/>
-          <w:sz w:val="20"/>
-          <w:szCs w:val="20"/>
-          <w:shd w:val="clear" w:color="auto" w:fill="FFFFFF"/>
-        </w:rPr>
-        <w:t>不一样</w:t>
-      </w:r>
-    </w:p>
-    <w:p>
-      <w:pPr>
-        <w:rPr>
-          <w:rFonts w:ascii="Arial" w:hAnsi="Arial" w:cs="Arial"/>
-          <w:color w:val="333333"/>
-          <w:sz w:val="20"/>
-          <w:szCs w:val="20"/>
-          <w:shd w:val="clear" w:color="auto" w:fill="FFFFFF"/>
-        </w:rPr>
-      </w:pPr>
-      <w:r>
-        <w:rPr>
-          <w:rFonts w:ascii="Arial" w:hAnsi="Arial" w:cs="Arial" w:hint="eastAsia"/>
-          <w:color w:val="333333"/>
-          <w:sz w:val="20"/>
-          <w:szCs w:val="20"/>
-          <w:shd w:val="clear" w:color="auto" w:fill="FFFFFF"/>
-        </w:rPr>
-        <w:t>4</w:t>
-      </w:r>
-      <w:r>
-        <w:rPr>
-          <w:rFonts w:ascii="Arial" w:hAnsi="Arial" w:cs="Arial"/>
-          <w:color w:val="333333"/>
-          <w:sz w:val="20"/>
-          <w:szCs w:val="20"/>
-          <w:shd w:val="clear" w:color="auto" w:fill="FFFFFF"/>
-        </w:rPr>
-        <w:t>:4</w:t>
-      </w:r>
-      <w:r>
-        <w:rPr>
-          <w:rFonts w:ascii="Arial" w:hAnsi="Arial" w:cs="Arial" w:hint="eastAsia"/>
-          <w:color w:val="333333"/>
-          <w:sz w:val="20"/>
-          <w:szCs w:val="20"/>
-          <w:shd w:val="clear" w:color="auto" w:fill="FFFFFF"/>
-        </w:rPr>
-        <w:t>有问题</w:t>
-      </w:r>
-      <w:r>
-        <w:rPr>
-          <w:rFonts w:ascii="Arial" w:hAnsi="Arial" w:cs="Arial" w:hint="eastAsia"/>
-          <w:color w:val="333333"/>
-          <w:sz w:val="20"/>
-          <w:szCs w:val="20"/>
-          <w:shd w:val="clear" w:color="auto" w:fill="FFFFFF"/>
-        </w:rPr>
-        <w:t>,</w:t>
-      </w:r>
-      <w:r>
-        <w:rPr>
-          <w:rFonts w:ascii="Arial" w:hAnsi="Arial" w:cs="Arial"/>
-          <w:color w:val="333333"/>
-          <w:sz w:val="20"/>
-          <w:szCs w:val="20"/>
-          <w:shd w:val="clear" w:color="auto" w:fill="FFFFFF"/>
-        </w:rPr>
-        <w:t xml:space="preserve"> 3:3</w:t>
-      </w:r>
-      <w:r>
-        <w:rPr>
-          <w:rFonts w:ascii="Arial" w:hAnsi="Arial" w:cs="Arial" w:hint="eastAsia"/>
-          <w:color w:val="333333"/>
-          <w:sz w:val="20"/>
-          <w:szCs w:val="20"/>
-          <w:shd w:val="clear" w:color="auto" w:fill="FFFFFF"/>
-        </w:rPr>
-        <w:t>没问题</w:t>
-      </w:r>
-    </w:p>
-    <w:p>
-      <w:pPr>
-        <w:rPr>
-          <w:rFonts w:ascii="Arial" w:hAnsi="Arial" w:cs="Arial"/>
-          <w:color w:val="333333"/>
-          <w:sz w:val="20"/>
-          <w:szCs w:val="20"/>
-          <w:shd w:val="clear" w:color="auto" w:fill="FFFFFF"/>
-        </w:rPr>
-      </w:pPr>
-      <w:r>
-        <w:rPr>
-          <w:rFonts w:ascii="Arial" w:hAnsi="Arial" w:cs="Arial" w:hint="eastAsia"/>
-          <w:color w:val="333333"/>
-          <w:sz w:val="20"/>
-          <w:szCs w:val="20"/>
-          <w:highlight w:val="yellow"/>
-          <w:shd w:val="clear" w:color="auto" w:fill="FFFFFF"/>
-        </w:rPr>
-        <w:t>解决方法</w:t>
-      </w:r>
-      <w:r>
-        <w:rPr>
-          <w:rFonts w:ascii="Arial" w:hAnsi="Arial" w:cs="Arial" w:hint="eastAsia"/>
-          <w:color w:val="333333"/>
-          <w:sz w:val="20"/>
-          <w:szCs w:val="20"/>
-          <w:shd w:val="clear" w:color="auto" w:fill="FFFFFF"/>
-        </w:rPr>
-        <w:t xml:space="preserve">: </w:t>
-      </w:r>
-      <w:r>
-        <w:rPr>
-          <w:rFonts w:ascii="Arial" w:hAnsi="Arial" w:cs="Arial" w:hint="eastAsia"/>
-          <w:color w:val="333333"/>
-          <w:sz w:val="20"/>
-          <w:szCs w:val="20"/>
-          <w:shd w:val="clear" w:color="auto" w:fill="FFFFFF"/>
-        </w:rPr>
-        <w:t>调用它的</w:t>
-      </w:r>
-      <w:proofErr w:type="spellStart"/>
-      <w:r>
-        <w:rPr>
-          <w:rFonts w:ascii="Arial" w:hAnsi="Arial" w:cs="Arial" w:hint="eastAsia"/>
-          <w:color w:val="333333"/>
-          <w:sz w:val="20"/>
-          <w:szCs w:val="20"/>
-          <w:shd w:val="clear" w:color="auto" w:fill="FFFFFF"/>
-        </w:rPr>
-        <w:t>oncemove</w:t>
-      </w:r>
-      <w:proofErr w:type="spellEnd"/>
-      <w:r>
-        <w:rPr>
-          <w:rFonts w:ascii="Arial" w:hAnsi="Arial" w:cs="Arial" w:hint="eastAsia"/>
-          <w:color w:val="333333"/>
-          <w:sz w:val="20"/>
-          <w:szCs w:val="20"/>
-          <w:shd w:val="clear" w:color="auto" w:fill="FFFFFF"/>
-        </w:rPr>
-        <w:t>函数</w:t>
-      </w:r>
-    </w:p>
-    <w:p>
-      <w:pPr>
-        <w:rPr>
-          <w:rFonts w:ascii="Arial" w:hAnsi="Arial" w:cs="Arial"/>
-          <w:color w:val="333333"/>
-          <w:sz w:val="20"/>
-          <w:szCs w:val="20"/>
-          <w:shd w:val="clear" w:color="auto" w:fill="FFFFFF"/>
-        </w:rPr>
-      </w:pPr>
-    </w:p>
-    <w:p>
-      <w:pPr>
-        <w:rPr>
-          <w:rFonts w:ascii="Arial" w:hAnsi="Arial" w:cs="Arial"/>
-          <w:color w:val="333333"/>
-          <w:sz w:val="20"/>
-          <w:szCs w:val="20"/>
-          <w:shd w:val="clear" w:color="auto" w:fill="FFFFFF"/>
-        </w:rPr>
-      </w:pPr>
-      <w:r>
-        <w:rPr>
-          <w:rFonts w:ascii="Arial" w:hAnsi="Arial" w:cs="Arial" w:hint="eastAsia"/>
-          <w:color w:val="333333"/>
-          <w:sz w:val="20"/>
-          <w:szCs w:val="20"/>
-          <w:shd w:val="clear" w:color="auto" w:fill="FFFFFF"/>
-        </w:rPr>
-        <w:t>问题</w:t>
-      </w:r>
-      <w:r>
-        <w:rPr>
-          <w:rFonts w:ascii="Arial" w:hAnsi="Arial" w:cs="Arial" w:hint="eastAsia"/>
-          <w:color w:val="333333"/>
-          <w:sz w:val="20"/>
-          <w:szCs w:val="20"/>
-          <w:shd w:val="clear" w:color="auto" w:fill="FFFFFF"/>
-        </w:rPr>
-        <w:t>10:</w:t>
-      </w:r>
-      <w:r>
-        <w:rPr>
-          <w:rFonts w:ascii="Arial" w:hAnsi="Arial" w:cs="Arial" w:hint="eastAsia"/>
-          <w:color w:val="333333"/>
-          <w:sz w:val="20"/>
-          <w:szCs w:val="20"/>
-          <w:shd w:val="clear" w:color="auto" w:fill="FFFFFF"/>
-        </w:rPr>
-        <w:t>死循环</w:t>
-      </w:r>
-      <w:r>
-        <w:rPr>
-          <w:rFonts w:ascii="Arial" w:hAnsi="Arial" w:cs="Arial"/>
-          <w:color w:val="333333"/>
-          <w:sz w:val="20"/>
-          <w:szCs w:val="20"/>
-          <w:shd w:val="clear" w:color="auto" w:fill="FFFFFF"/>
-        </w:rPr>
-        <w:t xml:space="preserve">in </w:t>
-      </w:r>
-      <w:proofErr w:type="spellStart"/>
-      <w:r>
-        <w:rPr>
-          <w:rFonts w:ascii="Arial" w:hAnsi="Arial" w:cs="Arial"/>
-          <w:color w:val="333333"/>
-          <w:sz w:val="20"/>
-          <w:szCs w:val="20"/>
-          <w:shd w:val="clear" w:color="auto" w:fill="FFFFFF"/>
-        </w:rPr>
-        <w:t>deepcopy</w:t>
-      </w:r>
-      <w:proofErr w:type="spellEnd"/>
-      <w:r>
-        <w:rPr>
-          <w:rFonts w:ascii="Arial" w:hAnsi="Arial" w:cs="Arial"/>
-          <w:color w:val="333333"/>
-          <w:sz w:val="20"/>
-          <w:szCs w:val="20"/>
-          <w:shd w:val="clear" w:color="auto" w:fill="FFFFFF"/>
-        </w:rPr>
-        <w:t xml:space="preserve">    y = copier(memo)</w:t>
-      </w:r>
-    </w:p>
-    <w:p>
-      <w:pPr>
-        <w:rPr>
-          <w:rFonts w:ascii="Arial" w:hAnsi="Arial" w:cs="Arial"/>
-          <w:color w:val="333333"/>
-          <w:sz w:val="20"/>
-          <w:szCs w:val="20"/>
-          <w:shd w:val="clear" w:color="auto" w:fill="FFFFFF"/>
-        </w:rPr>
-      </w:pPr>
-      <w:proofErr w:type="spellStart"/>
-      <w:r>
-        <w:rPr>
-          <w:rFonts w:ascii="Arial" w:hAnsi="Arial" w:cs="Arial"/>
-          <w:color w:val="333333"/>
-          <w:sz w:val="20"/>
-          <w:szCs w:val="20"/>
-          <w:shd w:val="clear" w:color="auto" w:fill="FFFFFF"/>
-        </w:rPr>
-        <w:t>RecursionError</w:t>
-      </w:r>
-      <w:proofErr w:type="spellEnd"/>
-      <w:r>
-        <w:rPr>
-          <w:rFonts w:ascii="Arial" w:hAnsi="Arial" w:cs="Arial"/>
-          <w:color w:val="333333"/>
-          <w:sz w:val="20"/>
-          <w:szCs w:val="20"/>
-          <w:shd w:val="clear" w:color="auto" w:fill="FFFFFF"/>
-        </w:rPr>
-        <w:t>: maximum recursion depth exceeded while calling a Python object</w:t>
-      </w:r>
-    </w:p>
-    <w:p>
-      <w:pPr>
-        <w:rPr>
-          <w:rFonts w:ascii="Arial" w:hAnsi="Arial" w:cs="Arial"/>
-          <w:color w:val="333333"/>
-          <w:sz w:val="20"/>
-          <w:szCs w:val="20"/>
-          <w:shd w:val="clear" w:color="auto" w:fill="FFFFFF"/>
-        </w:rPr>
-      </w:pPr>
-      <w:r>
-        <w:rPr>
-          <w:rFonts w:ascii="Arial" w:hAnsi="Arial" w:cs="Arial" w:hint="eastAsia"/>
-          <w:color w:val="333333"/>
-          <w:sz w:val="20"/>
-          <w:szCs w:val="20"/>
-          <w:shd w:val="clear" w:color="auto" w:fill="FFFFFF"/>
-        </w:rPr>
-        <w:t>这是因为</w:t>
-      </w:r>
-      <w:proofErr w:type="spellStart"/>
-      <w:r>
-        <w:rPr>
-          <w:rFonts w:hint="eastAsia"/>
-        </w:rPr>
-        <w:t>stackoverflow</w:t>
-      </w:r>
-      <w:proofErr w:type="spellEnd"/>
-      <w:r>
-        <w:rPr>
-          <w:rFonts w:hint="eastAsia"/>
-        </w:rPr>
-        <w:t>了</w:t>
-      </w:r>
-      <w:r>
-        <w:rPr>
-          <w:rFonts w:hint="eastAsia"/>
-        </w:rPr>
-        <w:t>,</w:t>
-      </w:r>
-      <w:r>
-        <w:t xml:space="preserve"> </w:t>
-      </w:r>
-      <w:proofErr w:type="gramStart"/>
-      <w:r>
-        <w:t>回溯太</w:t>
-      </w:r>
-      <w:proofErr w:type="gramEnd"/>
-      <w:r>
-        <w:t>多次了</w:t>
-      </w:r>
-      <w:r>
-        <w:rPr>
-          <w:rFonts w:hint="eastAsia"/>
-        </w:rPr>
-        <w:t>.</w:t>
-      </w:r>
-      <w:r>
-        <w:rPr>
-          <w:rFonts w:hint="eastAsia"/>
-        </w:rPr>
-        <w:t xml:space="preserve"> </w:t>
-      </w:r>
-      <w:r>
-        <w:rPr>
-          <w:rFonts w:hint="eastAsia"/>
-        </w:rPr>
-        <w:t>这可能是算法的问题，也可能是</w:t>
-      </w:r>
-      <w:r>
-        <w:rPr>
-          <w:rFonts w:hint="eastAsia"/>
-        </w:rPr>
-        <w:t>代码里面的退出条件没加</w:t>
-      </w:r>
-    </w:p>
-    <w:p>
-      <w:pPr>
-        <w:rPr>
-          <w:rFonts w:ascii="Arial" w:hAnsi="Arial" w:cs="Arial"/>
-          <w:color w:val="333333"/>
-          <w:sz w:val="20"/>
-          <w:szCs w:val="20"/>
-          <w:shd w:val="clear" w:color="auto" w:fill="FFFFFF"/>
-        </w:rPr>
-      </w:pPr>
-      <w:r>
-        <w:rPr>
-          <w:rFonts w:ascii="Arial" w:hAnsi="Arial" w:cs="Arial" w:hint="eastAsia"/>
-          <w:color w:val="333333"/>
-          <w:sz w:val="20"/>
-          <w:szCs w:val="20"/>
-          <w:shd w:val="clear" w:color="auto" w:fill="FFFFFF"/>
-        </w:rPr>
-        <w:t>后来它不报错了</w:t>
-      </w:r>
-      <w:r>
-        <w:rPr>
-          <w:rFonts w:ascii="Arial" w:hAnsi="Arial" w:cs="Arial" w:hint="eastAsia"/>
-          <w:color w:val="333333"/>
-          <w:sz w:val="20"/>
-          <w:szCs w:val="20"/>
-          <w:shd w:val="clear" w:color="auto" w:fill="FFFFFF"/>
-        </w:rPr>
-        <w:t>,</w:t>
-      </w:r>
-      <w:r>
-        <w:rPr>
-          <w:rFonts w:ascii="Arial" w:hAnsi="Arial" w:cs="Arial"/>
-          <w:color w:val="333333"/>
-          <w:sz w:val="20"/>
-          <w:szCs w:val="20"/>
-          <w:shd w:val="clear" w:color="auto" w:fill="FFFFFF"/>
-        </w:rPr>
-        <w:t xml:space="preserve"> </w:t>
-      </w:r>
-      <w:r>
-        <w:rPr>
-          <w:rFonts w:ascii="Arial" w:hAnsi="Arial" w:cs="Arial" w:hint="eastAsia"/>
-          <w:color w:val="333333"/>
-          <w:sz w:val="20"/>
-          <w:szCs w:val="20"/>
-          <w:shd w:val="clear" w:color="auto" w:fill="FFFFFF"/>
-        </w:rPr>
-        <w:t>但是跑</w:t>
-      </w:r>
-      <w:r>
-        <w:rPr>
-          <w:rFonts w:ascii="Arial" w:hAnsi="Arial" w:cs="Arial" w:hint="eastAsia"/>
-          <w:color w:val="333333"/>
-          <w:sz w:val="20"/>
-          <w:szCs w:val="20"/>
-          <w:shd w:val="clear" w:color="auto" w:fill="FFFFFF"/>
-        </w:rPr>
-        <w:t>两三</w:t>
-      </w:r>
-      <w:r>
-        <w:rPr>
-          <w:rFonts w:ascii="Arial" w:hAnsi="Arial" w:cs="Arial" w:hint="eastAsia"/>
-          <w:color w:val="333333"/>
-          <w:sz w:val="20"/>
-          <w:szCs w:val="20"/>
-          <w:shd w:val="clear" w:color="auto" w:fill="FFFFFF"/>
-        </w:rPr>
-        <w:t>分钟都跑不出来</w:t>
-      </w:r>
-      <w:r>
-        <w:rPr>
-          <w:rFonts w:ascii="Arial" w:hAnsi="Arial" w:cs="Arial" w:hint="eastAsia"/>
-          <w:color w:val="333333"/>
-          <w:sz w:val="20"/>
-          <w:szCs w:val="20"/>
-          <w:shd w:val="clear" w:color="auto" w:fill="FFFFFF"/>
-        </w:rPr>
-        <w:t>,</w:t>
-      </w:r>
-    </w:p>
-    <w:p>
-      <w:pPr>
-        <w:rPr>
-          <w:rFonts w:ascii="Arial" w:hAnsi="Arial" w:cs="Arial"/>
-          <w:color w:val="333333"/>
-          <w:sz w:val="20"/>
-          <w:szCs w:val="20"/>
-          <w:shd w:val="clear" w:color="auto" w:fill="FFFFFF"/>
-        </w:rPr>
-      </w:pPr>
-      <w:proofErr w:type="gramStart"/>
-      <w:r>
-        <w:rPr>
-          <w:rFonts w:ascii="Arial" w:hAnsi="Arial" w:cs="Arial" w:hint="eastAsia"/>
-          <w:color w:val="333333"/>
-          <w:sz w:val="20"/>
-          <w:szCs w:val="20"/>
-          <w:shd w:val="clear" w:color="auto" w:fill="FFFFFF"/>
-        </w:rPr>
-        <w:t>一</w:t>
-      </w:r>
-      <w:proofErr w:type="gramEnd"/>
-      <w:r>
-        <w:rPr>
-          <w:rFonts w:ascii="Arial" w:hAnsi="Arial" w:cs="Arial" w:hint="eastAsia"/>
-          <w:color w:val="333333"/>
-          <w:sz w:val="20"/>
-          <w:szCs w:val="20"/>
-          <w:shd w:val="clear" w:color="auto" w:fill="FFFFFF"/>
-        </w:rPr>
-        <w:t>步步看看</w:t>
-      </w:r>
-      <w:r>
-        <w:rPr>
-          <w:rFonts w:ascii="Arial" w:hAnsi="Arial" w:cs="Arial" w:hint="eastAsia"/>
-          <w:color w:val="333333"/>
-          <w:sz w:val="20"/>
-          <w:szCs w:val="20"/>
-          <w:shd w:val="clear" w:color="auto" w:fill="FFFFFF"/>
-        </w:rPr>
-        <w:t>,</w:t>
-      </w:r>
-      <w:r>
-        <w:rPr>
-          <w:rFonts w:ascii="Arial" w:hAnsi="Arial" w:cs="Arial"/>
-          <w:color w:val="333333"/>
-          <w:sz w:val="20"/>
-          <w:szCs w:val="20"/>
-          <w:shd w:val="clear" w:color="auto" w:fill="FFFFFF"/>
-        </w:rPr>
-        <w:t xml:space="preserve"> </w:t>
-      </w:r>
-      <w:r>
-        <w:rPr>
-          <w:rFonts w:ascii="Arial" w:hAnsi="Arial" w:cs="Arial" w:hint="eastAsia"/>
-          <w:color w:val="333333"/>
-          <w:sz w:val="20"/>
-          <w:szCs w:val="20"/>
-          <w:shd w:val="clear" w:color="auto" w:fill="FFFFFF"/>
-        </w:rPr>
-        <w:t>start</w:t>
-      </w:r>
-      <w:r>
-        <w:rPr>
-          <w:rFonts w:ascii="Arial" w:hAnsi="Arial" w:cs="Arial"/>
-          <w:color w:val="333333"/>
-          <w:sz w:val="20"/>
-          <w:szCs w:val="20"/>
-          <w:shd w:val="clear" w:color="auto" w:fill="FFFFFF"/>
-        </w:rPr>
-        <w:t xml:space="preserve"> </w:t>
-      </w:r>
-      <w:r>
-        <w:rPr>
-          <w:rFonts w:ascii="Arial" w:hAnsi="Arial" w:cs="Arial" w:hint="eastAsia"/>
-          <w:color w:val="333333"/>
-          <w:sz w:val="20"/>
-          <w:szCs w:val="20"/>
-          <w:shd w:val="clear" w:color="auto" w:fill="FFFFFF"/>
-        </w:rPr>
-        <w:t>复制好像是对的</w:t>
-      </w:r>
-      <w:r>
-        <w:rPr>
-          <w:rFonts w:ascii="Arial" w:hAnsi="Arial" w:cs="Arial" w:hint="eastAsia"/>
-          <w:color w:val="333333"/>
-          <w:sz w:val="20"/>
-          <w:szCs w:val="20"/>
-          <w:shd w:val="clear" w:color="auto" w:fill="FFFFFF"/>
-        </w:rPr>
-        <w:t>.</w:t>
-      </w:r>
-      <w:r>
-        <w:rPr>
-          <w:rFonts w:ascii="Arial" w:hAnsi="Arial" w:cs="Arial"/>
-          <w:color w:val="333333"/>
-          <w:sz w:val="20"/>
-          <w:szCs w:val="20"/>
-          <w:shd w:val="clear" w:color="auto" w:fill="FFFFFF"/>
-        </w:rPr>
-        <w:t xml:space="preserve"> M</w:t>
-      </w:r>
-      <w:r>
-        <w:rPr>
-          <w:rFonts w:ascii="Arial" w:hAnsi="Arial" w:cs="Arial" w:hint="eastAsia"/>
-          <w:color w:val="333333"/>
-          <w:sz w:val="20"/>
-          <w:szCs w:val="20"/>
-          <w:shd w:val="clear" w:color="auto" w:fill="FFFFFF"/>
-        </w:rPr>
-        <w:t>ove</w:t>
-      </w:r>
-      <w:r>
-        <w:rPr>
-          <w:rFonts w:ascii="Arial" w:hAnsi="Arial" w:cs="Arial"/>
-          <w:color w:val="333333"/>
-          <w:sz w:val="20"/>
-          <w:szCs w:val="20"/>
-          <w:shd w:val="clear" w:color="auto" w:fill="FFFFFF"/>
-        </w:rPr>
-        <w:t xml:space="preserve"> </w:t>
-      </w:r>
-      <w:r>
-        <w:rPr>
-          <w:rFonts w:ascii="Arial" w:hAnsi="Arial" w:cs="Arial" w:hint="eastAsia"/>
-          <w:color w:val="333333"/>
-          <w:sz w:val="20"/>
-          <w:szCs w:val="20"/>
-          <w:shd w:val="clear" w:color="auto" w:fill="FFFFFF"/>
-        </w:rPr>
-        <w:t>list</w:t>
-      </w:r>
-      <w:r>
-        <w:rPr>
-          <w:rFonts w:ascii="Arial" w:hAnsi="Arial" w:cs="Arial" w:hint="eastAsia"/>
-          <w:color w:val="333333"/>
-          <w:sz w:val="20"/>
-          <w:szCs w:val="20"/>
-          <w:shd w:val="clear" w:color="auto" w:fill="FFFFFF"/>
-        </w:rPr>
-        <w:t>没有用到</w:t>
-      </w:r>
-      <w:r>
-        <w:rPr>
-          <w:rFonts w:ascii="Arial" w:hAnsi="Arial" w:cs="Arial" w:hint="eastAsia"/>
-          <w:color w:val="333333"/>
-          <w:sz w:val="20"/>
-          <w:szCs w:val="20"/>
-          <w:shd w:val="clear" w:color="auto" w:fill="FFFFFF"/>
-        </w:rPr>
-        <w:t>,</w:t>
-      </w:r>
-      <w:r>
-        <w:rPr>
-          <w:rFonts w:ascii="Arial" w:hAnsi="Arial" w:cs="Arial"/>
-          <w:color w:val="333333"/>
-          <w:sz w:val="20"/>
-          <w:szCs w:val="20"/>
-          <w:shd w:val="clear" w:color="auto" w:fill="FFFFFF"/>
-        </w:rPr>
-        <w:t xml:space="preserve"> </w:t>
-      </w:r>
-      <w:r>
-        <w:rPr>
-          <w:rFonts w:ascii="Arial" w:hAnsi="Arial" w:cs="Arial" w:hint="eastAsia"/>
-          <w:color w:val="333333"/>
-          <w:sz w:val="20"/>
-          <w:szCs w:val="20"/>
-          <w:shd w:val="clear" w:color="auto" w:fill="FFFFFF"/>
-        </w:rPr>
-        <w:t>once</w:t>
-      </w:r>
-      <w:r>
-        <w:rPr>
-          <w:rFonts w:ascii="Arial" w:hAnsi="Arial" w:cs="Arial"/>
-          <w:color w:val="333333"/>
-          <w:sz w:val="20"/>
-          <w:szCs w:val="20"/>
-          <w:shd w:val="clear" w:color="auto" w:fill="FFFFFF"/>
-        </w:rPr>
-        <w:t xml:space="preserve"> </w:t>
-      </w:r>
-      <w:r>
-        <w:rPr>
-          <w:rFonts w:ascii="Arial" w:hAnsi="Arial" w:cs="Arial" w:hint="eastAsia"/>
-          <w:color w:val="333333"/>
-          <w:sz w:val="20"/>
-          <w:szCs w:val="20"/>
-          <w:shd w:val="clear" w:color="auto" w:fill="FFFFFF"/>
-        </w:rPr>
-        <w:t>move</w:t>
-      </w:r>
-      <w:r>
-        <w:rPr>
-          <w:rFonts w:ascii="Arial" w:hAnsi="Arial" w:cs="Arial" w:hint="eastAsia"/>
-          <w:color w:val="333333"/>
-          <w:sz w:val="20"/>
-          <w:szCs w:val="20"/>
-          <w:shd w:val="clear" w:color="auto" w:fill="FFFFFF"/>
-        </w:rPr>
-        <w:t>也没有问题</w:t>
-      </w:r>
-    </w:p>
-    <w:p>
-      <w:pPr>
-        <w:widowControl/>
-        <w:shd w:val="clear" w:color="auto" w:fill="2B2B2B"/>
-        <w:tabs>
-          <w:tab w:val="left" w:pos="916"/>
-          <w:tab w:val="left" w:pos="1832"/>
-          <w:tab w:val="left" w:pos="2748"/>
-          <w:tab w:val="left" w:pos="3664"/>
-          <w:tab w:val="left" w:pos="4580"/>
-          <w:tab w:val="left" w:pos="5496"/>
-          <w:tab w:val="left" w:pos="6412"/>
-          <w:tab w:val="left" w:pos="7328"/>
-          <w:tab w:val="left" w:pos="8244"/>
-          <w:tab w:val="left" w:pos="9160"/>
-          <w:tab w:val="left" w:pos="10076"/>
-          <w:tab w:val="left" w:pos="10992"/>
-          <w:tab w:val="left" w:pos="11908"/>
-          <w:tab w:val="left" w:pos="12824"/>
-          <w:tab w:val="left" w:pos="13740"/>
-          <w:tab w:val="left" w:pos="14656"/>
-        </w:tabs>
-        <w:jc w:val="left"/>
+      </w:pPr>
+    </w:p>
+    <w:p>
+      <w:pPr>
         <w:rPr>
           <w:rFonts w:ascii="Courier New" w:hAnsi="Courier New" w:cs="Courier New"/>
           <w:color w:val="A9B7C6"/>
@@ -6593,98 +5998,13 @@
       </w:pPr>
       <w:r>
         <w:rPr>
-          <w:rFonts w:ascii="Courier New" w:hAnsi="Courier New" w:cs="Courier New"/>
-          <w:color w:val="CC7832"/>
-          <w:kern w:val="0"/>
-          <w:sz w:val="20"/>
-          <w:szCs w:val="20"/>
-        </w:rPr>
-        <w:t xml:space="preserve">if </w:t>
-      </w:r>
-      <w:r>
-        <w:rPr>
-          <w:rFonts w:ascii="Courier New" w:hAnsi="Courier New" w:cs="Courier New"/>
-          <w:color w:val="A9B7C6"/>
-          <w:kern w:val="0"/>
-          <w:sz w:val="20"/>
-          <w:szCs w:val="20"/>
-        </w:rPr>
-        <w:t xml:space="preserve">col &lt; </w:t>
-      </w:r>
-      <w:proofErr w:type="spellStart"/>
-      <w:r>
-        <w:rPr>
-          <w:rFonts w:ascii="Courier New" w:hAnsi="Courier New" w:cs="Courier New"/>
-          <w:color w:val="A9B7C6"/>
-          <w:kern w:val="0"/>
-          <w:sz w:val="20"/>
-          <w:szCs w:val="20"/>
-        </w:rPr>
-        <w:t>curr_</w:t>
-      </w:r>
-      <w:proofErr w:type="gramStart"/>
-      <w:r>
-        <w:rPr>
-          <w:rFonts w:ascii="Courier New" w:hAnsi="Courier New" w:cs="Courier New"/>
-          <w:color w:val="A9B7C6"/>
-          <w:kern w:val="0"/>
-          <w:sz w:val="20"/>
-          <w:szCs w:val="20"/>
-        </w:rPr>
-        <w:t>state.square</w:t>
-      </w:r>
-      <w:proofErr w:type="gramEnd"/>
-      <w:r>
-        <w:rPr>
-          <w:rFonts w:ascii="Courier New" w:hAnsi="Courier New" w:cs="Courier New"/>
-          <w:color w:val="A9B7C6"/>
-          <w:kern w:val="0"/>
-          <w:sz w:val="20"/>
-          <w:szCs w:val="20"/>
-        </w:rPr>
-        <w:t>_size</w:t>
-      </w:r>
-      <w:proofErr w:type="spellEnd"/>
-      <w:r>
-        <w:rPr>
-          <w:rFonts w:ascii="Courier New" w:hAnsi="Courier New" w:cs="Courier New"/>
-          <w:color w:val="A9B7C6"/>
-          <w:kern w:val="0"/>
-          <w:sz w:val="20"/>
-          <w:szCs w:val="20"/>
-        </w:rPr>
-        <w:t xml:space="preserve"> :</w:t>
-      </w:r>
-    </w:p>
-    <w:p>
-      <w:pPr>
-        <w:rPr>
-          <w:rFonts w:ascii="Arial" w:hAnsi="Arial" w:cs="Arial"/>
-          <w:color w:val="333333"/>
-          <w:sz w:val="20"/>
-          <w:szCs w:val="20"/>
-          <w:shd w:val="clear" w:color="auto" w:fill="FFFFFF"/>
-        </w:rPr>
-      </w:pPr>
-      <w:r>
-        <w:rPr>
           <w:rFonts w:ascii="Arial" w:hAnsi="Arial" w:cs="Arial" w:hint="eastAsia"/>
           <w:color w:val="333333"/>
           <w:sz w:val="20"/>
           <w:szCs w:val="20"/>
           <w:shd w:val="clear" w:color="auto" w:fill="FFFFFF"/>
         </w:rPr>
-        <w:t>这里好像有问题</w:t>
-      </w:r>
-      <w:r>
-        <w:rPr>
-          <w:rFonts w:ascii="Arial" w:hAnsi="Arial" w:cs="Arial"/>
-          <w:color w:val="333333"/>
-          <w:sz w:val="20"/>
-          <w:szCs w:val="20"/>
-          <w:shd w:val="clear" w:color="auto" w:fill="FFFFFF"/>
-        </w:rPr>
-        <w:t xml:space="preserve">, </w:t>
+        <w:t>问题</w:t>
       </w:r>
       <w:r>
         <w:rPr>
@@ -6694,296 +6014,7 @@
           <w:szCs w:val="20"/>
           <w:shd w:val="clear" w:color="auto" w:fill="FFFFFF"/>
         </w:rPr>
-        <w:t>其实是不行的</w:t>
-      </w:r>
-      <w:r>
-        <w:rPr>
-          <w:rFonts w:ascii="Arial" w:hAnsi="Arial" w:cs="Arial" w:hint="eastAsia"/>
-          <w:color w:val="333333"/>
-          <w:sz w:val="20"/>
-          <w:szCs w:val="20"/>
-          <w:shd w:val="clear" w:color="auto" w:fill="FFFFFF"/>
-        </w:rPr>
-        <w:t>,</w:t>
-      </w:r>
-      <w:r>
-        <w:rPr>
-          <w:rFonts w:ascii="Arial" w:hAnsi="Arial" w:cs="Arial"/>
-          <w:color w:val="333333"/>
-          <w:sz w:val="20"/>
-          <w:szCs w:val="20"/>
-          <w:shd w:val="clear" w:color="auto" w:fill="FFFFFF"/>
-        </w:rPr>
-        <w:t xml:space="preserve"> </w:t>
-      </w:r>
-      <w:r>
-        <w:rPr>
-          <w:rFonts w:ascii="Arial" w:hAnsi="Arial" w:cs="Arial" w:hint="eastAsia"/>
-          <w:color w:val="333333"/>
-          <w:sz w:val="20"/>
-          <w:szCs w:val="20"/>
-          <w:shd w:val="clear" w:color="auto" w:fill="FFFFFF"/>
-        </w:rPr>
-        <w:t>这里会做很多不必要的操作</w:t>
-      </w:r>
-      <w:r>
-        <w:rPr>
-          <w:rFonts w:ascii="Arial" w:hAnsi="Arial" w:cs="Arial" w:hint="eastAsia"/>
-          <w:color w:val="333333"/>
-          <w:sz w:val="20"/>
-          <w:szCs w:val="20"/>
-          <w:shd w:val="clear" w:color="auto" w:fill="FFFFFF"/>
-        </w:rPr>
-        <w:t>,</w:t>
-      </w:r>
-      <w:r>
-        <w:rPr>
-          <w:rFonts w:ascii="Arial" w:hAnsi="Arial" w:cs="Arial"/>
-          <w:color w:val="333333"/>
-          <w:sz w:val="20"/>
-          <w:szCs w:val="20"/>
-          <w:shd w:val="clear" w:color="auto" w:fill="FFFFFF"/>
-        </w:rPr>
-        <w:t xml:space="preserve"> </w:t>
-      </w:r>
-      <w:r>
-        <w:rPr>
-          <w:rFonts w:ascii="Arial" w:hAnsi="Arial" w:cs="Arial" w:hint="eastAsia"/>
-          <w:color w:val="333333"/>
-          <w:sz w:val="20"/>
-          <w:szCs w:val="20"/>
-          <w:shd w:val="clear" w:color="auto" w:fill="FFFFFF"/>
-        </w:rPr>
-        <w:t>进去判断了</w:t>
-      </w:r>
-      <w:r>
-        <w:rPr>
-          <w:rFonts w:ascii="Arial" w:hAnsi="Arial" w:cs="Arial" w:hint="eastAsia"/>
-          <w:color w:val="333333"/>
-          <w:sz w:val="20"/>
-          <w:szCs w:val="20"/>
-          <w:shd w:val="clear" w:color="auto" w:fill="FFFFFF"/>
-        </w:rPr>
-        <w:t>move</w:t>
-      </w:r>
-      <w:r>
-        <w:rPr>
-          <w:rFonts w:ascii="Arial" w:hAnsi="Arial" w:cs="Arial" w:hint="eastAsia"/>
-          <w:color w:val="333333"/>
-          <w:sz w:val="20"/>
-          <w:szCs w:val="20"/>
-          <w:shd w:val="clear" w:color="auto" w:fill="FFFFFF"/>
-        </w:rPr>
-        <w:t>产生了</w:t>
-      </w:r>
-      <w:r>
-        <w:rPr>
-          <w:rFonts w:ascii="Arial" w:hAnsi="Arial" w:cs="Arial" w:hint="eastAsia"/>
-          <w:color w:val="333333"/>
-          <w:sz w:val="20"/>
-          <w:szCs w:val="20"/>
-          <w:shd w:val="clear" w:color="auto" w:fill="FFFFFF"/>
-        </w:rPr>
-        <w:t>state</w:t>
-      </w:r>
-      <w:r>
-        <w:rPr>
-          <w:rFonts w:ascii="Arial" w:hAnsi="Arial" w:cs="Arial" w:hint="eastAsia"/>
-          <w:color w:val="333333"/>
-          <w:sz w:val="20"/>
-          <w:szCs w:val="20"/>
-          <w:shd w:val="clear" w:color="auto" w:fill="FFFFFF"/>
-        </w:rPr>
-        <w:t>之后发现是不行的</w:t>
-      </w:r>
-      <w:r>
-        <w:rPr>
-          <w:rFonts w:ascii="Arial" w:hAnsi="Arial" w:cs="Arial" w:hint="eastAsia"/>
-          <w:color w:val="333333"/>
-          <w:sz w:val="20"/>
-          <w:szCs w:val="20"/>
-          <w:shd w:val="clear" w:color="auto" w:fill="FFFFFF"/>
-        </w:rPr>
-        <w:t>,</w:t>
-      </w:r>
-      <w:r>
-        <w:rPr>
-          <w:rFonts w:ascii="Arial" w:hAnsi="Arial" w:cs="Arial"/>
-          <w:color w:val="333333"/>
-          <w:sz w:val="20"/>
-          <w:szCs w:val="20"/>
-          <w:shd w:val="clear" w:color="auto" w:fill="FFFFFF"/>
-        </w:rPr>
-        <w:t xml:space="preserve"> </w:t>
-      </w:r>
-    </w:p>
-    <w:p>
-      <w:pPr>
-        <w:rPr>
-          <w:rFonts w:ascii="Arial" w:hAnsi="Arial" w:cs="Arial"/>
-          <w:color w:val="333333"/>
-          <w:sz w:val="20"/>
-          <w:szCs w:val="20"/>
-          <w:shd w:val="clear" w:color="auto" w:fill="FFFFFF"/>
-        </w:rPr>
-      </w:pPr>
-      <w:r>
-        <w:rPr>
-          <w:rFonts w:ascii="Arial" w:hAnsi="Arial" w:cs="Arial" w:hint="eastAsia"/>
-          <w:color w:val="333333"/>
-          <w:sz w:val="20"/>
-          <w:szCs w:val="20"/>
-          <w:shd w:val="clear" w:color="auto" w:fill="FFFFFF"/>
-        </w:rPr>
-        <w:t>其他三个方向好像是对的</w:t>
-      </w:r>
-      <w:r>
-        <w:rPr>
-          <w:rFonts w:ascii="Arial" w:hAnsi="Arial" w:cs="Arial" w:hint="eastAsia"/>
-          <w:color w:val="333333"/>
-          <w:sz w:val="20"/>
-          <w:szCs w:val="20"/>
-          <w:shd w:val="clear" w:color="auto" w:fill="FFFFFF"/>
-        </w:rPr>
-        <w:t>.</w:t>
-      </w:r>
-    </w:p>
-    <w:p>
-      <w:pPr>
-        <w:widowControl/>
-        <w:shd w:val="clear" w:color="auto" w:fill="2B2B2B"/>
-        <w:tabs>
-          <w:tab w:val="left" w:pos="916"/>
-          <w:tab w:val="left" w:pos="1832"/>
-          <w:tab w:val="left" w:pos="2748"/>
-          <w:tab w:val="left" w:pos="3664"/>
-          <w:tab w:val="left" w:pos="4580"/>
-          <w:tab w:val="left" w:pos="5496"/>
-          <w:tab w:val="left" w:pos="6412"/>
-          <w:tab w:val="left" w:pos="7328"/>
-          <w:tab w:val="left" w:pos="8244"/>
-          <w:tab w:val="left" w:pos="9160"/>
-          <w:tab w:val="left" w:pos="10076"/>
-          <w:tab w:val="left" w:pos="10992"/>
-          <w:tab w:val="left" w:pos="11908"/>
-          <w:tab w:val="left" w:pos="12824"/>
-          <w:tab w:val="left" w:pos="13740"/>
-          <w:tab w:val="left" w:pos="14656"/>
-        </w:tabs>
-        <w:jc w:val="left"/>
-        <w:rPr>
-          <w:rFonts w:ascii="Courier New" w:hAnsi="Courier New" w:cs="Courier New"/>
-          <w:color w:val="A9B7C6"/>
-          <w:kern w:val="0"/>
-          <w:sz w:val="20"/>
-          <w:szCs w:val="20"/>
-        </w:rPr>
-      </w:pPr>
-      <w:r>
-        <w:rPr>
-          <w:rFonts w:ascii="Courier New" w:hAnsi="Courier New" w:cs="Courier New"/>
-          <w:color w:val="CC7832"/>
-          <w:kern w:val="0"/>
-          <w:sz w:val="20"/>
-          <w:szCs w:val="20"/>
-        </w:rPr>
-        <w:t xml:space="preserve">for </w:t>
-      </w:r>
-      <w:proofErr w:type="spellStart"/>
-      <w:r>
-        <w:rPr>
-          <w:rFonts w:ascii="Courier New" w:hAnsi="Courier New" w:cs="Courier New"/>
-          <w:color w:val="A9B7C6"/>
-          <w:kern w:val="0"/>
-          <w:sz w:val="20"/>
-          <w:szCs w:val="20"/>
-        </w:rPr>
-        <w:t>i</w:t>
-      </w:r>
-      <w:proofErr w:type="spellEnd"/>
-      <w:r>
-        <w:rPr>
-          <w:rFonts w:ascii="Courier New" w:hAnsi="Courier New" w:cs="Courier New"/>
-          <w:color w:val="A9B7C6"/>
-          <w:kern w:val="0"/>
-          <w:sz w:val="20"/>
-          <w:szCs w:val="20"/>
-        </w:rPr>
-        <w:t xml:space="preserve"> </w:t>
-      </w:r>
-      <w:r>
-        <w:rPr>
-          <w:rFonts w:ascii="Courier New" w:hAnsi="Courier New" w:cs="Courier New"/>
-          <w:color w:val="CC7832"/>
-          <w:kern w:val="0"/>
-          <w:sz w:val="20"/>
-          <w:szCs w:val="20"/>
-        </w:rPr>
-        <w:t xml:space="preserve">in </w:t>
-      </w:r>
-      <w:proofErr w:type="gramStart"/>
-      <w:r>
-        <w:rPr>
-          <w:rFonts w:ascii="Courier New" w:hAnsi="Courier New" w:cs="Courier New"/>
-          <w:color w:val="8888C6"/>
-          <w:kern w:val="0"/>
-          <w:sz w:val="20"/>
-          <w:szCs w:val="20"/>
-        </w:rPr>
-        <w:t>range</w:t>
-      </w:r>
-      <w:r>
-        <w:rPr>
-          <w:rFonts w:ascii="Courier New" w:hAnsi="Courier New" w:cs="Courier New"/>
-          <w:color w:val="A9B7C6"/>
-          <w:kern w:val="0"/>
-          <w:sz w:val="20"/>
-          <w:szCs w:val="20"/>
-        </w:rPr>
-        <w:t>(</w:t>
-      </w:r>
-      <w:proofErr w:type="spellStart"/>
-      <w:proofErr w:type="gramEnd"/>
-      <w:r>
-        <w:rPr>
-          <w:rFonts w:ascii="Courier New" w:hAnsi="Courier New" w:cs="Courier New"/>
-          <w:color w:val="A9B7C6"/>
-          <w:kern w:val="0"/>
-          <w:sz w:val="20"/>
-          <w:szCs w:val="20"/>
-        </w:rPr>
-        <w:t>child_state.square_size</w:t>
-      </w:r>
-      <w:proofErr w:type="spellEnd"/>
-      <w:r>
-        <w:rPr>
-          <w:rFonts w:ascii="Courier New" w:hAnsi="Courier New" w:cs="Courier New"/>
-          <w:color w:val="A9B7C6"/>
-          <w:kern w:val="0"/>
-          <w:sz w:val="20"/>
-          <w:szCs w:val="20"/>
-        </w:rPr>
-        <w:t xml:space="preserve"> ** </w:t>
-      </w:r>
-      <w:r>
-        <w:rPr>
-          <w:rFonts w:ascii="Courier New" w:hAnsi="Courier New" w:cs="Courier New"/>
-          <w:color w:val="6897BB"/>
-          <w:kern w:val="0"/>
-          <w:sz w:val="20"/>
-          <w:szCs w:val="20"/>
-        </w:rPr>
-        <w:t>2</w:t>
-      </w:r>
-      <w:r>
-        <w:rPr>
-          <w:rFonts w:ascii="Courier New" w:hAnsi="Courier New" w:cs="Courier New"/>
-          <w:color w:val="A9B7C6"/>
-          <w:kern w:val="0"/>
-          <w:sz w:val="20"/>
-          <w:szCs w:val="20"/>
-        </w:rPr>
-        <w:t>):</w:t>
+        <w:t>10:</w:t>
       </w:r>
     </w:p>
     <w:p>
@@ -7179,7 +6210,7 @@
     <w:p>
       <w:pPr>
         <w:rPr>
-          <w:rFonts w:ascii="Arial" w:hAnsi="Arial" w:cs="Arial" w:hint="eastAsia"/>
+          <w:rFonts w:ascii="Arial" w:hAnsi="Arial" w:cs="Arial"/>
           <w:color w:val="333333"/>
           <w:sz w:val="20"/>
           <w:szCs w:val="20"/>
@@ -7305,7 +6336,7 @@
         <w:rStyle w:val="a5"/>
         <w:noProof/>
       </w:rPr>
-      <w:t>3</w:t>
+      <w:t>5</w:t>
     </w:r>
     <w:r>
       <w:fldChar w:fldCharType="end"/>
@@ -9880,7 +8911,7 @@
 </file>
 
 <file path=customXml/itemProps1.xml><?xml version="1.0" encoding="utf-8"?>
-<ds:datastoreItem xmlns:ds="http://schemas.openxmlformats.org/officeDocument/2006/customXml" ds:itemID="{2CBA3942-DBF3-482A-A2C9-D9AEBECFE21E}">
+<ds:datastoreItem xmlns:ds="http://schemas.openxmlformats.org/officeDocument/2006/customXml" ds:itemID="{B21212B7-009D-435E-AA3E-09CDC4C88159}">
   <ds:schemaRefs>
     <ds:schemaRef ds:uri="http://schemas.openxmlformats.org/officeDocument/2006/bibliography"/>
   </ds:schemaRefs>

</xml_diff>

<commit_message>
implement Euler distance for compute similarty
</commit_message>
<xml_diff>
--- a/Project_2/project_2/project2ParticleFilter_report.docx
+++ b/Project_2/project_2/project2ParticleFilter_report.docx
@@ -900,9 +900,12 @@
           <w:sz w:val="28"/>
         </w:rPr>
         <w:sectPr>
-          <w:headerReference w:type="default" r:id="rId10"/>
-          <w:footerReference w:type="even" r:id="rId11"/>
-          <w:footerReference w:type="default" r:id="rId12"/>
+          <w:headerReference w:type="even" r:id="rId10"/>
+          <w:headerReference w:type="default" r:id="rId11"/>
+          <w:footerReference w:type="even" r:id="rId12"/>
+          <w:footerReference w:type="default" r:id="rId13"/>
+          <w:headerReference w:type="first" r:id="rId14"/>
+          <w:footerReference w:type="first" r:id="rId15"/>
           <w:pgSz w:w="11906" w:h="16838"/>
           <w:pgMar w:top="1440" w:right="1800" w:bottom="1440" w:left="1800" w:header="851" w:footer="992" w:gutter="0"/>
           <w:cols w:space="720"/>
@@ -920,12 +923,12 @@
       <w:pPr>
         <w:pStyle w:val="1"/>
       </w:pPr>
-      <w:bookmarkStart w:id="0" w:name="_Toc68386609"/>
+      <w:bookmarkStart w:id="1" w:name="_Toc68386609"/>
       <w:r>
         <w:lastRenderedPageBreak/>
         <w:t>Chapter 1: Introduction</w:t>
       </w:r>
-      <w:bookmarkEnd w:id="0"/>
+      <w:bookmarkEnd w:id="1"/>
       <w:r>
         <w:t xml:space="preserve"> </w:t>
       </w:r>
@@ -995,14 +998,14 @@
       <w:pPr>
         <w:pStyle w:val="1"/>
       </w:pPr>
-      <w:bookmarkStart w:id="1" w:name="_Toc68386610"/>
+      <w:bookmarkStart w:id="2" w:name="_Toc68386610"/>
       <w:r>
         <w:t xml:space="preserve">Chapter 2: </w:t>
       </w:r>
       <w:r>
         <w:t>Algorithm Specification</w:t>
       </w:r>
-      <w:bookmarkEnd w:id="1"/>
+      <w:bookmarkEnd w:id="2"/>
       <w:r>
         <w:t xml:space="preserve"> </w:t>
       </w:r>
@@ -1572,12 +1575,12 @@
       <w:pPr>
         <w:pStyle w:val="1"/>
       </w:pPr>
-      <w:bookmarkStart w:id="2" w:name="_Toc68386611"/>
+      <w:bookmarkStart w:id="3" w:name="_Toc68386611"/>
       <w:r>
         <w:lastRenderedPageBreak/>
         <w:t>Chapter 3: Testing Results</w:t>
       </w:r>
-      <w:bookmarkEnd w:id="2"/>
+      <w:bookmarkEnd w:id="3"/>
       <w:r>
         <w:t xml:space="preserve"> </w:t>
       </w:r>
@@ -2257,14 +2260,14 @@
           <w:szCs w:val="32"/>
         </w:rPr>
       </w:pPr>
-      <w:bookmarkStart w:id="3" w:name="_Toc68386612"/>
+      <w:bookmarkStart w:id="4" w:name="_Toc68386612"/>
       <w:r>
         <w:rPr>
           <w:shd w:val="clear" w:color="auto" w:fill="FFFFFF"/>
         </w:rPr>
         <w:t>Chapter 4: Analysis and Comments</w:t>
       </w:r>
-      <w:bookmarkEnd w:id="3"/>
+      <w:bookmarkEnd w:id="4"/>
       <w:r>
         <w:rPr>
           <w:shd w:val="clear" w:color="auto" w:fill="FFFFFF"/>
@@ -2333,7 +2336,7 @@
           <w:szCs w:val="24"/>
         </w:rPr>
       </w:pPr>
-      <w:bookmarkStart w:id="4" w:name="_Toc68386613"/>
+      <w:bookmarkStart w:id="5" w:name="_Toc68386613"/>
       <w:r>
         <w:rPr>
           <w:rFonts w:hint="eastAsia"/>
@@ -2346,7 +2349,7 @@
         </w:rPr>
         <w:t>:</w:t>
       </w:r>
-      <w:bookmarkEnd w:id="4"/>
+      <w:bookmarkEnd w:id="5"/>
     </w:p>
     <w:p>
       <w:pPr>
@@ -3667,8 +3670,132 @@
           <w:szCs w:val="20"/>
           <w:shd w:val="clear" w:color="auto" w:fill="FFFFFF"/>
         </w:rPr>
+        <w:t>相似度</w:t>
+      </w:r>
+    </w:p>
+    <w:p>
+      <w:pPr>
+        <w:rPr>
+          <w:rFonts w:ascii="Arial" w:hAnsi="Arial" w:cs="Arial"/>
+          <w:color w:val="333333"/>
+          <w:sz w:val="20"/>
+          <w:szCs w:val="20"/>
+          <w:shd w:val="clear" w:color="auto" w:fill="FFFFFF"/>
+        </w:rPr>
+      </w:pPr>
+      <w:r>
+        <w:rPr>
+          <w:rFonts w:ascii="Arial" w:hAnsi="Arial" w:cs="Arial"/>
+          <w:color w:val="333333"/>
+          <w:sz w:val="20"/>
+          <w:szCs w:val="20"/>
+          <w:shd w:val="clear" w:color="auto" w:fill="FFFFFF"/>
+        </w:rPr>
+        <w:t>给定两个属性向量，</w:t>
+      </w:r>
+      <w:r>
+        <w:rPr>
+          <w:rFonts w:ascii="Arial" w:hAnsi="Arial" w:cs="Arial"/>
+          <w:color w:val="333333"/>
+          <w:sz w:val="20"/>
+          <w:szCs w:val="20"/>
+          <w:shd w:val="clear" w:color="auto" w:fill="FFFFFF"/>
+        </w:rPr>
+        <w:t>A</w:t>
+      </w:r>
+      <w:r>
+        <w:rPr>
+          <w:rFonts w:ascii="Arial" w:hAnsi="Arial" w:cs="Arial"/>
+          <w:color w:val="333333"/>
+          <w:sz w:val="20"/>
+          <w:szCs w:val="20"/>
+          <w:shd w:val="clear" w:color="auto" w:fill="FFFFFF"/>
+        </w:rPr>
+        <w:t>和</w:t>
+      </w:r>
+      <w:r>
+        <w:rPr>
+          <w:rFonts w:ascii="Arial" w:hAnsi="Arial" w:cs="Arial"/>
+          <w:color w:val="333333"/>
+          <w:sz w:val="20"/>
+          <w:szCs w:val="20"/>
+          <w:shd w:val="clear" w:color="auto" w:fill="FFFFFF"/>
+        </w:rPr>
+        <w:t>B</w:t>
+      </w:r>
+      <w:r>
+        <w:rPr>
+          <w:rFonts w:ascii="Arial" w:hAnsi="Arial" w:cs="Arial"/>
+          <w:color w:val="333333"/>
+          <w:sz w:val="20"/>
+          <w:szCs w:val="20"/>
+          <w:shd w:val="clear" w:color="auto" w:fill="FFFFFF"/>
+        </w:rPr>
+        <w:t>，其余弦相似性</w:t>
+      </w:r>
+      <w:r>
+        <w:rPr>
+          <w:rFonts w:ascii="Arial" w:hAnsi="Arial" w:cs="Arial"/>
+          <w:color w:val="333333"/>
+          <w:sz w:val="20"/>
+          <w:szCs w:val="20"/>
+          <w:shd w:val="clear" w:color="auto" w:fill="FFFFFF"/>
+        </w:rPr>
+        <w:t>θ</w:t>
+      </w:r>
+      <w:proofErr w:type="gramStart"/>
+      <w:r>
+        <w:rPr>
+          <w:rFonts w:ascii="Arial" w:hAnsi="Arial" w:cs="Arial"/>
+          <w:color w:val="333333"/>
+          <w:sz w:val="20"/>
+          <w:szCs w:val="20"/>
+          <w:shd w:val="clear" w:color="auto" w:fill="FFFFFF"/>
+        </w:rPr>
+        <w:t>由点积和</w:t>
+      </w:r>
+      <w:proofErr w:type="gramEnd"/>
+      <w:r>
+        <w:rPr>
+          <w:rFonts w:ascii="Arial" w:hAnsi="Arial" w:cs="Arial"/>
+          <w:color w:val="333333"/>
+          <w:sz w:val="20"/>
+          <w:szCs w:val="20"/>
+          <w:shd w:val="clear" w:color="auto" w:fill="FFFFFF"/>
+        </w:rPr>
+        <w:t>向量长度给出，</w:t>
+      </w:r>
+      <w:r>
+        <w:rPr>
+          <w:rFonts w:ascii="Arial" w:hAnsi="Arial" w:cs="Arial"/>
+          <w:color w:val="333333"/>
+          <w:sz w:val="20"/>
+          <w:szCs w:val="20"/>
+          <w:shd w:val="clear" w:color="auto" w:fill="FFFFFF"/>
+        </w:rPr>
         <w:t xml:space="preserve"> </w:t>
       </w:r>
+    </w:p>
+    <w:p>
+      <w:pPr>
+        <w:rPr>
+          <w:rFonts w:ascii="Arial" w:hAnsi="Arial" w:cs="Arial"/>
+          <w:color w:val="333333"/>
+          <w:sz w:val="20"/>
+          <w:szCs w:val="20"/>
+          <w:shd w:val="clear" w:color="auto" w:fill="FFFFFF"/>
+        </w:rPr>
+      </w:pPr>
+      <w:r>
+        <w:rPr>
+          <w:rFonts w:ascii="Arial" w:hAnsi="Arial" w:cs="Arial"/>
+          <w:color w:val="333333"/>
+          <w:sz w:val="20"/>
+          <w:szCs w:val="20"/>
+          <w:shd w:val="clear" w:color="auto" w:fill="FFFFFF"/>
+        </w:rPr>
+        <w:t>余弦距离更多的是从方向上区分差异，而对绝对的数值不敏感，更多的用于使用用户对内容评分来区分兴趣的相似度和差异，同时修正了用户间可能存在的度量标准不统一的问题（因为余弦距离对绝对数值不敏感）。</w:t>
+      </w:r>
       <w:r>
         <w:rPr>
           <w:rFonts w:ascii="Arial" w:hAnsi="Arial" w:cs="Arial" w:hint="eastAsia"/>
@@ -3677,13 +3804,9 @@
           <w:szCs w:val="20"/>
           <w:shd w:val="clear" w:color="auto" w:fill="FFFFFF"/>
         </w:rPr>
-        <w:t>相似度</w:t>
-      </w:r>
-      <w:bookmarkStart w:id="5" w:name="_GoBack"/>
-      <w:bookmarkEnd w:id="5"/>
-    </w:p>
-    <w:p>
-      <w:pPr>
+        <w:t xml:space="preserve"> </w:t>
+      </w:r>
+      <w:r>
         <w:rPr>
           <w:rFonts w:ascii="Arial" w:hAnsi="Arial" w:cs="Arial" w:hint="eastAsia"/>
           <w:color w:val="333333"/>
@@ -3691,106 +3814,129 @@
           <w:szCs w:val="20"/>
           <w:shd w:val="clear" w:color="auto" w:fill="FFFFFF"/>
         </w:rPr>
-      </w:pPr>
-      <w:r>
-        <w:rPr>
-          <w:rFonts w:ascii="Arial" w:hAnsi="Arial" w:cs="Arial"/>
-          <w:color w:val="333333"/>
-          <w:sz w:val="21"/>
-          <w:szCs w:val="21"/>
-          <w:shd w:val="clear" w:color="auto" w:fill="FFFFFF"/>
-        </w:rPr>
-        <w:t>给定两个属性向量，</w:t>
-      </w:r>
-      <w:r>
-        <w:rPr>
-          <w:rFonts w:ascii="Arial" w:hAnsi="Arial" w:cs="Arial"/>
-          <w:i/>
-          <w:iCs/>
-          <w:color w:val="333333"/>
-          <w:sz w:val="21"/>
-          <w:szCs w:val="21"/>
-          <w:shd w:val="clear" w:color="auto" w:fill="FFFFFF"/>
-        </w:rPr>
-        <w:t>A</w:t>
-      </w:r>
-      <w:r>
-        <w:rPr>
-          <w:rFonts w:ascii="Arial" w:hAnsi="Arial" w:cs="Arial"/>
-          <w:color w:val="333333"/>
-          <w:sz w:val="21"/>
-          <w:szCs w:val="21"/>
-          <w:shd w:val="clear" w:color="auto" w:fill="FFFFFF"/>
-        </w:rPr>
-        <w:t>和</w:t>
-      </w:r>
-      <w:r>
-        <w:rPr>
-          <w:rFonts w:ascii="Arial" w:hAnsi="Arial" w:cs="Arial"/>
-          <w:i/>
-          <w:iCs/>
-          <w:color w:val="333333"/>
-          <w:sz w:val="21"/>
-          <w:szCs w:val="21"/>
-          <w:shd w:val="clear" w:color="auto" w:fill="FFFFFF"/>
-        </w:rPr>
-        <w:t>B</w:t>
-      </w:r>
-      <w:r>
-        <w:rPr>
-          <w:rFonts w:ascii="Arial" w:hAnsi="Arial" w:cs="Arial"/>
-          <w:color w:val="333333"/>
-          <w:sz w:val="21"/>
-          <w:szCs w:val="21"/>
-          <w:shd w:val="clear" w:color="auto" w:fill="FFFFFF"/>
-        </w:rPr>
-        <w:t>，其余弦相似性</w:t>
-      </w:r>
-      <w:r>
-        <w:rPr>
-          <w:rFonts w:ascii="Arial" w:hAnsi="Arial" w:cs="Arial"/>
-          <w:i/>
-          <w:iCs/>
-          <w:color w:val="333333"/>
-          <w:sz w:val="21"/>
-          <w:szCs w:val="21"/>
-          <w:shd w:val="clear" w:color="auto" w:fill="FFFFFF"/>
-        </w:rPr>
-        <w:t>θ</w:t>
-      </w:r>
-      <w:proofErr w:type="gramStart"/>
-      <w:r>
-        <w:rPr>
-          <w:rFonts w:ascii="Arial" w:hAnsi="Arial" w:cs="Arial"/>
-          <w:color w:val="333333"/>
-          <w:sz w:val="21"/>
-          <w:szCs w:val="21"/>
-          <w:shd w:val="clear" w:color="auto" w:fill="FFFFFF"/>
-        </w:rPr>
-        <w:t>由点积和</w:t>
-      </w:r>
-      <w:proofErr w:type="gramEnd"/>
-      <w:r>
-        <w:rPr>
-          <w:rFonts w:ascii="Arial" w:hAnsi="Arial" w:cs="Arial"/>
-          <w:color w:val="333333"/>
-          <w:sz w:val="21"/>
-          <w:szCs w:val="21"/>
-          <w:shd w:val="clear" w:color="auto" w:fill="FFFFFF"/>
-        </w:rPr>
-        <w:t>向量长度给出，如下所示：</w:t>
-      </w:r>
-    </w:p>
-    <w:p>
-      <w:pPr>
-        <w:rPr>
-          <w:rStyle w:val="token"/>
-          <w:rFonts w:ascii="Consolas" w:hAnsi="Consolas" w:hint="eastAsia"/>
-          <w:color w:val="999999"/>
-          <w:sz w:val="21"/>
-          <w:szCs w:val="21"/>
-        </w:rPr>
-      </w:pPr>
+        <w:t>我们这里应该不能用</w:t>
+      </w:r>
+      <w:r>
+        <w:rPr>
+          <w:rFonts w:ascii="Arial" w:hAnsi="Arial" w:cs="Arial" w:hint="eastAsia"/>
+          <w:color w:val="333333"/>
+          <w:sz w:val="20"/>
+          <w:szCs w:val="20"/>
+          <w:shd w:val="clear" w:color="auto" w:fill="FFFFFF"/>
+        </w:rPr>
+        <w:t>余弦</w:t>
+      </w:r>
+      <w:r>
+        <w:rPr>
+          <w:rFonts w:ascii="Arial" w:hAnsi="Arial" w:cs="Arial" w:hint="eastAsia"/>
+          <w:color w:val="333333"/>
+          <w:sz w:val="20"/>
+          <w:szCs w:val="20"/>
+          <w:shd w:val="clear" w:color="auto" w:fill="FFFFFF"/>
+        </w:rPr>
+        <w:t>,</w:t>
+      </w:r>
+      <w:r>
+        <w:rPr>
+          <w:rFonts w:ascii="Arial" w:hAnsi="Arial" w:cs="Arial"/>
+          <w:color w:val="333333"/>
+          <w:sz w:val="20"/>
+          <w:szCs w:val="20"/>
+          <w:shd w:val="clear" w:color="auto" w:fill="FFFFFF"/>
+        </w:rPr>
+        <w:t xml:space="preserve"> </w:t>
+      </w:r>
+      <w:r>
+        <w:rPr>
+          <w:rFonts w:ascii="Arial" w:hAnsi="Arial" w:cs="Arial" w:hint="eastAsia"/>
+          <w:color w:val="333333"/>
+          <w:sz w:val="20"/>
+          <w:szCs w:val="20"/>
+          <w:shd w:val="clear" w:color="auto" w:fill="FFFFFF"/>
+        </w:rPr>
+        <w:t>因为</w:t>
+      </w:r>
+      <w:r>
+        <w:rPr>
+          <w:rFonts w:ascii="Arial" w:hAnsi="Arial" w:cs="Arial" w:hint="eastAsia"/>
+          <w:color w:val="333333"/>
+          <w:sz w:val="20"/>
+          <w:szCs w:val="20"/>
+          <w:shd w:val="clear" w:color="auto" w:fill="FFFFFF"/>
+        </w:rPr>
+        <w:t>244,255</w:t>
+      </w:r>
+      <w:r>
+        <w:rPr>
+          <w:rFonts w:ascii="Arial" w:hAnsi="Arial" w:cs="Arial" w:hint="eastAsia"/>
+          <w:color w:val="333333"/>
+          <w:sz w:val="20"/>
+          <w:szCs w:val="20"/>
+          <w:shd w:val="clear" w:color="auto" w:fill="FFFFFF"/>
+        </w:rPr>
+        <w:t>明显和</w:t>
+      </w:r>
+      <w:r>
+        <w:rPr>
+          <w:rFonts w:ascii="Arial" w:hAnsi="Arial" w:cs="Arial" w:hint="eastAsia"/>
+          <w:color w:val="333333"/>
+          <w:sz w:val="20"/>
+          <w:szCs w:val="20"/>
+          <w:shd w:val="clear" w:color="auto" w:fill="FFFFFF"/>
+        </w:rPr>
+        <w:t>0,11</w:t>
+      </w:r>
+      <w:r>
+        <w:rPr>
+          <w:rFonts w:ascii="Arial" w:hAnsi="Arial" w:cs="Arial" w:hint="eastAsia"/>
+          <w:color w:val="333333"/>
+          <w:sz w:val="20"/>
+          <w:szCs w:val="20"/>
+          <w:shd w:val="clear" w:color="auto" w:fill="FFFFFF"/>
+        </w:rPr>
+        <w:t>相差很大</w:t>
+      </w:r>
+      <w:r>
+        <w:rPr>
+          <w:rFonts w:ascii="Arial" w:hAnsi="Arial" w:cs="Arial" w:hint="eastAsia"/>
+          <w:color w:val="333333"/>
+          <w:sz w:val="20"/>
+          <w:szCs w:val="20"/>
+          <w:shd w:val="clear" w:color="auto" w:fill="FFFFFF"/>
+        </w:rPr>
+        <w:t>.</w:t>
+      </w:r>
+      <w:r>
+        <w:rPr>
+          <w:rFonts w:ascii="Arial" w:hAnsi="Arial" w:cs="Arial"/>
+          <w:color w:val="333333"/>
+          <w:sz w:val="20"/>
+          <w:szCs w:val="20"/>
+          <w:shd w:val="clear" w:color="auto" w:fill="FFFFFF"/>
+        </w:rPr>
+        <w:t xml:space="preserve"> </w:t>
+      </w:r>
+    </w:p>
+    <w:p>
+      <w:pPr>
+        <w:rPr>
+          <w:rFonts w:ascii="Arial" w:hAnsi="Arial" w:cs="Arial" w:hint="eastAsia"/>
+          <w:color w:val="333333"/>
+          <w:sz w:val="20"/>
+          <w:szCs w:val="20"/>
+          <w:shd w:val="clear" w:color="auto" w:fill="FFFFFF"/>
+        </w:rPr>
+      </w:pPr>
+      <w:r>
+        <w:rPr>
+          <w:rFonts w:ascii="Arial" w:hAnsi="Arial" w:cs="Arial" w:hint="eastAsia"/>
+          <w:color w:val="333333"/>
+          <w:sz w:val="20"/>
+          <w:szCs w:val="20"/>
+          <w:shd w:val="clear" w:color="auto" w:fill="FFFFFF"/>
+        </w:rPr>
+        <w:t>我决定用欧式距离先试试</w:t>
+      </w:r>
     </w:p>
     <w:p>
       <w:pPr>
@@ -4254,7 +4400,7 @@
           <w:szCs w:val="20"/>
           <w:u w:val="single"/>
         </w:rPr>
-        <w:t>怎么计算每个的</w:t>
+        <w:t>怎么保证权重之和为</w:t>
       </w:r>
       <w:r>
         <w:rPr>
@@ -4265,8 +4411,19 @@
           <w:szCs w:val="20"/>
           <w:u w:val="single"/>
         </w:rPr>
-        <w:t>Manhattan</w:t>
-      </w:r>
+        <w:t>1?</w:t>
+      </w:r>
+    </w:p>
+    <w:p>
+      <w:pPr>
+        <w:rPr>
+          <w:rFonts w:ascii="Helvetica" w:hAnsi="Helvetica" w:cs="Helvetica"/>
+          <w:color w:val="333333"/>
+          <w:sz w:val="20"/>
+          <w:szCs w:val="20"/>
+          <w:shd w:val="clear" w:color="auto" w:fill="FFFFFF"/>
+        </w:rPr>
+      </w:pPr>
       <w:r>
         <w:rPr>
           <w:rFonts w:ascii="Consolas" w:hAnsi="Consolas" w:cs="Consolas" w:hint="eastAsia"/>
@@ -4276,19 +4433,8 @@
           <w:szCs w:val="20"/>
           <w:u w:val="single"/>
         </w:rPr>
-        <w:t>距离？</w:t>
-      </w:r>
-    </w:p>
-    <w:p>
-      <w:pPr>
-        <w:rPr>
-          <w:rFonts w:ascii="Helvetica" w:hAnsi="Helvetica" w:cs="Helvetica"/>
-          <w:color w:val="333333"/>
-          <w:sz w:val="20"/>
-          <w:szCs w:val="20"/>
-          <w:shd w:val="clear" w:color="auto" w:fill="FFFFFF"/>
-        </w:rPr>
-      </w:pPr>
+        <w:t>解决方法</w:t>
+      </w:r>
       <w:r>
         <w:rPr>
           <w:rFonts w:ascii="Consolas" w:hAnsi="Consolas" w:cs="Consolas" w:hint="eastAsia"/>
@@ -4298,17 +4444,6 @@
           <w:szCs w:val="20"/>
           <w:u w:val="single"/>
         </w:rPr>
-        <w:t>解决方法</w:t>
-      </w:r>
-      <w:r>
-        <w:rPr>
-          <w:rFonts w:ascii="Consolas" w:hAnsi="Consolas" w:cs="Consolas" w:hint="eastAsia"/>
-          <w:color w:val="0066CC"/>
-          <w:kern w:val="0"/>
-          <w:sz w:val="20"/>
-          <w:szCs w:val="20"/>
-          <w:u w:val="single"/>
-        </w:rPr>
         <w:t>:</w:t>
       </w:r>
       <w:r>
@@ -4324,517 +4459,33 @@
     </w:p>
     <w:p>
       <w:pPr>
-        <w:widowControl/>
-        <w:shd w:val="clear" w:color="auto" w:fill="2B2B2B"/>
-        <w:tabs>
-          <w:tab w:val="left" w:pos="916"/>
-          <w:tab w:val="left" w:pos="1832"/>
-          <w:tab w:val="left" w:pos="2748"/>
-          <w:tab w:val="left" w:pos="3664"/>
-          <w:tab w:val="left" w:pos="4580"/>
-          <w:tab w:val="left" w:pos="5496"/>
-          <w:tab w:val="left" w:pos="6412"/>
-          <w:tab w:val="left" w:pos="7328"/>
-          <w:tab w:val="left" w:pos="8244"/>
-          <w:tab w:val="left" w:pos="9160"/>
-          <w:tab w:val="left" w:pos="10076"/>
-          <w:tab w:val="left" w:pos="10992"/>
-          <w:tab w:val="left" w:pos="11908"/>
-          <w:tab w:val="left" w:pos="12824"/>
-          <w:tab w:val="left" w:pos="13740"/>
-          <w:tab w:val="left" w:pos="14656"/>
-        </w:tabs>
-        <w:jc w:val="left"/>
-        <w:rPr>
-          <w:rFonts w:ascii="Courier New" w:hAnsi="Courier New" w:cs="Courier New"/>
-          <w:color w:val="A9B7C6"/>
-          <w:kern w:val="0"/>
-          <w:sz w:val="21"/>
-          <w:szCs w:val="30"/>
-        </w:rPr>
-      </w:pPr>
-      <w:r>
-        <w:rPr>
-          <w:rFonts w:ascii="Courier New" w:hAnsi="Courier New" w:cs="Courier New"/>
-          <w:color w:val="CC7832"/>
-          <w:kern w:val="0"/>
-          <w:sz w:val="21"/>
-          <w:szCs w:val="30"/>
-        </w:rPr>
-        <w:t xml:space="preserve">for </w:t>
-      </w:r>
-      <w:proofErr w:type="spellStart"/>
-      <w:r>
-        <w:rPr>
-          <w:rFonts w:ascii="Courier New" w:hAnsi="Courier New" w:cs="Courier New"/>
-          <w:color w:val="A9B7C6"/>
-          <w:kern w:val="0"/>
-          <w:sz w:val="21"/>
-          <w:szCs w:val="30"/>
-        </w:rPr>
-        <w:t>i</w:t>
-      </w:r>
-      <w:proofErr w:type="spellEnd"/>
-      <w:r>
-        <w:rPr>
-          <w:rFonts w:ascii="Courier New" w:hAnsi="Courier New" w:cs="Courier New"/>
-          <w:color w:val="A9B7C6"/>
-          <w:kern w:val="0"/>
-          <w:sz w:val="21"/>
-          <w:szCs w:val="30"/>
-        </w:rPr>
-        <w:t xml:space="preserve"> </w:t>
-      </w:r>
-      <w:r>
-        <w:rPr>
-          <w:rFonts w:ascii="Courier New" w:hAnsi="Courier New" w:cs="Courier New"/>
-          <w:color w:val="CC7832"/>
-          <w:kern w:val="0"/>
-          <w:sz w:val="21"/>
-          <w:szCs w:val="30"/>
-        </w:rPr>
-        <w:t xml:space="preserve">in </w:t>
-      </w:r>
-      <w:r>
-        <w:rPr>
-          <w:rFonts w:ascii="Courier New" w:hAnsi="Courier New" w:cs="Courier New"/>
-          <w:color w:val="8888C6"/>
-          <w:kern w:val="0"/>
-          <w:sz w:val="21"/>
-          <w:szCs w:val="30"/>
-        </w:rPr>
-        <w:t>range</w:t>
-      </w:r>
-      <w:r>
-        <w:rPr>
-          <w:rFonts w:ascii="Courier New" w:hAnsi="Courier New" w:cs="Courier New"/>
-          <w:color w:val="A9B7C6"/>
-          <w:kern w:val="0"/>
-          <w:sz w:val="21"/>
-          <w:szCs w:val="30"/>
-        </w:rPr>
-        <w:t>(</w:t>
-      </w:r>
-      <w:r>
-        <w:rPr>
-          <w:rFonts w:ascii="Courier New" w:hAnsi="Courier New" w:cs="Courier New"/>
-          <w:color w:val="6897BB"/>
-          <w:kern w:val="0"/>
-          <w:sz w:val="21"/>
-          <w:szCs w:val="30"/>
-        </w:rPr>
-        <w:t>1</w:t>
-      </w:r>
-      <w:r>
-        <w:rPr>
-          <w:rFonts w:ascii="Courier New" w:hAnsi="Courier New" w:cs="Courier New"/>
-          <w:color w:val="CC7832"/>
-          <w:kern w:val="0"/>
-          <w:sz w:val="21"/>
-          <w:szCs w:val="30"/>
-        </w:rPr>
-        <w:t xml:space="preserve">, </w:t>
-      </w:r>
-      <w:proofErr w:type="spellStart"/>
-      <w:r>
-        <w:rPr>
-          <w:rFonts w:ascii="Courier New" w:hAnsi="Courier New" w:cs="Courier New"/>
-          <w:color w:val="A9B7C6"/>
-          <w:kern w:val="0"/>
-          <w:sz w:val="21"/>
-          <w:szCs w:val="30"/>
-        </w:rPr>
-        <w:t>child_state.square_size</w:t>
-      </w:r>
-      <w:proofErr w:type="spellEnd"/>
-      <w:r>
-        <w:rPr>
-          <w:rFonts w:ascii="Courier New" w:hAnsi="Courier New" w:cs="Courier New"/>
-          <w:color w:val="A9B7C6"/>
-          <w:kern w:val="0"/>
-          <w:sz w:val="21"/>
-          <w:szCs w:val="30"/>
-        </w:rPr>
-        <w:t xml:space="preserve"> ** </w:t>
-      </w:r>
-      <w:r>
-        <w:rPr>
-          <w:rFonts w:ascii="Courier New" w:hAnsi="Courier New" w:cs="Courier New"/>
-          <w:color w:val="6897BB"/>
-          <w:kern w:val="0"/>
-          <w:sz w:val="21"/>
-          <w:szCs w:val="30"/>
-        </w:rPr>
-        <w:t>2</w:t>
-      </w:r>
-      <w:r>
-        <w:rPr>
-          <w:rFonts w:ascii="Courier New" w:hAnsi="Courier New" w:cs="Courier New"/>
-          <w:color w:val="A9B7C6"/>
-          <w:kern w:val="0"/>
-          <w:sz w:val="21"/>
-          <w:szCs w:val="30"/>
-        </w:rPr>
-        <w:t>):</w:t>
-      </w:r>
-      <w:r>
-        <w:rPr>
-          <w:rFonts w:ascii="Courier New" w:hAnsi="Courier New" w:cs="Courier New"/>
-          <w:color w:val="A9B7C6"/>
-          <w:kern w:val="0"/>
-          <w:sz w:val="21"/>
-          <w:szCs w:val="30"/>
-        </w:rPr>
-        <w:br/>
-        <w:t xml:space="preserve">    </w:t>
-      </w:r>
-      <w:proofErr w:type="spellStart"/>
-      <w:r>
-        <w:rPr>
-          <w:rFonts w:ascii="Courier New" w:hAnsi="Courier New" w:cs="Courier New"/>
-          <w:color w:val="A9B7C6"/>
-          <w:kern w:val="0"/>
-          <w:sz w:val="21"/>
-          <w:szCs w:val="30"/>
-        </w:rPr>
-        <w:t>dst_row</w:t>
-      </w:r>
-      <w:proofErr w:type="spellEnd"/>
-      <w:r>
-        <w:rPr>
-          <w:rFonts w:ascii="Courier New" w:hAnsi="Courier New" w:cs="Courier New"/>
-          <w:color w:val="CC7832"/>
-          <w:kern w:val="0"/>
-          <w:sz w:val="21"/>
-          <w:szCs w:val="30"/>
-        </w:rPr>
-        <w:t xml:space="preserve">, </w:t>
-      </w:r>
-      <w:proofErr w:type="spellStart"/>
-      <w:r>
-        <w:rPr>
-          <w:rFonts w:ascii="Courier New" w:hAnsi="Courier New" w:cs="Courier New"/>
-          <w:color w:val="A9B7C6"/>
-          <w:kern w:val="0"/>
-          <w:sz w:val="21"/>
-          <w:szCs w:val="30"/>
-        </w:rPr>
-        <w:t>dst_col</w:t>
-      </w:r>
-      <w:proofErr w:type="spellEnd"/>
-      <w:r>
-        <w:rPr>
-          <w:rFonts w:ascii="Courier New" w:hAnsi="Courier New" w:cs="Courier New"/>
-          <w:color w:val="A9B7C6"/>
-          <w:kern w:val="0"/>
-          <w:sz w:val="21"/>
-          <w:szCs w:val="30"/>
-        </w:rPr>
-        <w:t xml:space="preserve"> = </w:t>
-      </w:r>
-      <w:proofErr w:type="spellStart"/>
-      <w:r>
-        <w:rPr>
-          <w:rFonts w:ascii="Courier New" w:hAnsi="Courier New" w:cs="Courier New"/>
-          <w:color w:val="A9B7C6"/>
-          <w:kern w:val="0"/>
-          <w:sz w:val="21"/>
-          <w:szCs w:val="30"/>
-        </w:rPr>
-        <w:t>dst_state.num_pos</w:t>
-      </w:r>
-      <w:proofErr w:type="spellEnd"/>
-      <w:r>
-        <w:rPr>
-          <w:rFonts w:ascii="Courier New" w:hAnsi="Courier New" w:cs="Courier New"/>
-          <w:color w:val="A9B7C6"/>
-          <w:kern w:val="0"/>
-          <w:sz w:val="21"/>
-          <w:szCs w:val="30"/>
-        </w:rPr>
-        <w:t>(</w:t>
-      </w:r>
-      <w:proofErr w:type="spellStart"/>
-      <w:r>
-        <w:rPr>
-          <w:rFonts w:ascii="Courier New" w:hAnsi="Courier New" w:cs="Courier New"/>
-          <w:color w:val="A9B7C6"/>
-          <w:kern w:val="0"/>
-          <w:sz w:val="21"/>
-          <w:szCs w:val="30"/>
-        </w:rPr>
-        <w:t>i</w:t>
-      </w:r>
-      <w:proofErr w:type="spellEnd"/>
-      <w:r>
-        <w:rPr>
-          <w:rFonts w:ascii="Courier New" w:hAnsi="Courier New" w:cs="Courier New"/>
-          <w:color w:val="A9B7C6"/>
-          <w:kern w:val="0"/>
-          <w:sz w:val="21"/>
-          <w:szCs w:val="30"/>
-        </w:rPr>
-        <w:t>)</w:t>
-      </w:r>
-      <w:r>
-        <w:rPr>
-          <w:rFonts w:ascii="Courier New" w:hAnsi="Courier New" w:cs="Courier New"/>
-          <w:color w:val="A9B7C6"/>
-          <w:kern w:val="0"/>
-          <w:sz w:val="21"/>
-          <w:szCs w:val="30"/>
-        </w:rPr>
-        <w:br/>
-        <w:t xml:space="preserve">    </w:t>
-      </w:r>
-      <w:proofErr w:type="spellStart"/>
-      <w:r>
-        <w:rPr>
-          <w:rFonts w:ascii="Courier New" w:hAnsi="Courier New" w:cs="Courier New"/>
-          <w:color w:val="A9B7C6"/>
-          <w:kern w:val="0"/>
-          <w:sz w:val="21"/>
-          <w:szCs w:val="30"/>
-        </w:rPr>
-        <w:t>chi_row</w:t>
-      </w:r>
-      <w:proofErr w:type="spellEnd"/>
-      <w:r>
-        <w:rPr>
-          <w:rFonts w:ascii="Courier New" w:hAnsi="Courier New" w:cs="Courier New"/>
-          <w:color w:val="CC7832"/>
-          <w:kern w:val="0"/>
-          <w:sz w:val="21"/>
-          <w:szCs w:val="30"/>
-        </w:rPr>
-        <w:t xml:space="preserve">, </w:t>
-      </w:r>
-      <w:proofErr w:type="spellStart"/>
-      <w:r>
-        <w:rPr>
-          <w:rFonts w:ascii="Courier New" w:hAnsi="Courier New" w:cs="Courier New"/>
-          <w:color w:val="A9B7C6"/>
-          <w:kern w:val="0"/>
-          <w:sz w:val="21"/>
-          <w:szCs w:val="30"/>
-        </w:rPr>
-        <w:t>chi_col</w:t>
-      </w:r>
-      <w:proofErr w:type="spellEnd"/>
-      <w:r>
-        <w:rPr>
-          <w:rFonts w:ascii="Courier New" w:hAnsi="Courier New" w:cs="Courier New"/>
-          <w:color w:val="A9B7C6"/>
-          <w:kern w:val="0"/>
-          <w:sz w:val="21"/>
-          <w:szCs w:val="30"/>
-        </w:rPr>
-        <w:t xml:space="preserve"> = </w:t>
-      </w:r>
-      <w:proofErr w:type="spellStart"/>
-      <w:r>
-        <w:rPr>
-          <w:rFonts w:ascii="Courier New" w:hAnsi="Courier New" w:cs="Courier New"/>
-          <w:color w:val="A9B7C6"/>
-          <w:kern w:val="0"/>
-          <w:sz w:val="21"/>
-          <w:szCs w:val="30"/>
-        </w:rPr>
-        <w:t>child_state.num_pos</w:t>
-      </w:r>
-      <w:proofErr w:type="spellEnd"/>
-      <w:r>
-        <w:rPr>
-          <w:rFonts w:ascii="Courier New" w:hAnsi="Courier New" w:cs="Courier New"/>
-          <w:color w:val="A9B7C6"/>
-          <w:kern w:val="0"/>
-          <w:sz w:val="21"/>
-          <w:szCs w:val="30"/>
-        </w:rPr>
-        <w:t>(</w:t>
-      </w:r>
-      <w:proofErr w:type="spellStart"/>
-      <w:r>
-        <w:rPr>
-          <w:rFonts w:ascii="Courier New" w:hAnsi="Courier New" w:cs="Courier New"/>
-          <w:color w:val="A9B7C6"/>
-          <w:kern w:val="0"/>
-          <w:sz w:val="21"/>
-          <w:szCs w:val="30"/>
-        </w:rPr>
-        <w:t>i</w:t>
-      </w:r>
-      <w:proofErr w:type="spellEnd"/>
-      <w:r>
-        <w:rPr>
-          <w:rFonts w:ascii="Courier New" w:hAnsi="Courier New" w:cs="Courier New"/>
-          <w:color w:val="A9B7C6"/>
-          <w:kern w:val="0"/>
-          <w:sz w:val="21"/>
-          <w:szCs w:val="30"/>
-        </w:rPr>
-        <w:t>)</w:t>
-      </w:r>
-      <w:r>
-        <w:rPr>
-          <w:rFonts w:ascii="Courier New" w:hAnsi="Courier New" w:cs="Courier New"/>
-          <w:color w:val="A9B7C6"/>
-          <w:kern w:val="0"/>
-          <w:sz w:val="21"/>
-          <w:szCs w:val="30"/>
-        </w:rPr>
-        <w:br/>
-        <w:t xml:space="preserve">    </w:t>
-      </w:r>
-      <w:proofErr w:type="spellStart"/>
-      <w:r>
-        <w:rPr>
-          <w:rFonts w:ascii="Courier New" w:hAnsi="Courier New" w:cs="Courier New"/>
-          <w:color w:val="A9B7C6"/>
-          <w:kern w:val="0"/>
-          <w:sz w:val="21"/>
-          <w:szCs w:val="30"/>
-        </w:rPr>
-        <w:t>manhattan</w:t>
-      </w:r>
-      <w:proofErr w:type="spellEnd"/>
-      <w:r>
-        <w:rPr>
-          <w:rFonts w:ascii="Courier New" w:hAnsi="Courier New" w:cs="Courier New"/>
-          <w:color w:val="A9B7C6"/>
-          <w:kern w:val="0"/>
-          <w:sz w:val="21"/>
-          <w:szCs w:val="30"/>
-        </w:rPr>
-        <w:t xml:space="preserve"> += </w:t>
-      </w:r>
-      <w:r>
-        <w:rPr>
-          <w:rFonts w:ascii="Courier New" w:hAnsi="Courier New" w:cs="Courier New"/>
-          <w:color w:val="8888C6"/>
-          <w:kern w:val="0"/>
-          <w:sz w:val="21"/>
-          <w:szCs w:val="30"/>
-        </w:rPr>
-        <w:t>abs</w:t>
-      </w:r>
-      <w:r>
-        <w:rPr>
-          <w:rFonts w:ascii="Courier New" w:hAnsi="Courier New" w:cs="Courier New"/>
-          <w:color w:val="A9B7C6"/>
-          <w:kern w:val="0"/>
-          <w:sz w:val="21"/>
-          <w:szCs w:val="30"/>
-        </w:rPr>
-        <w:t>(</w:t>
-      </w:r>
-      <w:proofErr w:type="spellStart"/>
-      <w:r>
-        <w:rPr>
-          <w:rFonts w:ascii="Courier New" w:hAnsi="Courier New" w:cs="Courier New"/>
-          <w:color w:val="A9B7C6"/>
-          <w:kern w:val="0"/>
-          <w:sz w:val="21"/>
-          <w:szCs w:val="30"/>
-        </w:rPr>
-        <w:t>dst_row</w:t>
-      </w:r>
-      <w:proofErr w:type="spellEnd"/>
-      <w:r>
-        <w:rPr>
-          <w:rFonts w:ascii="Courier New" w:hAnsi="Courier New" w:cs="Courier New"/>
-          <w:color w:val="A9B7C6"/>
-          <w:kern w:val="0"/>
-          <w:sz w:val="21"/>
-          <w:szCs w:val="30"/>
-        </w:rPr>
-        <w:t xml:space="preserve"> - </w:t>
-      </w:r>
-      <w:proofErr w:type="spellStart"/>
-      <w:r>
-        <w:rPr>
-          <w:rFonts w:ascii="Courier New" w:hAnsi="Courier New" w:cs="Courier New"/>
-          <w:color w:val="A9B7C6"/>
-          <w:kern w:val="0"/>
-          <w:sz w:val="21"/>
-          <w:szCs w:val="30"/>
-        </w:rPr>
-        <w:t>chi_row</w:t>
-      </w:r>
-      <w:proofErr w:type="spellEnd"/>
-      <w:r>
-        <w:rPr>
-          <w:rFonts w:ascii="Courier New" w:hAnsi="Courier New" w:cs="Courier New"/>
-          <w:color w:val="A9B7C6"/>
-          <w:kern w:val="0"/>
-          <w:sz w:val="21"/>
-          <w:szCs w:val="30"/>
-        </w:rPr>
-        <w:t xml:space="preserve">) + </w:t>
-      </w:r>
-      <w:r>
-        <w:rPr>
-          <w:rFonts w:ascii="Courier New" w:hAnsi="Courier New" w:cs="Courier New"/>
-          <w:color w:val="8888C6"/>
-          <w:kern w:val="0"/>
-          <w:sz w:val="21"/>
-          <w:szCs w:val="30"/>
-        </w:rPr>
-        <w:t>abs</w:t>
-      </w:r>
-      <w:r>
-        <w:rPr>
-          <w:rFonts w:ascii="Courier New" w:hAnsi="Courier New" w:cs="Courier New"/>
-          <w:color w:val="A9B7C6"/>
-          <w:kern w:val="0"/>
-          <w:sz w:val="21"/>
-          <w:szCs w:val="30"/>
-        </w:rPr>
-        <w:t>(</w:t>
-      </w:r>
-      <w:proofErr w:type="spellStart"/>
-      <w:r>
-        <w:rPr>
-          <w:rFonts w:ascii="Courier New" w:hAnsi="Courier New" w:cs="Courier New"/>
-          <w:color w:val="A9B7C6"/>
-          <w:kern w:val="0"/>
-          <w:sz w:val="21"/>
-          <w:szCs w:val="30"/>
-        </w:rPr>
-        <w:t>dst_col</w:t>
-      </w:r>
-      <w:proofErr w:type="spellEnd"/>
-      <w:r>
-        <w:rPr>
-          <w:rFonts w:ascii="Courier New" w:hAnsi="Courier New" w:cs="Courier New"/>
-          <w:color w:val="A9B7C6"/>
-          <w:kern w:val="0"/>
-          <w:sz w:val="21"/>
-          <w:szCs w:val="30"/>
-        </w:rPr>
-        <w:t xml:space="preserve"> - </w:t>
-      </w:r>
-      <w:proofErr w:type="spellStart"/>
-      <w:r>
-        <w:rPr>
-          <w:rFonts w:ascii="Courier New" w:hAnsi="Courier New" w:cs="Courier New"/>
-          <w:color w:val="A9B7C6"/>
-          <w:kern w:val="0"/>
-          <w:sz w:val="21"/>
-          <w:szCs w:val="30"/>
-        </w:rPr>
-        <w:t>chi_col</w:t>
-      </w:r>
-      <w:proofErr w:type="spellEnd"/>
-      <w:r>
-        <w:rPr>
-          <w:rFonts w:ascii="Courier New" w:hAnsi="Courier New" w:cs="Courier New"/>
-          <w:color w:val="A9B7C6"/>
-          <w:kern w:val="0"/>
-          <w:sz w:val="21"/>
-          <w:szCs w:val="30"/>
-        </w:rPr>
-        <w:t>)</w:t>
+        <w:rPr>
+          <w:rFonts w:ascii="Helvetica" w:hAnsi="Helvetica" w:cs="Helvetica" w:hint="eastAsia"/>
+          <w:color w:val="333333"/>
+          <w:sz w:val="20"/>
+          <w:szCs w:val="20"/>
+          <w:shd w:val="clear" w:color="auto" w:fill="FFFFFF"/>
+        </w:rPr>
+      </w:pPr>
+      <w:r>
+        <w:rPr>
+          <w:rFonts w:ascii="Helvetica" w:hAnsi="Helvetica" w:cs="Helvetica" w:hint="eastAsia"/>
+          <w:color w:val="333333"/>
+          <w:sz w:val="20"/>
+          <w:szCs w:val="20"/>
+          <w:shd w:val="clear" w:color="auto" w:fill="FFFFFF"/>
+        </w:rPr>
+        <w:t>算出相似度然后加起来归一化</w:t>
+      </w:r>
+      <w:r>
+        <w:rPr>
+          <w:rFonts w:ascii="Helvetica" w:hAnsi="Helvetica" w:cs="Helvetica" w:hint="eastAsia"/>
+          <w:color w:val="333333"/>
+          <w:sz w:val="20"/>
+          <w:szCs w:val="20"/>
+          <w:shd w:val="clear" w:color="auto" w:fill="FFFFFF"/>
+        </w:rPr>
+        <w:t>.</w:t>
       </w:r>
     </w:p>
     <w:p>
@@ -5045,27 +4696,6 @@
         </w:rPr>
         <w:t xml:space="preserve">  </w:t>
       </w:r>
-      <w:r>
-        <w:t>为啥他在</w:t>
-      </w:r>
-      <w:r>
-        <w:t>close list</w:t>
-      </w:r>
-      <w:r>
-        <w:t>要</w:t>
-      </w:r>
-      <w:r>
-        <w:t>return </w:t>
-      </w:r>
-      <w:r>
-        <w:t>？</w:t>
-      </w:r>
-      <w:r>
-        <w:t> </w:t>
-      </w:r>
-      <w:r>
-        <w:t>直接判断有了不就跳过吗？</w:t>
-      </w:r>
     </w:p>
     <w:p>
       <w:pPr>
@@ -5094,46 +4724,6 @@
         </w:rPr>
         <w:t xml:space="preserve">: </w:t>
       </w:r>
-      <w:r>
-        <w:rPr>
-          <w:rFonts w:ascii="&amp;quot" w:hAnsi="&amp;quot" w:hint="eastAsia"/>
-          <w:color w:val="444444"/>
-          <w:szCs w:val="21"/>
-        </w:rPr>
-        <w:t>是的</w:t>
-      </w:r>
-      <w:r>
-        <w:rPr>
-          <w:rFonts w:ascii="&amp;quot" w:hAnsi="&amp;quot" w:hint="eastAsia"/>
-          <w:color w:val="444444"/>
-          <w:szCs w:val="21"/>
-        </w:rPr>
-        <w:t>,</w:t>
-      </w:r>
-      <w:r>
-        <w:rPr>
-          <w:rFonts w:ascii="&amp;quot" w:hAnsi="&amp;quot" w:hint="eastAsia"/>
-          <w:color w:val="444444"/>
-          <w:szCs w:val="21"/>
-        </w:rPr>
-        <w:t>确实是直接跳过</w:t>
-      </w:r>
-      <w:r>
-        <w:rPr>
-          <w:rFonts w:ascii="&amp;quot" w:hAnsi="&amp;quot" w:hint="eastAsia"/>
-          <w:color w:val="444444"/>
-          <w:szCs w:val="21"/>
-        </w:rPr>
-        <w:t>.</w:t>
-      </w:r>
-      <w:r>
-        <w:rPr>
-          <w:rFonts w:ascii="&amp;quot" w:hAnsi="&amp;quot"/>
-          <w:color w:val="444444"/>
-          <w:szCs w:val="21"/>
-        </w:rPr>
-        <w:t xml:space="preserve"> </w:t>
-      </w:r>
     </w:p>
     <w:p>
       <w:pPr>
@@ -5150,6 +4740,18 @@
     <w:p>
       <w:pPr>
         <w:rPr>
+          <w:rFonts w:ascii="Consolas" w:hAnsi="Consolas" w:cs="Consolas" w:hint="eastAsia"/>
+          <w:color w:val="0066CC"/>
+          <w:kern w:val="0"/>
+          <w:sz w:val="20"/>
+          <w:szCs w:val="20"/>
+          <w:u w:val="single"/>
+        </w:rPr>
+      </w:pPr>
+    </w:p>
+    <w:p>
+      <w:pPr>
+        <w:rPr>
           <w:rFonts w:ascii="Consolas" w:hAnsi="Consolas" w:cs="Consolas"/>
           <w:color w:val="0066CC"/>
           <w:kern w:val="0"/>
@@ -5689,6 +5291,7 @@
           <w:szCs w:val="20"/>
           <w:shd w:val="clear" w:color="auto" w:fill="FFFFFF"/>
         </w:rPr>
+        <w:lastRenderedPageBreak/>
         <w:t>ValueError</w:t>
       </w:r>
       <w:proofErr w:type="spellEnd"/>
@@ -5722,7 +5325,6 @@
           <w:highlight w:val="yellow"/>
           <w:shd w:val="clear" w:color="auto" w:fill="FFFFFF"/>
         </w:rPr>
-        <w:lastRenderedPageBreak/>
         <w:t>原因</w:t>
       </w:r>
       <w:r>
@@ -6336,7 +5938,7 @@
         <w:rStyle w:val="a5"/>
         <w:noProof/>
       </w:rPr>
-      <w:t>5</w:t>
+      <w:t>3</w:t>
     </w:r>
     <w:r>
       <w:fldChar w:fldCharType="end"/>
@@ -6351,6 +5953,16 @@
 </w:ftr>
 </file>
 
+<file path=word/footer3.xml><?xml version="1.0" encoding="utf-8"?>
+<w:ftr xmlns:wpc="http://schemas.microsoft.com/office/word/2010/wordprocessingCanvas" xmlns:cx="http://schemas.microsoft.com/office/drawing/2014/chartex" xmlns:mc="http://schemas.openxmlformats.org/markup-compatibility/2006" xmlns:o="urn:schemas-microsoft-com:office:office" xmlns:r="http://schemas.openxmlformats.org/officeDocument/2006/relationships" xmlns:m="http://schemas.openxmlformats.org/officeDocument/2006/math" xmlns:v="urn:schemas-microsoft-com:vml" xmlns:wp14="http://schemas.microsoft.com/office/word/2010/wordprocessingDrawing" xmlns:wp="http://schemas.openxmlformats.org/drawingml/2006/wordprocessingDrawing" xmlns:w10="urn:schemas-microsoft-com:office:word" xmlns:w="http://schemas.openxmlformats.org/wordprocessingml/2006/main" xmlns:w14="http://schemas.microsoft.com/office/word/2010/wordml" xmlns:w15="http://schemas.microsoft.com/office/word/2012/wordml" xmlns:w16se="http://schemas.microsoft.com/office/word/2015/wordml/symex" xmlns:wpg="http://schemas.microsoft.com/office/word/2010/wordprocessingGroup" xmlns:wpi="http://schemas.microsoft.com/office/word/2010/wordprocessingInk" xmlns:wne="http://schemas.microsoft.com/office/word/2006/wordml" xmlns:wps="http://schemas.microsoft.com/office/word/2010/wordprocessingShape" mc:Ignorable="w14 w15 w16se wp14">
+  <w:p>
+    <w:pPr>
+      <w:pStyle w:val="a9"/>
+    </w:pPr>
+  </w:p>
+</w:ftr>
+</file>
+
 <file path=word/footnotes.xml><?xml version="1.0" encoding="utf-8"?>
 <w:footnotes xmlns:wpc="http://schemas.microsoft.com/office/word/2010/wordprocessingCanvas" xmlns:cx="http://schemas.microsoft.com/office/drawing/2014/chartex" xmlns:mc="http://schemas.openxmlformats.org/markup-compatibility/2006" xmlns:o="urn:schemas-microsoft-com:office:office" xmlns:r="http://schemas.openxmlformats.org/officeDocument/2006/relationships" xmlns:m="http://schemas.openxmlformats.org/officeDocument/2006/math" xmlns:v="urn:schemas-microsoft-com:vml" xmlns:wp14="http://schemas.microsoft.com/office/word/2010/wordprocessingDrawing" xmlns:wp="http://schemas.openxmlformats.org/drawingml/2006/wordprocessingDrawing" xmlns:w10="urn:schemas-microsoft-com:office:word" xmlns:w="http://schemas.openxmlformats.org/wordprocessingml/2006/main" xmlns:w14="http://schemas.microsoft.com/office/word/2010/wordml" xmlns:w15="http://schemas.microsoft.com/office/word/2012/wordml" xmlns:w16se="http://schemas.microsoft.com/office/word/2015/wordml/symex" xmlns:wpg="http://schemas.microsoft.com/office/word/2010/wordprocessingGroup" xmlns:wpi="http://schemas.microsoft.com/office/word/2010/wordprocessingInk" xmlns:wne="http://schemas.microsoft.com/office/word/2006/wordml" xmlns:wps="http://schemas.microsoft.com/office/word/2010/wordprocessingShape" mc:Ignorable="w14 w15 w16se wp14">
   <w:footnote w:type="separator" w:id="-1">
@@ -6376,12 +5988,46 @@
     <w:pPr>
       <w:pStyle w:val="a7"/>
     </w:pPr>
+  </w:p>
+</w:hdr>
+</file>
+
+<file path=word/header2.xml><?xml version="1.0" encoding="utf-8"?>
+<w:hdr xmlns:wpc="http://schemas.microsoft.com/office/word/2010/wordprocessingCanvas" xmlns:cx="http://schemas.microsoft.com/office/drawing/2014/chartex" xmlns:mc="http://schemas.openxmlformats.org/markup-compatibility/2006" xmlns:o="urn:schemas-microsoft-com:office:office" xmlns:r="http://schemas.openxmlformats.org/officeDocument/2006/relationships" xmlns:m="http://schemas.openxmlformats.org/officeDocument/2006/math" xmlns:v="urn:schemas-microsoft-com:vml" xmlns:wp14="http://schemas.microsoft.com/office/word/2010/wordprocessingDrawing" xmlns:wp="http://schemas.openxmlformats.org/drawingml/2006/wordprocessingDrawing" xmlns:w10="urn:schemas-microsoft-com:office:word" xmlns:w="http://schemas.openxmlformats.org/wordprocessingml/2006/main" xmlns:w14="http://schemas.microsoft.com/office/word/2010/wordml" xmlns:w15="http://schemas.microsoft.com/office/word/2012/wordml" xmlns:w16se="http://schemas.microsoft.com/office/word/2015/wordml/symex" xmlns:wpg="http://schemas.microsoft.com/office/word/2010/wordprocessingGroup" xmlns:wpi="http://schemas.microsoft.com/office/word/2010/wordprocessingInk" xmlns:wne="http://schemas.microsoft.com/office/word/2006/wordml" xmlns:wps="http://schemas.microsoft.com/office/word/2010/wordprocessingShape" mc:Ignorable="w14 w15 w16se wp14">
+  <w:p>
+    <w:pPr>
+      <w:pStyle w:val="a7"/>
+    </w:pPr>
+    <w:r>
+      <w:t>A</w:t>
+    </w:r>
     <w:r>
       <w:rPr>
         <w:rFonts w:hint="eastAsia"/>
       </w:rPr>
-      <w:t>人工智能</w:t>
+      <w:t>rtificial</w:t>
     </w:r>
+    <w:r>
+      <w:t xml:space="preserve"> </w:t>
+    </w:r>
+    <w:r>
+      <w:rPr>
+        <w:rFonts w:hint="eastAsia"/>
+      </w:rPr>
+      <w:t>Intelligence</w:t>
+    </w:r>
+    <w:bookmarkStart w:id="0" w:name="_GoBack"/>
+    <w:bookmarkEnd w:id="0"/>
+  </w:p>
+</w:hdr>
+</file>
+
+<file path=word/header3.xml><?xml version="1.0" encoding="utf-8"?>
+<w:hdr xmlns:wpc="http://schemas.microsoft.com/office/word/2010/wordprocessingCanvas" xmlns:cx="http://schemas.microsoft.com/office/drawing/2014/chartex" xmlns:mc="http://schemas.openxmlformats.org/markup-compatibility/2006" xmlns:o="urn:schemas-microsoft-com:office:office" xmlns:r="http://schemas.openxmlformats.org/officeDocument/2006/relationships" xmlns:m="http://schemas.openxmlformats.org/officeDocument/2006/math" xmlns:v="urn:schemas-microsoft-com:vml" xmlns:wp14="http://schemas.microsoft.com/office/word/2010/wordprocessingDrawing" xmlns:wp="http://schemas.openxmlformats.org/drawingml/2006/wordprocessingDrawing" xmlns:w10="urn:schemas-microsoft-com:office:word" xmlns:w="http://schemas.openxmlformats.org/wordprocessingml/2006/main" xmlns:w14="http://schemas.microsoft.com/office/word/2010/wordml" xmlns:w15="http://schemas.microsoft.com/office/word/2012/wordml" xmlns:w16se="http://schemas.microsoft.com/office/word/2015/wordml/symex" xmlns:wpg="http://schemas.microsoft.com/office/word/2010/wordprocessingGroup" xmlns:wpi="http://schemas.microsoft.com/office/word/2010/wordprocessingInk" xmlns:wne="http://schemas.microsoft.com/office/word/2006/wordml" xmlns:wps="http://schemas.microsoft.com/office/word/2010/wordprocessingShape" mc:Ignorable="w14 w15 w16se wp14">
+  <w:p>
+    <w:pPr>
+      <w:pStyle w:val="a7"/>
+    </w:pPr>
   </w:p>
 </w:hdr>
 </file>
@@ -8911,7 +8557,7 @@
 </file>
 
 <file path=customXml/itemProps1.xml><?xml version="1.0" encoding="utf-8"?>
-<ds:datastoreItem xmlns:ds="http://schemas.openxmlformats.org/officeDocument/2006/customXml" ds:itemID="{B21212B7-009D-435E-AA3E-09CDC4C88159}">
+<ds:datastoreItem xmlns:ds="http://schemas.openxmlformats.org/officeDocument/2006/customXml" ds:itemID="{2F0731CB-54F0-4C69-8408-353D4CBF83CE}">
   <ds:schemaRefs>
     <ds:schemaRef ds:uri="http://schemas.openxmlformats.org/officeDocument/2006/bibliography"/>
   </ds:schemaRefs>

</xml_diff>